<commit_message>
git commit -m "MF-37 <With deque + no hysteresis stratefy>"
</commit_message>
<xml_diff>
--- a/Strategies/Report_Strategy_1_MM_Hysteresis_v2.docx
+++ b/Strategies/Report_Strategy_1_MM_Hysteresis_v2.docx
@@ -196,7 +196,6 @@
         </w:rPr>
         <w:t xml:space="preserve">o </w:t>
       </w:r>
-      <w:proofErr w:type="spellStart"/>
       <w:r>
         <w:rPr>
           <w:rFonts w:ascii="Arial" w:hAnsi="Arial" w:cs="Arial"/>
@@ -207,7 +206,6 @@
         </w:rPr>
         <w:t>whispays</w:t>
       </w:r>
-      <w:proofErr w:type="spellEnd"/>
       <w:r>
         <w:rPr>
           <w:rFonts w:ascii="Arial" w:hAnsi="Arial" w:cs="Arial"/>
@@ -251,19 +249,23 @@
           <w:szCs w:val="18"/>
           <w:lang w:val="en-US"/>
         </w:rPr>
-        <w:t xml:space="preserve"> at reducing </w:t>
-      </w:r>
-      <w:proofErr w:type="spellStart"/>
-      <w:r>
+        <w:t xml:space="preserve"> at reducing whispays. The reasoning is the following : </w:t>
+      </w:r>
+    </w:p>
+    <w:p>
+      <w:pPr>
+        <w:pStyle w:val="Paragraphedeliste"/>
+        <w:numPr>
+          <w:ilvl w:val="0"/>
+          <w:numId w:val="2"/>
+        </w:numPr>
         <w:rPr>
           <w:rFonts w:ascii="Arial" w:hAnsi="Arial" w:cs="Arial"/>
           <w:sz w:val="18"/>
           <w:szCs w:val="18"/>
           <w:lang w:val="en-US"/>
         </w:rPr>
-        <w:t>whispays</w:t>
-      </w:r>
-      <w:proofErr w:type="spellEnd"/>
+      </w:pPr>
       <w:r>
         <w:rPr>
           <w:rFonts w:ascii="Arial" w:hAnsi="Arial" w:cs="Arial"/>
@@ -271,42 +273,7 @@
           <w:szCs w:val="18"/>
           <w:lang w:val="en-US"/>
         </w:rPr>
-        <w:t xml:space="preserve">. The reasoning is the following : </w:t>
-      </w:r>
-    </w:p>
-    <w:p>
-      <w:pPr>
-        <w:pStyle w:val="Paragraphedeliste"/>
-        <w:numPr>
-          <w:ilvl w:val="0"/>
-          <w:numId w:val="2"/>
-        </w:numPr>
-        <w:rPr>
-          <w:rFonts w:ascii="Arial" w:hAnsi="Arial" w:cs="Arial"/>
-          <w:sz w:val="18"/>
-          <w:szCs w:val="18"/>
-          <w:lang w:val="en-US"/>
-        </w:rPr>
-      </w:pPr>
-      <w:proofErr w:type="spellStart"/>
-      <w:r>
-        <w:rPr>
-          <w:rFonts w:ascii="Arial" w:hAnsi="Arial" w:cs="Arial"/>
-          <w:sz w:val="18"/>
-          <w:szCs w:val="18"/>
-          <w:lang w:val="en-US"/>
-        </w:rPr>
-        <w:t>Whispay</w:t>
-      </w:r>
-      <w:proofErr w:type="spellEnd"/>
-      <w:r>
-        <w:rPr>
-          <w:rFonts w:ascii="Arial" w:hAnsi="Arial" w:cs="Arial"/>
-          <w:sz w:val="18"/>
-          <w:szCs w:val="18"/>
-          <w:lang w:val="en-US"/>
-        </w:rPr>
-        <w:t xml:space="preserve"> are indicative of not really strong trend, easily reversible leading to fast signal</w:t>
+        <w:t>Whispay are indicative of not really strong trend, easily reversible leading to fast signal</w:t>
       </w:r>
     </w:p>
     <w:p>
@@ -1137,7 +1104,6 @@
               </w:rPr>
               <w:t>Hysteresis</w:t>
             </w:r>
-            <w:proofErr w:type="spellStart"/>
             <w:r>
               <w:rPr>
                 <w:rFonts w:ascii="Arial" w:hAnsi="Arial" w:cs="Arial"/>
@@ -1148,7 +1114,6 @@
               </w:rPr>
               <w:t>MaxBackWardUse</w:t>
             </w:r>
-            <w:proofErr w:type="spellEnd"/>
           </w:p>
         </w:tc>
         <w:tc>
@@ -1479,7 +1444,6 @@
         </w:rPr>
         <w:t xml:space="preserve">as </w:t>
       </w:r>
-      <w:proofErr w:type="spellStart"/>
       <m:oMath>
         <m:r>
           <m:rPr>
@@ -1489,18 +1453,7 @@
             <w:rFonts w:ascii="Arial" w:hAnsi="Arial" w:cs="Arial"/>
             <w:lang w:val="en-US"/>
           </w:rPr>
-          <m:t>Hyst</m:t>
-        </m:r>
-        <w:proofErr w:type="spellEnd"/>
-        <m:r>
-          <m:rPr>
-            <m:nor/>
-          </m:rPr>
-          <w:rPr>
-            <w:rFonts w:ascii="Arial" w:hAnsi="Arial" w:cs="Arial"/>
-            <w:lang w:val="en-US"/>
-          </w:rPr>
-          <m:t>(t)</m:t>
+          <m:t>Hyst(t)</m:t>
         </m:r>
         <m:r>
           <w:rPr>
@@ -1715,7 +1668,6 @@
         </w:rPr>
         <w:t>Hysteresis</w:t>
       </w:r>
-      <w:proofErr w:type="spellStart"/>
       <w:r>
         <w:rPr>
           <w:rFonts w:ascii="Arial" w:hAnsi="Arial" w:cs="Arial"/>
@@ -1728,7 +1680,6 @@
         </w:rPr>
         <w:t>MaxBackWardUse</w:t>
       </w:r>
-      <w:proofErr w:type="spellEnd"/>
       <w:r>
         <w:rPr>
           <w:rFonts w:ascii="Arial" w:hAnsi="Arial" w:cs="Arial"/>
@@ -2530,16 +2481,8 @@
         <w:rPr>
           <w:lang w:val="en-US"/>
         </w:rPr>
-        <w:t xml:space="preserve"> </w:t>
-      </w:r>
-      <w:proofErr w:type="spellStart"/>
-      <w:r>
-        <w:rPr>
-          <w:lang w:val="en-US"/>
-        </w:rPr>
-        <w:t>Misc</w:t>
-      </w:r>
-      <w:proofErr w:type="spellEnd"/>
+        <w:t xml:space="preserve"> Misc</w:t>
+      </w:r>
     </w:p>
     <w:p>
       <w:pPr>
@@ -2912,23 +2855,7 @@
           <w:rFonts w:ascii="Arial" w:hAnsi="Arial" w:cs="Arial"/>
           <w:lang w:val="en-US"/>
         </w:rPr>
-        <w:t xml:space="preserve">Leaving too early due to </w:t>
-      </w:r>
-      <w:proofErr w:type="spellStart"/>
-      <w:r>
-        <w:rPr>
-          <w:rFonts w:ascii="Arial" w:hAnsi="Arial" w:cs="Arial"/>
-          <w:lang w:val="en-US"/>
-        </w:rPr>
-        <w:t>prie</w:t>
-      </w:r>
-      <w:proofErr w:type="spellEnd"/>
-      <w:r>
-        <w:rPr>
-          <w:rFonts w:ascii="Arial" w:hAnsi="Arial" w:cs="Arial"/>
-          <w:lang w:val="en-US"/>
-        </w:rPr>
-        <w:t xml:space="preserve"> compression</w:t>
+        <w:t>Leaving too early due to prie compression</w:t>
       </w:r>
     </w:p>
     <w:p>
@@ -3523,13 +3450,7 @@
         <w:rPr>
           <w:lang w:val="en-US"/>
         </w:rPr>
-        <w:t xml:space="preserve">SMA Hysteresis </w:t>
-      </w:r>
-      <w:r>
-        <w:rPr>
-          <w:lang w:val="en-US"/>
-        </w:rPr>
-        <w:t>NO_SL TP</w:t>
+        <w:t>SMA Hysteresis NO_SL TP</w:t>
       </w:r>
     </w:p>
     <w:p>
@@ -3875,17 +3796,8 @@
           <w:rFonts w:ascii="Arial" w:hAnsi="Arial" w:cs="Arial"/>
           <w:lang w:val="en-US"/>
         </w:rPr>
-        <w:t>SMA Hysteresis _</w:t>
-      </w:r>
-      <w:proofErr w:type="spellStart"/>
-      <w:r>
-        <w:rPr>
-          <w:rFonts w:ascii="Arial" w:hAnsi="Arial" w:cs="Arial"/>
-          <w:lang w:val="en-US"/>
-        </w:rPr>
-        <w:t>NoSLTP</w:t>
-      </w:r>
-      <w:proofErr w:type="spellEnd"/>
+        <w:t>SMA Hysteresis _NoSLTP</w:t>
+      </w:r>
       <w:r>
         <w:rPr>
           <w:rFonts w:ascii="Arial" w:hAnsi="Arial" w:cs="Arial"/>
@@ -4189,17 +4101,8 @@
           <w:rFonts w:ascii="Arial" w:hAnsi="Arial" w:cs="Arial"/>
           <w:lang w:val="en-US"/>
         </w:rPr>
-        <w:t xml:space="preserve">Python </w:t>
-      </w:r>
-      <w:proofErr w:type="spellStart"/>
-      <w:r>
-        <w:rPr>
-          <w:rFonts w:ascii="Arial" w:hAnsi="Arial" w:cs="Arial"/>
-          <w:lang w:val="en-US"/>
-        </w:rPr>
-        <w:t>retunrs</w:t>
-      </w:r>
-      <w:proofErr w:type="spellEnd"/>
+        <w:t>Python retunrs</w:t>
+      </w:r>
     </w:p>
     <w:p>
       <w:pPr>
@@ -4263,24 +4166,14 @@
       <w:r>
         <w:t xml:space="preserve">Figure </w:t>
       </w:r>
-      <w:r>
-        <w:fldChar w:fldCharType="begin"/>
-      </w:r>
-      <w:r>
-        <w:instrText xml:space="preserve"> SEQ Figure \* ARABIC </w:instrText>
-      </w:r>
-      <w:r>
-        <w:fldChar w:fldCharType="separate"/>
-      </w:r>
-      <w:r>
-        <w:rPr>
-          <w:noProof/>
-        </w:rPr>
-        <w:t>10</w:t>
-      </w:r>
-      <w:r>
-        <w:fldChar w:fldCharType="end"/>
-      </w:r>
+      <w:fldSimple w:instr=" SEQ Figure \* ARABIC ">
+        <w:r>
+          <w:rPr>
+            <w:noProof/>
+          </w:rPr>
+          <w:t>10</w:t>
+        </w:r>
+      </w:fldSimple>
       <w:r>
         <w:t>SMA HYSTERESIS _NOSLTP  H4 RETURNS</w:t>
       </w:r>
@@ -4426,29 +4319,7 @@
                 <w:szCs w:val="16"/>
                 <w:lang w:val="en-US"/>
               </w:rPr>
-              <w:t>Correlation (</w:t>
-            </w:r>
-            <w:proofErr w:type="spellStart"/>
-            <w:r>
-              <w:rPr>
-                <w:rFonts w:ascii="Arial" w:eastAsia="Times New Roman" w:hAnsi="Arial" w:cs="Arial"/>
-                <w:color w:val="000000"/>
-                <w:sz w:val="16"/>
-                <w:szCs w:val="16"/>
-                <w:lang w:val="en-US"/>
-              </w:rPr>
-              <w:t>Profits,MFE</w:t>
-            </w:r>
-            <w:proofErr w:type="spellEnd"/>
-            <w:r>
-              <w:rPr>
-                <w:rFonts w:ascii="Arial" w:eastAsia="Times New Roman" w:hAnsi="Arial" w:cs="Arial"/>
-                <w:color w:val="000000"/>
-                <w:sz w:val="16"/>
-                <w:szCs w:val="16"/>
-                <w:lang w:val="en-US"/>
-              </w:rPr>
-              <w:t>):</w:t>
+              <w:t>Correlation (Profits,MFE):</w:t>
             </w:r>
           </w:p>
         </w:tc>
@@ -4511,29 +4382,7 @@
                 <w:szCs w:val="16"/>
                 <w:lang w:val="en-US"/>
               </w:rPr>
-              <w:t>Correlation (</w:t>
-            </w:r>
-            <w:proofErr w:type="spellStart"/>
-            <w:r>
-              <w:rPr>
-                <w:rFonts w:ascii="Arial" w:eastAsia="Times New Roman" w:hAnsi="Arial" w:cs="Arial"/>
-                <w:color w:val="000000"/>
-                <w:sz w:val="16"/>
-                <w:szCs w:val="16"/>
-                <w:lang w:val="en-US"/>
-              </w:rPr>
-              <w:t>Profits,MAE</w:t>
-            </w:r>
-            <w:proofErr w:type="spellEnd"/>
-            <w:r>
-              <w:rPr>
-                <w:rFonts w:ascii="Arial" w:eastAsia="Times New Roman" w:hAnsi="Arial" w:cs="Arial"/>
-                <w:color w:val="000000"/>
-                <w:sz w:val="16"/>
-                <w:szCs w:val="16"/>
-                <w:lang w:val="en-US"/>
-              </w:rPr>
-              <w:t>):</w:t>
+              <w:t>Correlation (Profits,MAE):</w:t>
             </w:r>
           </w:p>
         </w:tc>
@@ -4759,27 +4608,7 @@
         <w:rPr>
           <w:lang w:val="en-US"/>
         </w:rPr>
-        <w:t xml:space="preserve">SMA Hysteresis </w:t>
-      </w:r>
-      <w:r>
-        <w:rPr>
-          <w:lang w:val="en-US"/>
-        </w:rPr>
-        <w:t>_</w:t>
-      </w:r>
-      <w:proofErr w:type="spellStart"/>
-      <w:r>
-        <w:rPr>
-          <w:lang w:val="en-US"/>
-        </w:rPr>
-        <w:t>NoSLTP</w:t>
-      </w:r>
-      <w:proofErr w:type="spellEnd"/>
-      <w:r>
-        <w:rPr>
-          <w:lang w:val="en-US"/>
-        </w:rPr>
-        <w:t xml:space="preserve"> </w:t>
+        <w:t xml:space="preserve">SMA Hysteresis _NoSLTP </w:t>
       </w:r>
       <w:r>
         <w:rPr>
@@ -4964,27 +4793,7 @@
         <w:rPr>
           <w:lang w:val="en-US"/>
         </w:rPr>
-        <w:t>SMA Hysteresis _</w:t>
-      </w:r>
-      <w:proofErr w:type="spellStart"/>
-      <w:r>
-        <w:rPr>
-          <w:lang w:val="en-US"/>
-        </w:rPr>
-        <w:t>NoSLTP</w:t>
-      </w:r>
-      <w:proofErr w:type="spellEnd"/>
-      <w:r>
-        <w:rPr>
-          <w:lang w:val="en-US"/>
-        </w:rPr>
-        <w:t xml:space="preserve"> </w:t>
-      </w:r>
-      <w:r>
-        <w:rPr>
-          <w:lang w:val="en-US"/>
-        </w:rPr>
-        <w:t xml:space="preserve"> </w:t>
+        <w:t xml:space="preserve">SMA Hysteresis _NoSLTP  </w:t>
       </w:r>
       <w:r>
         <w:rPr>
@@ -5172,27 +4981,7 @@
         <w:rPr>
           <w:lang w:val="en-US"/>
         </w:rPr>
-        <w:t>SMA Hysteresis _</w:t>
-      </w:r>
-      <w:proofErr w:type="spellStart"/>
-      <w:r>
-        <w:rPr>
-          <w:lang w:val="en-US"/>
-        </w:rPr>
-        <w:t>NoSLTP</w:t>
-      </w:r>
-      <w:proofErr w:type="spellEnd"/>
-      <w:r>
-        <w:rPr>
-          <w:lang w:val="en-US"/>
-        </w:rPr>
-        <w:t xml:space="preserve"> </w:t>
-      </w:r>
-      <w:r>
-        <w:rPr>
-          <w:lang w:val="en-US"/>
-        </w:rPr>
-        <w:t xml:space="preserve"> </w:t>
+        <w:t xml:space="preserve">SMA Hysteresis _NoSLTP  </w:t>
       </w:r>
       <w:r>
         <w:rPr>
@@ -5412,27 +5201,7 @@
         <w:rPr>
           <w:lang w:val="en-US"/>
         </w:rPr>
-        <w:t>SMA Hysteresis _</w:t>
-      </w:r>
-      <w:proofErr w:type="spellStart"/>
-      <w:r>
-        <w:rPr>
-          <w:lang w:val="en-US"/>
-        </w:rPr>
-        <w:t>NoSLTP</w:t>
-      </w:r>
-      <w:proofErr w:type="spellEnd"/>
-      <w:r>
-        <w:rPr>
-          <w:lang w:val="en-US"/>
-        </w:rPr>
-        <w:t xml:space="preserve"> </w:t>
-      </w:r>
-      <w:r>
-        <w:rPr>
-          <w:lang w:val="en-US"/>
-        </w:rPr>
-        <w:t xml:space="preserve"> </w:t>
+        <w:t xml:space="preserve">SMA Hysteresis _NoSLTP  </w:t>
       </w:r>
       <w:r>
         <w:rPr>
@@ -5685,29 +5454,7 @@
                 <w:szCs w:val="16"/>
                 <w:lang w:val="en-US"/>
               </w:rPr>
-              <w:t>Correlation (</w:t>
-            </w:r>
-            <w:proofErr w:type="spellStart"/>
-            <w:r>
-              <w:rPr>
-                <w:rFonts w:ascii="Arial" w:eastAsia="Times New Roman" w:hAnsi="Arial" w:cs="Arial"/>
-                <w:color w:val="000000"/>
-                <w:sz w:val="16"/>
-                <w:szCs w:val="16"/>
-                <w:lang w:val="en-US"/>
-              </w:rPr>
-              <w:t>Profits,MFE</w:t>
-            </w:r>
-            <w:proofErr w:type="spellEnd"/>
-            <w:r>
-              <w:rPr>
-                <w:rFonts w:ascii="Arial" w:eastAsia="Times New Roman" w:hAnsi="Arial" w:cs="Arial"/>
-                <w:color w:val="000000"/>
-                <w:sz w:val="16"/>
-                <w:szCs w:val="16"/>
-                <w:lang w:val="en-US"/>
-              </w:rPr>
-              <w:t>):</w:t>
+              <w:t>Correlation (Profits,MFE):</w:t>
             </w:r>
           </w:p>
         </w:tc>
@@ -5771,29 +5518,7 @@
                 <w:szCs w:val="16"/>
                 <w:lang w:val="en-US"/>
               </w:rPr>
-              <w:t>Correlation (</w:t>
-            </w:r>
-            <w:proofErr w:type="spellStart"/>
-            <w:r>
-              <w:rPr>
-                <w:rFonts w:ascii="Arial" w:eastAsia="Times New Roman" w:hAnsi="Arial" w:cs="Arial"/>
-                <w:color w:val="000000"/>
-                <w:sz w:val="16"/>
-                <w:szCs w:val="16"/>
-                <w:lang w:val="en-US"/>
-              </w:rPr>
-              <w:t>Profits,MAE</w:t>
-            </w:r>
-            <w:proofErr w:type="spellEnd"/>
-            <w:r>
-              <w:rPr>
-                <w:rFonts w:ascii="Arial" w:eastAsia="Times New Roman" w:hAnsi="Arial" w:cs="Arial"/>
-                <w:color w:val="000000"/>
-                <w:sz w:val="16"/>
-                <w:szCs w:val="16"/>
-                <w:lang w:val="en-US"/>
-              </w:rPr>
-              <w:t>):</w:t>
+              <w:t>Correlation (Profits,MAE):</w:t>
             </w:r>
           </w:p>
         </w:tc>
@@ -5899,7 +5624,7 @@
     <w:p>
       <w:pPr>
         <w:keepNext/>
-        <w:ind w:left="720"/>
+        <w:ind w:left="1440"/>
       </w:pPr>
       <w:r>
         <w:rPr>
@@ -5969,24 +5694,14 @@
         <w:tab/>
         <w:t xml:space="preserve">Figure </w:t>
       </w:r>
-      <w:r>
-        <w:fldChar w:fldCharType="begin"/>
-      </w:r>
-      <w:r>
-        <w:instrText xml:space="preserve"> SEQ Figure \* ARABIC </w:instrText>
-      </w:r>
-      <w:r>
-        <w:fldChar w:fldCharType="separate"/>
-      </w:r>
-      <w:r>
-        <w:rPr>
-          <w:noProof/>
-        </w:rPr>
-        <w:t>17</w:t>
-      </w:r>
-      <w:r>
-        <w:fldChar w:fldCharType="end"/>
-      </w:r>
+      <w:fldSimple w:instr=" SEQ Figure \* ARABIC ">
+        <w:r>
+          <w:rPr>
+            <w:noProof/>
+          </w:rPr>
+          <w:t>17</w:t>
+        </w:r>
+      </w:fldSimple>
       <w:r>
         <w:t xml:space="preserve">: SMA HYSTERESIS _NOSLTP  </w:t>
       </w:r>
@@ -6098,24 +5813,14 @@
       <w:r>
         <w:t xml:space="preserve">Figure </w:t>
       </w:r>
-      <w:r>
-        <w:fldChar w:fldCharType="begin"/>
-      </w:r>
-      <w:r>
-        <w:instrText xml:space="preserve"> SEQ Figure \* ARABIC </w:instrText>
-      </w:r>
-      <w:r>
-        <w:fldChar w:fldCharType="separate"/>
-      </w:r>
-      <w:r>
-        <w:rPr>
-          <w:noProof/>
-        </w:rPr>
-        <w:t>18</w:t>
-      </w:r>
-      <w:r>
-        <w:fldChar w:fldCharType="end"/>
-      </w:r>
+      <w:fldSimple w:instr=" SEQ Figure \* ARABIC ">
+        <w:r>
+          <w:rPr>
+            <w:noProof/>
+          </w:rPr>
+          <w:t>18</w:t>
+        </w:r>
+      </w:fldSimple>
       <w:r>
         <w:rPr>
           <w:lang w:val="en-US"/>
@@ -6566,6 +6271,7 @@
           <w:i w:val="0"/>
           <w:iCs w:val="0"/>
           <w:smallCaps/>
+          <w:noProof/>
           <w:color w:val="595959" w:themeColor="text1" w:themeTint="A6"/>
           <w:sz w:val="21"/>
           <w:szCs w:val="21"/>
@@ -7299,24 +7005,14 @@
       <w:r>
         <w:t xml:space="preserve">Figure </w:t>
       </w:r>
-      <w:r>
-        <w:fldChar w:fldCharType="begin"/>
-      </w:r>
-      <w:r>
-        <w:instrText xml:space="preserve"> SEQ Figure \* ARABIC </w:instrText>
-      </w:r>
-      <w:r>
-        <w:fldChar w:fldCharType="separate"/>
-      </w:r>
-      <w:r>
-        <w:rPr>
-          <w:noProof/>
-        </w:rPr>
-        <w:t>23</w:t>
-      </w:r>
-      <w:r>
-        <w:fldChar w:fldCharType="end"/>
-      </w:r>
+      <w:fldSimple w:instr=" SEQ Figure \* ARABIC ">
+        <w:r>
+          <w:rPr>
+            <w:noProof/>
+          </w:rPr>
+          <w:t>23</w:t>
+        </w:r>
+      </w:fldSimple>
       <w:r>
         <w:rPr>
           <w:lang w:val="en-US"/>
@@ -7388,23 +7084,7 @@
           <w:rFonts w:ascii="Arial" w:hAnsi="Arial" w:cs="Arial"/>
           <w:lang w:val="en-US"/>
         </w:rPr>
-        <w:t xml:space="preserve"> </w:t>
-      </w:r>
-      <w:proofErr w:type="spellStart"/>
-      <w:r>
-        <w:rPr>
-          <w:rFonts w:ascii="Arial" w:hAnsi="Arial" w:cs="Arial"/>
-          <w:lang w:val="en-US"/>
-        </w:rPr>
-        <w:t>trendes</w:t>
-      </w:r>
-      <w:proofErr w:type="spellEnd"/>
-      <w:r>
-        <w:rPr>
-          <w:rFonts w:ascii="Arial" w:hAnsi="Arial" w:cs="Arial"/>
-          <w:lang w:val="en-US"/>
-        </w:rPr>
-        <w:t xml:space="preserve"> and can stay up on it</w:t>
+        <w:t xml:space="preserve"> trendes and can stay up on it</w:t>
       </w:r>
     </w:p>
     <w:p>
@@ -7431,23 +7111,7 @@
           <w:rFonts w:ascii="Arial" w:hAnsi="Arial" w:cs="Arial"/>
           <w:lang w:val="en-US"/>
         </w:rPr>
-        <w:t xml:space="preserve"> enough big </w:t>
-      </w:r>
-      <w:proofErr w:type="spellStart"/>
-      <w:r>
-        <w:rPr>
-          <w:rFonts w:ascii="Arial" w:hAnsi="Arial" w:cs="Arial"/>
-          <w:lang w:val="en-US"/>
-        </w:rPr>
-        <w:t>trendes</w:t>
-      </w:r>
-      <w:proofErr w:type="spellEnd"/>
-      <w:r>
-        <w:rPr>
-          <w:rFonts w:ascii="Arial" w:hAnsi="Arial" w:cs="Arial"/>
-          <w:lang w:val="en-US"/>
-        </w:rPr>
-        <w:t xml:space="preserve"> in H1, too many range periods</w:t>
+        <w:t xml:space="preserve"> enough big trendes in H1, too many range periods</w:t>
       </w:r>
     </w:p>
     <w:p>
@@ -7680,21 +7344,6 @@
     </w:p>
     <w:p>
       <w:pPr>
-        <w:rPr>
-          <w:rFonts w:ascii="Arial" w:hAnsi="Arial" w:cs="Arial"/>
-          <w:lang w:val="en-US"/>
-        </w:rPr>
-      </w:pPr>
-      <w:r>
-        <w:rPr>
-          <w:rFonts w:ascii="Arial" w:hAnsi="Arial" w:cs="Arial"/>
-          <w:lang w:val="en-US"/>
-        </w:rPr>
-        <w:t>See X</w:t>
-      </w:r>
-    </w:p>
-    <w:p>
-      <w:pPr>
         <w:pStyle w:val="Titre4"/>
         <w:numPr>
           <w:ilvl w:val="2"/>
@@ -7710,7 +7359,281 @@
           <w:rFonts w:ascii="Arial" w:hAnsi="Arial" w:cs="Arial"/>
           <w:lang w:val="en-US"/>
         </w:rPr>
-        <w:t>Observations</w:t>
+        <w:t>H1</w:t>
+      </w:r>
+    </w:p>
+    <w:p>
+      <w:pPr>
+        <w:pStyle w:val="Paragraphedeliste"/>
+        <w:numPr>
+          <w:ilvl w:val="3"/>
+          <w:numId w:val="1"/>
+        </w:numPr>
+        <w:rPr>
+          <w:rFonts w:ascii="Arial" w:eastAsiaTheme="majorEastAsia" w:hAnsi="Arial" w:cs="Arial"/>
+          <w:color w:val="70AD47" w:themeColor="accent6"/>
+          <w:sz w:val="22"/>
+          <w:szCs w:val="22"/>
+          <w:lang w:val="en-US"/>
+        </w:rPr>
+      </w:pPr>
+      <w:r>
+        <w:rPr>
+          <w:rFonts w:ascii="Arial" w:eastAsiaTheme="majorEastAsia" w:hAnsi="Arial" w:cs="Arial"/>
+          <w:color w:val="70AD47" w:themeColor="accent6"/>
+          <w:sz w:val="22"/>
+          <w:szCs w:val="22"/>
+          <w:lang w:val="en-US"/>
+        </w:rPr>
+        <w:t>Mql5 returns</w:t>
+      </w:r>
+    </w:p>
+    <w:p>
+      <w:pPr>
+        <w:pStyle w:val="Paragraphedeliste"/>
+        <w:numPr>
+          <w:ilvl w:val="3"/>
+          <w:numId w:val="1"/>
+        </w:numPr>
+        <w:rPr>
+          <w:rFonts w:ascii="Arial" w:eastAsiaTheme="majorEastAsia" w:hAnsi="Arial" w:cs="Arial"/>
+          <w:color w:val="70AD47" w:themeColor="accent6"/>
+          <w:sz w:val="22"/>
+          <w:szCs w:val="22"/>
+          <w:lang w:val="en-US"/>
+        </w:rPr>
+      </w:pPr>
+      <w:r>
+        <w:rPr>
+          <w:rFonts w:ascii="Arial" w:eastAsiaTheme="majorEastAsia" w:hAnsi="Arial" w:cs="Arial"/>
+          <w:color w:val="70AD47" w:themeColor="accent6"/>
+          <w:sz w:val="22"/>
+          <w:szCs w:val="22"/>
+          <w:lang w:val="en-US"/>
+        </w:rPr>
+        <w:t>Python returns</w:t>
+      </w:r>
+    </w:p>
+    <w:p>
+      <w:pPr>
+        <w:pStyle w:val="Paragraphedeliste"/>
+        <w:ind w:left="0"/>
+        <w:rPr>
+          <w:rFonts w:ascii="Arial" w:eastAsiaTheme="majorEastAsia" w:hAnsi="Arial" w:cs="Arial"/>
+          <w:color w:val="70AD47" w:themeColor="accent6"/>
+          <w:sz w:val="22"/>
+          <w:szCs w:val="22"/>
+          <w:lang w:val="en-US"/>
+        </w:rPr>
+      </w:pPr>
+      <w:bookmarkStart w:id="2" w:name="_GoBack"/>
+      <w:r>
+        <w:rPr>
+          <w:rFonts w:ascii="Arial" w:eastAsiaTheme="majorEastAsia" w:hAnsi="Arial" w:cs="Arial"/>
+          <w:noProof/>
+          <w:color w:val="70AD47" w:themeColor="accent6"/>
+          <w:sz w:val="22"/>
+          <w:szCs w:val="22"/>
+          <w:lang w:val="en-US"/>
+        </w:rPr>
+        <w:drawing>
+          <wp:inline distT="0" distB="0" distL="0" distR="0" wp14:anchorId="46C45610" wp14:editId="6BC38D78">
+            <wp:extent cx="5731510" cy="4296922"/>
+            <wp:effectExtent l="0" t="0" r="2540" b="8890"/>
+            <wp:docPr id="16" name="Image 16" descr="C:\Users\franc\Documents\MetaTrader_tests\Strategy_1_MM_crossover_Hysteresis\05_09_Run_2_No_SL_No_TP_EMA\H1\Reports\05_09_Run_2_No_SL_No_TP_EMA_ProfitsALL.png"/>
+            <wp:cNvGraphicFramePr>
+              <a:graphicFrameLocks xmlns:a="http://schemas.openxmlformats.org/drawingml/2006/main" noChangeAspect="1"/>
+            </wp:cNvGraphicFramePr>
+            <a:graphic xmlns:a="http://schemas.openxmlformats.org/drawingml/2006/main">
+              <a:graphicData uri="http://schemas.openxmlformats.org/drawingml/2006/picture">
+                <pic:pic xmlns:pic="http://schemas.openxmlformats.org/drawingml/2006/picture">
+                  <pic:nvPicPr>
+                    <pic:cNvPr id="0" name="Picture 1" descr="C:\Users\franc\Documents\MetaTrader_tests\Strategy_1_MM_crossover_Hysteresis\05_09_Run_2_No_SL_No_TP_EMA\H1\Reports\05_09_Run_2_No_SL_No_TP_EMA_ProfitsALL.png"/>
+                    <pic:cNvPicPr>
+                      <a:picLocks noChangeAspect="1" noChangeArrowheads="1"/>
+                    </pic:cNvPicPr>
+                  </pic:nvPicPr>
+                  <pic:blipFill>
+                    <a:blip r:embed="rId35">
+                      <a:extLst>
+                        <a:ext uri="{28A0092B-C50C-407E-A947-70E740481C1C}">
+                          <a14:useLocalDpi xmlns:a14="http://schemas.microsoft.com/office/drawing/2010/main" val="0"/>
+                        </a:ext>
+                      </a:extLst>
+                    </a:blip>
+                    <a:srcRect/>
+                    <a:stretch>
+                      <a:fillRect/>
+                    </a:stretch>
+                  </pic:blipFill>
+                  <pic:spPr bwMode="auto">
+                    <a:xfrm>
+                      <a:off x="0" y="0"/>
+                      <a:ext cx="5731510" cy="4296922"/>
+                    </a:xfrm>
+                    <a:prstGeom prst="rect">
+                      <a:avLst/>
+                    </a:prstGeom>
+                    <a:noFill/>
+                    <a:ln>
+                      <a:noFill/>
+                    </a:ln>
+                  </pic:spPr>
+                </pic:pic>
+              </a:graphicData>
+            </a:graphic>
+          </wp:inline>
+        </w:drawing>
+      </w:r>
+      <w:bookmarkEnd w:id="2"/>
+    </w:p>
+    <w:p>
+      <w:pPr>
+        <w:pStyle w:val="Paragraphedeliste"/>
+        <w:numPr>
+          <w:ilvl w:val="3"/>
+          <w:numId w:val="1"/>
+        </w:numPr>
+        <w:rPr>
+          <w:rFonts w:ascii="Arial" w:eastAsiaTheme="majorEastAsia" w:hAnsi="Arial" w:cs="Arial"/>
+          <w:color w:val="70AD47" w:themeColor="accent6"/>
+          <w:sz w:val="22"/>
+          <w:szCs w:val="22"/>
+          <w:lang w:val="en-US"/>
+        </w:rPr>
+      </w:pPr>
+      <w:r>
+        <w:rPr>
+          <w:rFonts w:ascii="Arial" w:eastAsiaTheme="majorEastAsia" w:hAnsi="Arial" w:cs="Arial"/>
+          <w:color w:val="70AD47" w:themeColor="accent6"/>
+          <w:sz w:val="22"/>
+          <w:szCs w:val="22"/>
+          <w:lang w:val="en-US"/>
+        </w:rPr>
+        <w:t>Python correlations</w:t>
+      </w:r>
+    </w:p>
+    <w:p>
+      <w:pPr>
+        <w:pStyle w:val="Paragraphedeliste"/>
+        <w:ind w:left="0"/>
+        <w:rPr>
+          <w:rFonts w:ascii="Arial" w:eastAsiaTheme="majorEastAsia" w:hAnsi="Arial" w:cs="Arial"/>
+          <w:color w:val="70AD47" w:themeColor="accent6"/>
+          <w:sz w:val="22"/>
+          <w:szCs w:val="22"/>
+          <w:lang w:val="en-US"/>
+        </w:rPr>
+      </w:pPr>
+      <w:r>
+        <w:rPr>
+          <w:rFonts w:ascii="Arial" w:eastAsiaTheme="majorEastAsia" w:hAnsi="Arial" w:cs="Arial"/>
+          <w:noProof/>
+          <w:color w:val="70AD47" w:themeColor="accent6"/>
+          <w:sz w:val="22"/>
+          <w:szCs w:val="22"/>
+          <w:lang w:val="en-US"/>
+        </w:rPr>
+        <w:drawing>
+          <wp:inline distT="0" distB="0" distL="0" distR="0" wp14:anchorId="19B25E17" wp14:editId="52AE24DA">
+            <wp:extent cx="5731510" cy="2812119"/>
+            <wp:effectExtent l="0" t="0" r="2540" b="7620"/>
+            <wp:docPr id="31" name="Image 31" descr="C:\Users\franc\Documents\MetaTrader_tests\Strategy_1_MM_crossover_Hysteresis\05_09_Run_2_No_SL_No_TP_EMA\H1\Reports\Figure_4.png"/>
+            <wp:cNvGraphicFramePr>
+              <a:graphicFrameLocks xmlns:a="http://schemas.openxmlformats.org/drawingml/2006/main" noChangeAspect="1"/>
+            </wp:cNvGraphicFramePr>
+            <a:graphic xmlns:a="http://schemas.openxmlformats.org/drawingml/2006/main">
+              <a:graphicData uri="http://schemas.openxmlformats.org/drawingml/2006/picture">
+                <pic:pic xmlns:pic="http://schemas.openxmlformats.org/drawingml/2006/picture">
+                  <pic:nvPicPr>
+                    <pic:cNvPr id="0" name="Picture 2" descr="C:\Users\franc\Documents\MetaTrader_tests\Strategy_1_MM_crossover_Hysteresis\05_09_Run_2_No_SL_No_TP_EMA\H1\Reports\Figure_4.png"/>
+                    <pic:cNvPicPr>
+                      <a:picLocks noChangeAspect="1" noChangeArrowheads="1"/>
+                    </pic:cNvPicPr>
+                  </pic:nvPicPr>
+                  <pic:blipFill>
+                    <a:blip r:embed="rId36" cstate="print">
+                      <a:extLst>
+                        <a:ext uri="{28A0092B-C50C-407E-A947-70E740481C1C}">
+                          <a14:useLocalDpi xmlns:a14="http://schemas.microsoft.com/office/drawing/2010/main" val="0"/>
+                        </a:ext>
+                      </a:extLst>
+                    </a:blip>
+                    <a:srcRect/>
+                    <a:stretch>
+                      <a:fillRect/>
+                    </a:stretch>
+                  </pic:blipFill>
+                  <pic:spPr bwMode="auto">
+                    <a:xfrm>
+                      <a:off x="0" y="0"/>
+                      <a:ext cx="5731510" cy="2812119"/>
+                    </a:xfrm>
+                    <a:prstGeom prst="rect">
+                      <a:avLst/>
+                    </a:prstGeom>
+                    <a:noFill/>
+                    <a:ln>
+                      <a:noFill/>
+                    </a:ln>
+                  </pic:spPr>
+                </pic:pic>
+              </a:graphicData>
+            </a:graphic>
+          </wp:inline>
+        </w:drawing>
+      </w:r>
+    </w:p>
+    <w:p>
+      <w:pPr>
+        <w:pStyle w:val="Paragraphedeliste"/>
+        <w:numPr>
+          <w:ilvl w:val="3"/>
+          <w:numId w:val="1"/>
+        </w:numPr>
+        <w:rPr>
+          <w:rFonts w:ascii="Arial" w:eastAsiaTheme="majorEastAsia" w:hAnsi="Arial" w:cs="Arial"/>
+          <w:color w:val="70AD47" w:themeColor="accent6"/>
+          <w:sz w:val="22"/>
+          <w:szCs w:val="22"/>
+          <w:lang w:val="en-US"/>
+        </w:rPr>
+      </w:pPr>
+      <w:r>
+        <w:rPr>
+          <w:rFonts w:ascii="Arial" w:eastAsiaTheme="majorEastAsia" w:hAnsi="Arial" w:cs="Arial"/>
+          <w:color w:val="70AD47" w:themeColor="accent6"/>
+          <w:sz w:val="22"/>
+          <w:szCs w:val="22"/>
+          <w:lang w:val="en-US"/>
+        </w:rPr>
+        <w:t>Python SL/TP Histogram</w:t>
+      </w:r>
+    </w:p>
+    <w:p>
+      <w:pPr>
+        <w:pStyle w:val="Paragraphedeliste"/>
+        <w:numPr>
+          <w:ilvl w:val="3"/>
+          <w:numId w:val="1"/>
+        </w:numPr>
+        <w:rPr>
+          <w:rFonts w:ascii="Arial" w:eastAsiaTheme="majorEastAsia" w:hAnsi="Arial" w:cs="Arial"/>
+          <w:color w:val="70AD47" w:themeColor="accent6"/>
+          <w:sz w:val="22"/>
+          <w:szCs w:val="22"/>
+          <w:lang w:val="en-US"/>
+        </w:rPr>
+      </w:pPr>
+      <w:r>
+        <w:rPr>
+          <w:rFonts w:ascii="Arial" w:eastAsiaTheme="majorEastAsia" w:hAnsi="Arial" w:cs="Arial"/>
+          <w:color w:val="70AD47" w:themeColor="accent6"/>
+          <w:sz w:val="22"/>
+          <w:szCs w:val="22"/>
+          <w:lang w:val="en-US"/>
+        </w:rPr>
+        <w:t>Python trade duration</w:t>
       </w:r>
     </w:p>
     <w:p>
@@ -7730,7 +7653,8 @@
           <w:rFonts w:ascii="Arial" w:hAnsi="Arial" w:cs="Arial"/>
           <w:lang w:val="en-US"/>
         </w:rPr>
-        <w:t>Returns</w:t>
+        <w:lastRenderedPageBreak/>
+        <w:t>H4</w:t>
       </w:r>
     </w:p>
     <w:p>
@@ -7788,6 +7712,77 @@
     <w:p>
       <w:pPr>
         <w:pStyle w:val="Paragraphedeliste"/>
+        <w:ind w:left="0"/>
+        <w:rPr>
+          <w:rFonts w:ascii="Arial" w:eastAsiaTheme="majorEastAsia" w:hAnsi="Arial" w:cs="Arial"/>
+          <w:color w:val="70AD47" w:themeColor="accent6"/>
+          <w:sz w:val="22"/>
+          <w:szCs w:val="22"/>
+          <w:lang w:val="en-US"/>
+        </w:rPr>
+      </w:pPr>
+      <w:r>
+        <w:rPr>
+          <w:rFonts w:ascii="Arial" w:eastAsiaTheme="majorEastAsia" w:hAnsi="Arial" w:cs="Arial"/>
+          <w:noProof/>
+          <w:color w:val="70AD47" w:themeColor="accent6"/>
+          <w:sz w:val="22"/>
+          <w:szCs w:val="22"/>
+          <w:lang w:val="en-US"/>
+        </w:rPr>
+        <w:drawing>
+          <wp:inline distT="0" distB="0" distL="0" distR="0" wp14:anchorId="1269542F" wp14:editId="32F594A3">
+            <wp:extent cx="5731510" cy="4296922"/>
+            <wp:effectExtent l="0" t="0" r="2540" b="8890"/>
+            <wp:docPr id="47" name="Image 47" descr="C:\Users\franc\Documents\MetaTrader_tests\Strategy_1_MM_crossover_Hysteresis\05_09_Run_2_No_SL_No_TP_EMA\H4\Reports\05_09_Run_2_No_SL_No_TP_EMA_ProfitsALL.png"/>
+            <wp:cNvGraphicFramePr>
+              <a:graphicFrameLocks xmlns:a="http://schemas.openxmlformats.org/drawingml/2006/main" noChangeAspect="1"/>
+            </wp:cNvGraphicFramePr>
+            <a:graphic xmlns:a="http://schemas.openxmlformats.org/drawingml/2006/main">
+              <a:graphicData uri="http://schemas.openxmlformats.org/drawingml/2006/picture">
+                <pic:pic xmlns:pic="http://schemas.openxmlformats.org/drawingml/2006/picture">
+                  <pic:nvPicPr>
+                    <pic:cNvPr id="0" name="Picture 13" descr="C:\Users\franc\Documents\MetaTrader_tests\Strategy_1_MM_crossover_Hysteresis\05_09_Run_2_No_SL_No_TP_EMA\H4\Reports\05_09_Run_2_No_SL_No_TP_EMA_ProfitsALL.png"/>
+                    <pic:cNvPicPr>
+                      <a:picLocks noChangeAspect="1" noChangeArrowheads="1"/>
+                    </pic:cNvPicPr>
+                  </pic:nvPicPr>
+                  <pic:blipFill>
+                    <a:blip r:embed="rId37">
+                      <a:extLst>
+                        <a:ext uri="{28A0092B-C50C-407E-A947-70E740481C1C}">
+                          <a14:useLocalDpi xmlns:a14="http://schemas.microsoft.com/office/drawing/2010/main" val="0"/>
+                        </a:ext>
+                      </a:extLst>
+                    </a:blip>
+                    <a:srcRect/>
+                    <a:stretch>
+                      <a:fillRect/>
+                    </a:stretch>
+                  </pic:blipFill>
+                  <pic:spPr bwMode="auto">
+                    <a:xfrm>
+                      <a:off x="0" y="0"/>
+                      <a:ext cx="5731510" cy="4296922"/>
+                    </a:xfrm>
+                    <a:prstGeom prst="rect">
+                      <a:avLst/>
+                    </a:prstGeom>
+                    <a:noFill/>
+                    <a:ln>
+                      <a:noFill/>
+                    </a:ln>
+                  </pic:spPr>
+                </pic:pic>
+              </a:graphicData>
+            </a:graphic>
+          </wp:inline>
+        </w:drawing>
+      </w:r>
+    </w:p>
+    <w:p>
+      <w:pPr>
+        <w:pStyle w:val="Paragraphedeliste"/>
         <w:numPr>
           <w:ilvl w:val="3"/>
           <w:numId w:val="1"/>
@@ -7802,24 +7797,85 @@
       </w:pPr>
       <w:r>
         <w:rPr>
-          <w:rFonts w:ascii="Arial" w:hAnsi="Arial" w:cs="Arial"/>
-          <w:lang w:val="en-US"/>
-        </w:rPr>
-        <w:t>excursion</w:t>
+          <w:rFonts w:ascii="Arial" w:eastAsiaTheme="majorEastAsia" w:hAnsi="Arial" w:cs="Arial"/>
+          <w:color w:val="70AD47" w:themeColor="accent6"/>
+          <w:sz w:val="22"/>
+          <w:szCs w:val="22"/>
+          <w:lang w:val="en-US"/>
+        </w:rPr>
+        <w:t>Python correlations</w:t>
       </w:r>
     </w:p>
     <w:p>
       <w:pPr>
         <w:pStyle w:val="Paragraphedeliste"/>
-        <w:ind w:left="1728"/>
-        <w:rPr>
-          <w:rFonts w:ascii="Arial" w:eastAsiaTheme="majorEastAsia" w:hAnsi="Arial" w:cs="Arial"/>
-          <w:color w:val="70AD47" w:themeColor="accent6"/>
-          <w:sz w:val="22"/>
-          <w:szCs w:val="22"/>
-          <w:lang w:val="en-US"/>
-        </w:rPr>
-      </w:pPr>
+        <w:ind w:left="0"/>
+        <w:rPr>
+          <w:rFonts w:ascii="Arial" w:eastAsiaTheme="majorEastAsia" w:hAnsi="Arial" w:cs="Arial"/>
+          <w:color w:val="70AD47" w:themeColor="accent6"/>
+          <w:sz w:val="22"/>
+          <w:szCs w:val="22"/>
+          <w:lang w:val="en-US"/>
+        </w:rPr>
+      </w:pPr>
+      <w:r>
+        <w:rPr>
+          <w:rFonts w:ascii="Arial" w:eastAsiaTheme="majorEastAsia" w:hAnsi="Arial" w:cs="Arial"/>
+          <w:noProof/>
+          <w:color w:val="70AD47" w:themeColor="accent6"/>
+          <w:sz w:val="22"/>
+          <w:szCs w:val="22"/>
+          <w:lang w:val="en-US"/>
+        </w:rPr>
+        <w:drawing>
+          <wp:inline distT="0" distB="0" distL="0" distR="0" wp14:anchorId="0727A464" wp14:editId="03437605">
+            <wp:extent cx="5731510" cy="2812119"/>
+            <wp:effectExtent l="0" t="0" r="2540" b="7620"/>
+            <wp:docPr id="48" name="Image 48" descr="C:\Users\franc\Documents\MetaTrader_tests\Strategy_1_MM_crossover_Hysteresis\05_09_Run_2_No_SL_No_TP_EMA\H4\Reports\H4_05_09_Run_2_No_SL_No_TP_EMA_Correlations.png"/>
+            <wp:cNvGraphicFramePr>
+              <a:graphicFrameLocks xmlns:a="http://schemas.openxmlformats.org/drawingml/2006/main" noChangeAspect="1"/>
+            </wp:cNvGraphicFramePr>
+            <a:graphic xmlns:a="http://schemas.openxmlformats.org/drawingml/2006/main">
+              <a:graphicData uri="http://schemas.openxmlformats.org/drawingml/2006/picture">
+                <pic:pic xmlns:pic="http://schemas.openxmlformats.org/drawingml/2006/picture">
+                  <pic:nvPicPr>
+                    <pic:cNvPr id="0" name="Picture 14" descr="C:\Users\franc\Documents\MetaTrader_tests\Strategy_1_MM_crossover_Hysteresis\05_09_Run_2_No_SL_No_TP_EMA\H4\Reports\H4_05_09_Run_2_No_SL_No_TP_EMA_Correlations.png"/>
+                    <pic:cNvPicPr>
+                      <a:picLocks noChangeAspect="1" noChangeArrowheads="1"/>
+                    </pic:cNvPicPr>
+                  </pic:nvPicPr>
+                  <pic:blipFill>
+                    <a:blip r:embed="rId38" cstate="print">
+                      <a:extLst>
+                        <a:ext uri="{28A0092B-C50C-407E-A947-70E740481C1C}">
+                          <a14:useLocalDpi xmlns:a14="http://schemas.microsoft.com/office/drawing/2010/main" val="0"/>
+                        </a:ext>
+                      </a:extLst>
+                    </a:blip>
+                    <a:srcRect/>
+                    <a:stretch>
+                      <a:fillRect/>
+                    </a:stretch>
+                  </pic:blipFill>
+                  <pic:spPr bwMode="auto">
+                    <a:xfrm>
+                      <a:off x="0" y="0"/>
+                      <a:ext cx="5731510" cy="2812119"/>
+                    </a:xfrm>
+                    <a:prstGeom prst="rect">
+                      <a:avLst/>
+                    </a:prstGeom>
+                    <a:noFill/>
+                    <a:ln>
+                      <a:noFill/>
+                    </a:ln>
+                  </pic:spPr>
+                </pic:pic>
+              </a:graphicData>
+            </a:graphic>
+          </wp:inline>
+        </w:drawing>
+      </w:r>
     </w:p>
     <w:p>
       <w:pPr>
@@ -7844,12 +7900,278 @@
           <w:szCs w:val="22"/>
           <w:lang w:val="en-US"/>
         </w:rPr>
+        <w:t>Python SL/TP Histogram</w:t>
+      </w:r>
+    </w:p>
+    <w:p>
+      <w:pPr>
+        <w:pStyle w:val="Paragraphedeliste"/>
+        <w:numPr>
+          <w:ilvl w:val="3"/>
+          <w:numId w:val="1"/>
+        </w:numPr>
+        <w:rPr>
+          <w:rFonts w:ascii="Arial" w:eastAsiaTheme="majorEastAsia" w:hAnsi="Arial" w:cs="Arial"/>
+          <w:color w:val="70AD47" w:themeColor="accent6"/>
+          <w:sz w:val="22"/>
+          <w:szCs w:val="22"/>
+          <w:lang w:val="en-US"/>
+        </w:rPr>
+      </w:pPr>
+      <w:r>
+        <w:rPr>
+          <w:rFonts w:ascii="Arial" w:eastAsiaTheme="majorEastAsia" w:hAnsi="Arial" w:cs="Arial"/>
+          <w:color w:val="70AD47" w:themeColor="accent6"/>
+          <w:sz w:val="22"/>
+          <w:szCs w:val="22"/>
+          <w:lang w:val="en-US"/>
+        </w:rPr>
+        <w:t>Python trade duration</w:t>
+      </w:r>
+    </w:p>
+    <w:p>
+      <w:pPr>
+        <w:pStyle w:val="Titre4"/>
+        <w:numPr>
+          <w:ilvl w:val="2"/>
+          <w:numId w:val="1"/>
+        </w:numPr>
+        <w:rPr>
+          <w:rFonts w:ascii="Arial" w:hAnsi="Arial" w:cs="Arial"/>
+          <w:lang w:val="en-US"/>
+        </w:rPr>
+      </w:pPr>
+      <w:r>
+        <w:rPr>
+          <w:rFonts w:ascii="Arial" w:hAnsi="Arial" w:cs="Arial"/>
+          <w:lang w:val="en-US"/>
+        </w:rPr>
+        <w:t>D1</w:t>
+      </w:r>
+    </w:p>
+    <w:p>
+      <w:pPr>
+        <w:pStyle w:val="Paragraphedeliste"/>
+        <w:numPr>
+          <w:ilvl w:val="3"/>
+          <w:numId w:val="1"/>
+        </w:numPr>
+        <w:rPr>
+          <w:rFonts w:ascii="Arial" w:eastAsiaTheme="majorEastAsia" w:hAnsi="Arial" w:cs="Arial"/>
+          <w:color w:val="70AD47" w:themeColor="accent6"/>
+          <w:sz w:val="22"/>
+          <w:szCs w:val="22"/>
+          <w:lang w:val="en-US"/>
+        </w:rPr>
+      </w:pPr>
+      <w:r>
+        <w:rPr>
+          <w:rFonts w:ascii="Arial" w:eastAsiaTheme="majorEastAsia" w:hAnsi="Arial" w:cs="Arial"/>
+          <w:color w:val="70AD47" w:themeColor="accent6"/>
+          <w:sz w:val="22"/>
+          <w:szCs w:val="22"/>
+          <w:lang w:val="en-US"/>
+        </w:rPr>
+        <w:t>Mql5 returns</w:t>
+      </w:r>
+    </w:p>
+    <w:p>
+      <w:pPr>
+        <w:pStyle w:val="Paragraphedeliste"/>
+        <w:numPr>
+          <w:ilvl w:val="3"/>
+          <w:numId w:val="1"/>
+        </w:numPr>
+        <w:rPr>
+          <w:rFonts w:ascii="Arial" w:eastAsiaTheme="majorEastAsia" w:hAnsi="Arial" w:cs="Arial"/>
+          <w:color w:val="70AD47" w:themeColor="accent6"/>
+          <w:sz w:val="22"/>
+          <w:szCs w:val="22"/>
+          <w:lang w:val="en-US"/>
+        </w:rPr>
+      </w:pPr>
+      <w:r>
+        <w:rPr>
+          <w:rFonts w:ascii="Arial" w:eastAsiaTheme="majorEastAsia" w:hAnsi="Arial" w:cs="Arial"/>
+          <w:color w:val="70AD47" w:themeColor="accent6"/>
+          <w:sz w:val="22"/>
+          <w:szCs w:val="22"/>
+          <w:lang w:val="en-US"/>
+        </w:rPr>
+        <w:lastRenderedPageBreak/>
+        <w:t>Python returns</w:t>
+      </w:r>
+    </w:p>
+    <w:p>
+      <w:pPr>
+        <w:pStyle w:val="Paragraphedeliste"/>
+        <w:ind w:left="1080"/>
+        <w:rPr>
+          <w:rFonts w:ascii="Arial" w:eastAsiaTheme="majorEastAsia" w:hAnsi="Arial" w:cs="Arial"/>
+          <w:color w:val="70AD47" w:themeColor="accent6"/>
+          <w:sz w:val="22"/>
+          <w:szCs w:val="22"/>
+          <w:lang w:val="en-US"/>
+        </w:rPr>
+      </w:pPr>
+      <w:r>
+        <w:rPr>
+          <w:rFonts w:ascii="Arial" w:eastAsiaTheme="majorEastAsia" w:hAnsi="Arial" w:cs="Arial"/>
+          <w:noProof/>
+          <w:color w:val="70AD47" w:themeColor="accent6"/>
+          <w:sz w:val="22"/>
+          <w:szCs w:val="22"/>
+          <w:lang w:val="en-US"/>
+        </w:rPr>
+        <w:drawing>
+          <wp:inline distT="0" distB="0" distL="0" distR="0" wp14:anchorId="6A9E1999" wp14:editId="6D9C7AEF">
+            <wp:extent cx="4367694" cy="3274467"/>
+            <wp:effectExtent l="0" t="0" r="0" b="2540"/>
+            <wp:docPr id="49" name="Image 49" descr="C:\Users\franc\Documents\MetaTrader_tests\Strategy_1_MM_crossover_Hysteresis\05_09_Run_2_No_SL_No_TP_EMA\D1\Reports\05_09_Run_2_No_SL_No_TP_EMA_ProfitsALL.png"/>
+            <wp:cNvGraphicFramePr>
+              <a:graphicFrameLocks xmlns:a="http://schemas.openxmlformats.org/drawingml/2006/main" noChangeAspect="1"/>
+            </wp:cNvGraphicFramePr>
+            <a:graphic xmlns:a="http://schemas.openxmlformats.org/drawingml/2006/main">
+              <a:graphicData uri="http://schemas.openxmlformats.org/drawingml/2006/picture">
+                <pic:pic xmlns:pic="http://schemas.openxmlformats.org/drawingml/2006/picture">
+                  <pic:nvPicPr>
+                    <pic:cNvPr id="0" name="Picture 15" descr="C:\Users\franc\Documents\MetaTrader_tests\Strategy_1_MM_crossover_Hysteresis\05_09_Run_2_No_SL_No_TP_EMA\D1\Reports\05_09_Run_2_No_SL_No_TP_EMA_ProfitsALL.png"/>
+                    <pic:cNvPicPr>
+                      <a:picLocks noChangeAspect="1" noChangeArrowheads="1"/>
+                    </pic:cNvPicPr>
+                  </pic:nvPicPr>
+                  <pic:blipFill>
+                    <a:blip r:embed="rId39">
+                      <a:extLst>
+                        <a:ext uri="{28A0092B-C50C-407E-A947-70E740481C1C}">
+                          <a14:useLocalDpi xmlns:a14="http://schemas.microsoft.com/office/drawing/2010/main" val="0"/>
+                        </a:ext>
+                      </a:extLst>
+                    </a:blip>
+                    <a:srcRect/>
+                    <a:stretch>
+                      <a:fillRect/>
+                    </a:stretch>
+                  </pic:blipFill>
+                  <pic:spPr bwMode="auto">
+                    <a:xfrm>
+                      <a:off x="0" y="0"/>
+                      <a:ext cx="4370610" cy="3276653"/>
+                    </a:xfrm>
+                    <a:prstGeom prst="rect">
+                      <a:avLst/>
+                    </a:prstGeom>
+                    <a:noFill/>
+                    <a:ln>
+                      <a:noFill/>
+                    </a:ln>
+                  </pic:spPr>
+                </pic:pic>
+              </a:graphicData>
+            </a:graphic>
+          </wp:inline>
+        </w:drawing>
+      </w:r>
+    </w:p>
+    <w:p>
+      <w:pPr>
+        <w:pStyle w:val="Paragraphedeliste"/>
+        <w:numPr>
+          <w:ilvl w:val="3"/>
+          <w:numId w:val="1"/>
+        </w:numPr>
+        <w:rPr>
+          <w:rFonts w:ascii="Arial" w:eastAsiaTheme="majorEastAsia" w:hAnsi="Arial" w:cs="Arial"/>
+          <w:color w:val="70AD47" w:themeColor="accent6"/>
+          <w:sz w:val="22"/>
+          <w:szCs w:val="22"/>
+          <w:lang w:val="en-US"/>
+        </w:rPr>
+      </w:pPr>
+      <w:r>
+        <w:rPr>
+          <w:rFonts w:ascii="Arial" w:eastAsiaTheme="majorEastAsia" w:hAnsi="Arial" w:cs="Arial"/>
+          <w:color w:val="70AD47" w:themeColor="accent6"/>
+          <w:sz w:val="22"/>
+          <w:szCs w:val="22"/>
+          <w:lang w:val="en-US"/>
+        </w:rPr>
         <w:t>Python correlations</w:t>
       </w:r>
     </w:p>
     <w:p>
       <w:pPr>
         <w:pStyle w:val="Paragraphedeliste"/>
+        <w:rPr>
+          <w:rFonts w:ascii="Arial" w:eastAsiaTheme="majorEastAsia" w:hAnsi="Arial" w:cs="Arial"/>
+          <w:color w:val="70AD47" w:themeColor="accent6"/>
+          <w:sz w:val="22"/>
+          <w:szCs w:val="22"/>
+          <w:lang w:val="en-US"/>
+        </w:rPr>
+      </w:pPr>
+      <w:r>
+        <w:rPr>
+          <w:rFonts w:ascii="Arial" w:eastAsiaTheme="majorEastAsia" w:hAnsi="Arial" w:cs="Arial"/>
+          <w:noProof/>
+          <w:color w:val="70AD47" w:themeColor="accent6"/>
+          <w:sz w:val="22"/>
+          <w:szCs w:val="22"/>
+          <w:lang w:val="en-US"/>
+        </w:rPr>
+        <w:drawing>
+          <wp:inline distT="0" distB="0" distL="0" distR="0" wp14:anchorId="6C4ED084" wp14:editId="10FFA328">
+            <wp:extent cx="5731510" cy="2812119"/>
+            <wp:effectExtent l="0" t="0" r="2540" b="7620"/>
+            <wp:docPr id="50" name="Image 50" descr="C:\Users\franc\Documents\MetaTrader_tests\Strategy_1_MM_crossover_Hysteresis\05_09_Run_2_No_SL_No_TP_EMA\D1\Reports\Figure_4.png"/>
+            <wp:cNvGraphicFramePr>
+              <a:graphicFrameLocks xmlns:a="http://schemas.openxmlformats.org/drawingml/2006/main" noChangeAspect="1"/>
+            </wp:cNvGraphicFramePr>
+            <a:graphic xmlns:a="http://schemas.openxmlformats.org/drawingml/2006/main">
+              <a:graphicData uri="http://schemas.openxmlformats.org/drawingml/2006/picture">
+                <pic:pic xmlns:pic="http://schemas.openxmlformats.org/drawingml/2006/picture">
+                  <pic:nvPicPr>
+                    <pic:cNvPr id="0" name="Picture 16" descr="C:\Users\franc\Documents\MetaTrader_tests\Strategy_1_MM_crossover_Hysteresis\05_09_Run_2_No_SL_No_TP_EMA\D1\Reports\Figure_4.png"/>
+                    <pic:cNvPicPr>
+                      <a:picLocks noChangeAspect="1" noChangeArrowheads="1"/>
+                    </pic:cNvPicPr>
+                  </pic:nvPicPr>
+                  <pic:blipFill>
+                    <a:blip r:embed="rId40" cstate="print">
+                      <a:extLst>
+                        <a:ext uri="{28A0092B-C50C-407E-A947-70E740481C1C}">
+                          <a14:useLocalDpi xmlns:a14="http://schemas.microsoft.com/office/drawing/2010/main" val="0"/>
+                        </a:ext>
+                      </a:extLst>
+                    </a:blip>
+                    <a:srcRect/>
+                    <a:stretch>
+                      <a:fillRect/>
+                    </a:stretch>
+                  </pic:blipFill>
+                  <pic:spPr bwMode="auto">
+                    <a:xfrm>
+                      <a:off x="0" y="0"/>
+                      <a:ext cx="5731510" cy="2812119"/>
+                    </a:xfrm>
+                    <a:prstGeom prst="rect">
+                      <a:avLst/>
+                    </a:prstGeom>
+                    <a:noFill/>
+                    <a:ln>
+                      <a:noFill/>
+                    </a:ln>
+                  </pic:spPr>
+                </pic:pic>
+              </a:graphicData>
+            </a:graphic>
+          </wp:inline>
+        </w:drawing>
+      </w:r>
+    </w:p>
+    <w:p>
+      <w:pPr>
+        <w:pStyle w:val="Paragraphedeliste"/>
         <w:numPr>
           <w:ilvl w:val="3"/>
           <w:numId w:val="1"/>
@@ -7916,7 +8238,137 @@
           <w:rFonts w:ascii="Arial" w:hAnsi="Arial" w:cs="Arial"/>
           <w:lang w:val="en-US"/>
         </w:rPr>
-        <w:t>Conclusions</w:t>
+        <w:t>W1</w:t>
+      </w:r>
+    </w:p>
+    <w:p>
+      <w:pPr>
+        <w:pStyle w:val="Paragraphedeliste"/>
+        <w:numPr>
+          <w:ilvl w:val="3"/>
+          <w:numId w:val="1"/>
+        </w:numPr>
+        <w:rPr>
+          <w:rFonts w:ascii="Arial" w:eastAsiaTheme="majorEastAsia" w:hAnsi="Arial" w:cs="Arial"/>
+          <w:color w:val="70AD47" w:themeColor="accent6"/>
+          <w:sz w:val="22"/>
+          <w:szCs w:val="22"/>
+          <w:lang w:val="en-US"/>
+        </w:rPr>
+      </w:pPr>
+      <w:r>
+        <w:rPr>
+          <w:rFonts w:ascii="Arial" w:eastAsiaTheme="majorEastAsia" w:hAnsi="Arial" w:cs="Arial"/>
+          <w:color w:val="70AD47" w:themeColor="accent6"/>
+          <w:sz w:val="22"/>
+          <w:szCs w:val="22"/>
+          <w:lang w:val="en-US"/>
+        </w:rPr>
+        <w:t>Mql5 returns</w:t>
+      </w:r>
+    </w:p>
+    <w:p>
+      <w:pPr>
+        <w:pStyle w:val="Paragraphedeliste"/>
+        <w:numPr>
+          <w:ilvl w:val="3"/>
+          <w:numId w:val="1"/>
+        </w:numPr>
+        <w:rPr>
+          <w:rFonts w:ascii="Arial" w:eastAsiaTheme="majorEastAsia" w:hAnsi="Arial" w:cs="Arial"/>
+          <w:color w:val="70AD47" w:themeColor="accent6"/>
+          <w:sz w:val="22"/>
+          <w:szCs w:val="22"/>
+          <w:lang w:val="en-US"/>
+        </w:rPr>
+      </w:pPr>
+      <w:r>
+        <w:rPr>
+          <w:rFonts w:ascii="Arial" w:eastAsiaTheme="majorEastAsia" w:hAnsi="Arial" w:cs="Arial"/>
+          <w:color w:val="70AD47" w:themeColor="accent6"/>
+          <w:sz w:val="22"/>
+          <w:szCs w:val="22"/>
+          <w:lang w:val="en-US"/>
+        </w:rPr>
+        <w:t>Python returns</w:t>
+      </w:r>
+    </w:p>
+    <w:p>
+      <w:pPr>
+        <w:pStyle w:val="Paragraphedeliste"/>
+        <w:numPr>
+          <w:ilvl w:val="3"/>
+          <w:numId w:val="1"/>
+        </w:numPr>
+        <w:rPr>
+          <w:rFonts w:ascii="Arial" w:eastAsiaTheme="majorEastAsia" w:hAnsi="Arial" w:cs="Arial"/>
+          <w:color w:val="70AD47" w:themeColor="accent6"/>
+          <w:sz w:val="22"/>
+          <w:szCs w:val="22"/>
+          <w:lang w:val="en-US"/>
+        </w:rPr>
+      </w:pPr>
+      <w:r>
+        <w:rPr>
+          <w:rFonts w:ascii="Arial" w:eastAsiaTheme="majorEastAsia" w:hAnsi="Arial" w:cs="Arial"/>
+          <w:color w:val="70AD47" w:themeColor="accent6"/>
+          <w:sz w:val="22"/>
+          <w:szCs w:val="22"/>
+          <w:lang w:val="en-US"/>
+        </w:rPr>
+        <w:t>Python correlations</w:t>
+      </w:r>
+    </w:p>
+    <w:p>
+      <w:pPr>
+        <w:pStyle w:val="Paragraphedeliste"/>
+        <w:numPr>
+          <w:ilvl w:val="3"/>
+          <w:numId w:val="1"/>
+        </w:numPr>
+        <w:rPr>
+          <w:rFonts w:ascii="Arial" w:eastAsiaTheme="majorEastAsia" w:hAnsi="Arial" w:cs="Arial"/>
+          <w:color w:val="70AD47" w:themeColor="accent6"/>
+          <w:sz w:val="22"/>
+          <w:szCs w:val="22"/>
+          <w:lang w:val="en-US"/>
+        </w:rPr>
+      </w:pPr>
+      <w:r>
+        <w:rPr>
+          <w:rFonts w:ascii="Arial" w:eastAsiaTheme="majorEastAsia" w:hAnsi="Arial" w:cs="Arial"/>
+          <w:color w:val="70AD47" w:themeColor="accent6"/>
+          <w:sz w:val="22"/>
+          <w:szCs w:val="22"/>
+          <w:lang w:val="en-US"/>
+        </w:rPr>
+        <w:t>Python SL/TP Histogram</w:t>
+      </w:r>
+    </w:p>
+    <w:p>
+      <w:pPr>
+        <w:pStyle w:val="Paragraphedeliste"/>
+        <w:numPr>
+          <w:ilvl w:val="3"/>
+          <w:numId w:val="1"/>
+        </w:numPr>
+        <w:rPr>
+          <w:rFonts w:ascii="Arial" w:eastAsiaTheme="majorEastAsia" w:hAnsi="Arial" w:cs="Arial"/>
+          <w:color w:val="70AD47" w:themeColor="accent6"/>
+          <w:sz w:val="22"/>
+          <w:szCs w:val="22"/>
+          <w:lang w:val="en-US"/>
+        </w:rPr>
+      </w:pPr>
+      <w:r>
+        <w:rPr>
+          <w:rFonts w:ascii="Arial" w:eastAsiaTheme="majorEastAsia" w:hAnsi="Arial" w:cs="Arial"/>
+          <w:color w:val="70AD47" w:themeColor="accent6"/>
+          <w:sz w:val="22"/>
+          <w:szCs w:val="22"/>
+          <w:lang w:val="en-US"/>
+        </w:rPr>
+        <w:t>Python trade duration</w:t>
       </w:r>
     </w:p>
     <w:p>
@@ -7973,30 +8425,8 @@
         <w:rPr>
           <w:lang w:val="en-US"/>
         </w:rPr>
-        <w:t>n the previous section, we saw dynamic hysteresis (</w:t>
-      </w:r>
-      <w:proofErr w:type="spellStart"/>
-      <w:r>
-        <w:rPr>
-          <w:lang w:val="en-US"/>
-        </w:rPr>
-        <w:t>i.e</w:t>
-      </w:r>
-      <w:proofErr w:type="spellEnd"/>
-      <w:r>
-        <w:rPr>
-          <w:lang w:val="en-US"/>
-        </w:rPr>
-        <w:t xml:space="preserve"> based on the maximum of MA differences) is often not enough to avoid </w:t>
-      </w:r>
-      <w:proofErr w:type="spellStart"/>
-      <w:r>
-        <w:rPr>
-          <w:lang w:val="en-US"/>
-        </w:rPr>
-        <w:t>whispays</w:t>
-      </w:r>
-      <w:proofErr w:type="spellEnd"/>
+        <w:t>n the previous section, we saw dynamic hysteresis (i.e based on the maximum of MA differences) is often not enough to avoid whispays</w:t>
+      </w:r>
     </w:p>
     <w:p>
       <w:pPr>
@@ -8228,7 +8658,6 @@
           <w:lang w:val="en-US"/>
         </w:rPr>
       </w:pPr>
-      <w:proofErr w:type="spellStart"/>
       <m:oMath>
         <m:r>
           <m:rPr>
@@ -8238,18 +8667,7 @@
             <w:rFonts w:ascii="Arial" w:hAnsi="Arial" w:cs="Arial"/>
             <w:lang w:val="en-US"/>
           </w:rPr>
-          <m:t>Hyst</m:t>
-        </m:r>
-        <w:proofErr w:type="spellEnd"/>
-        <m:r>
-          <m:rPr>
-            <m:nor/>
-          </m:rPr>
-          <w:rPr>
-            <w:rFonts w:ascii="Arial" w:hAnsi="Arial" w:cs="Arial"/>
-            <w:lang w:val="en-US"/>
-          </w:rPr>
-          <m:t>(t)</m:t>
+          <m:t>Hyst(t)</m:t>
         </m:r>
         <m:r>
           <w:rPr>
@@ -8550,7 +8968,6 @@
           <w:rFonts w:ascii="Arial" w:hAnsi="Arial" w:cs="Arial"/>
           <w:lang w:val="en-US"/>
         </w:rPr>
-        <w:lastRenderedPageBreak/>
         <w:t xml:space="preserve">Use static hysteresis of the previous year </w:t>
       </w:r>
     </w:p>
@@ -8600,6 +9017,7 @@
           <w:noProof/>
           <w:lang w:val="en-US"/>
         </w:rPr>
+        <w:lastRenderedPageBreak/>
         <w:drawing>
           <wp:inline distT="0" distB="0" distL="0" distR="0" wp14:anchorId="199C6786" wp14:editId="203C4C2F">
             <wp:extent cx="5731510" cy="4298950"/>
@@ -8616,7 +9034,7 @@
                     <pic:cNvPicPr/>
                   </pic:nvPicPr>
                   <pic:blipFill>
-                    <a:blip r:embed="rId35">
+                    <a:blip r:embed="rId41">
                       <a:extLst>
                         <a:ext uri="{28A0092B-C50C-407E-A947-70E740481C1C}">
                           <a14:useLocalDpi xmlns:a14="http://schemas.microsoft.com/office/drawing/2010/main" val="0"/>
@@ -8654,24 +9072,14 @@
       <w:r>
         <w:t xml:space="preserve">Figure </w:t>
       </w:r>
-      <w:r>
-        <w:fldChar w:fldCharType="begin"/>
-      </w:r>
-      <w:r>
-        <w:instrText xml:space="preserve"> SEQ Figure \* ARABIC </w:instrText>
-      </w:r>
-      <w:r>
-        <w:fldChar w:fldCharType="separate"/>
-      </w:r>
-      <w:r>
-        <w:rPr>
-          <w:noProof/>
-        </w:rPr>
-        <w:t>25</w:t>
-      </w:r>
-      <w:r>
-        <w:fldChar w:fldCharType="end"/>
-      </w:r>
+      <w:fldSimple w:instr=" SEQ Figure \* ARABIC ">
+        <w:r>
+          <w:rPr>
+            <w:noProof/>
+          </w:rPr>
+          <w:t>25</w:t>
+        </w:r>
+      </w:fldSimple>
       <w:r>
         <w:rPr>
           <w:lang w:val="en-US"/>
@@ -8707,21 +9115,7 @@
         <w:rPr>
           <w:lang w:val="en-US"/>
         </w:rPr>
-        <w:t xml:space="preserve">0 </w:t>
-      </w:r>
-      <w:proofErr w:type="spellStart"/>
-      <w:r>
-        <w:rPr>
-          <w:lang w:val="en-US"/>
-        </w:rPr>
-        <w:t>procent</w:t>
-      </w:r>
-      <w:proofErr w:type="spellEnd"/>
-      <w:r>
-        <w:rPr>
-          <w:lang w:val="en-US"/>
-        </w:rPr>
-        <w:t xml:space="preserve"> reject with previous year</w:t>
+        <w:t>0 procent reject with previous year</w:t>
       </w:r>
     </w:p>
     <w:p>
@@ -8747,7 +9141,7 @@
     <w:p>
       <w:pPr>
         <w:rPr>
-          <w:lang w:val="fr-BE"/>
+          <w:lang w:val="en-US"/>
         </w:rPr>
       </w:pPr>
       <w:r>
@@ -8771,7 +9165,6 @@
         </w:rPr>
         <w:t xml:space="preserve"> with </w:t>
       </w:r>
-      <w:proofErr w:type="spellStart"/>
       <m:oMath>
         <m:r>
           <m:rPr>
@@ -8781,18 +9174,7 @@
             <w:rFonts w:ascii="Arial" w:hAnsi="Arial" w:cs="Arial"/>
             <w:lang w:val="en-US"/>
           </w:rPr>
-          <m:t>Hyst</m:t>
-        </m:r>
-        <w:proofErr w:type="spellEnd"/>
-        <m:r>
-          <m:rPr>
-            <m:nor/>
-          </m:rPr>
-          <w:rPr>
-            <w:rFonts w:ascii="Arial" w:hAnsi="Arial" w:cs="Arial"/>
-            <w:lang w:val="en-US"/>
-          </w:rPr>
-          <m:t>(t)</m:t>
+          <m:t>Hyst(t)</m:t>
         </m:r>
         <m:r>
           <w:rPr>
@@ -9085,7 +9467,6 @@
           <w:rFonts w:ascii="Arial" w:hAnsi="Arial" w:cs="Arial"/>
           <w:lang w:val="en-US"/>
         </w:rPr>
-        <w:lastRenderedPageBreak/>
         <w:t>H1</w:t>
       </w:r>
     </w:p>
@@ -9095,6 +9476,7 @@
       </w:pPr>
       <w:r>
         <w:rPr>
+          <w:noProof/>
           <w:lang w:val="en-US"/>
         </w:rPr>
         <w:drawing>
@@ -9113,7 +9495,7 @@
                     <pic:cNvPicPr/>
                   </pic:nvPicPr>
                   <pic:blipFill>
-                    <a:blip r:embed="rId36"/>
+                    <a:blip r:embed="rId42"/>
                     <a:stretch>
                       <a:fillRect/>
                     </a:stretch>
@@ -9145,61 +9527,37 @@
       <w:r>
         <w:t xml:space="preserve">Figure </w:t>
       </w:r>
-      <w:r>
-        <w:fldChar w:fldCharType="begin"/>
-      </w:r>
-      <w:r>
-        <w:instrText xml:space="preserve"> SEQ Figure \* ARABIC </w:instrText>
-      </w:r>
-      <w:r>
-        <w:fldChar w:fldCharType="separate"/>
-      </w:r>
+      <w:fldSimple w:instr=" SEQ Figure \* ARABIC ">
+        <w:r>
+          <w:rPr>
+            <w:noProof/>
+          </w:rPr>
+          <w:t>26</w:t>
+        </w:r>
+      </w:fldSimple>
+      <w:r>
+        <w:rPr>
+          <w:lang w:val="en-US"/>
+        </w:rPr>
+        <w:t>Avoinding Whispay</w:t>
+      </w:r>
+      <w:r>
+        <w:rPr>
+          <w:lang w:val="en-US"/>
+        </w:rPr>
+        <w:t xml:space="preserve"> </w:t>
+      </w:r>
+    </w:p>
+    <w:p>
+      <w:pPr>
+        <w:keepNext/>
+      </w:pPr>
       <w:r>
         <w:rPr>
           <w:noProof/>
-        </w:rPr>
-        <w:t>26</w:t>
-      </w:r>
-      <w:r>
-        <w:fldChar w:fldCharType="end"/>
-      </w:r>
-      <w:proofErr w:type="spellStart"/>
-      <w:r>
-        <w:rPr>
-          <w:lang w:val="en-US"/>
-        </w:rPr>
-        <w:t>Avoinding</w:t>
-      </w:r>
-      <w:proofErr w:type="spellEnd"/>
-      <w:r>
-        <w:rPr>
-          <w:lang w:val="en-US"/>
-        </w:rPr>
-        <w:t xml:space="preserve"> </w:t>
-      </w:r>
-      <w:proofErr w:type="spellStart"/>
-      <w:r>
-        <w:rPr>
-          <w:lang w:val="en-US"/>
-        </w:rPr>
-        <w:t>Whispay</w:t>
-      </w:r>
-      <w:proofErr w:type="spellEnd"/>
-      <w:r>
-        <w:rPr>
-          <w:lang w:val="en-US"/>
-        </w:rPr>
-        <w:t xml:space="preserve"> </w:t>
-      </w:r>
-    </w:p>
-    <w:p>
-      <w:pPr>
-        <w:keepNext/>
-      </w:pPr>
-      <w:r>
-        <w:rPr>
-          <w:lang w:val="en-US"/>
-        </w:rPr>
+          <w:lang w:val="en-US"/>
+        </w:rPr>
+        <w:lastRenderedPageBreak/>
         <w:drawing>
           <wp:inline distT="0" distB="0" distL="0" distR="0" wp14:anchorId="74047ACF" wp14:editId="24326E96">
             <wp:extent cx="5731510" cy="2133600"/>
@@ -9216,7 +9574,7 @@
                     <pic:cNvPicPr/>
                   </pic:nvPicPr>
                   <pic:blipFill>
-                    <a:blip r:embed="rId37"/>
+                    <a:blip r:embed="rId43"/>
                     <a:stretch>
                       <a:fillRect/>
                     </a:stretch>
@@ -9248,58 +9606,26 @@
       <w:r>
         <w:t xml:space="preserve">Figure </w:t>
       </w:r>
-      <w:r>
-        <w:fldChar w:fldCharType="begin"/>
-      </w:r>
-      <w:r>
-        <w:instrText xml:space="preserve"> SEQ Figure \* ARABIC </w:instrText>
-      </w:r>
-      <w:r>
-        <w:fldChar w:fldCharType="separate"/>
-      </w:r>
-      <w:r>
-        <w:rPr>
-          <w:noProof/>
-        </w:rPr>
-        <w:t>27</w:t>
-      </w:r>
-      <w:r>
-        <w:fldChar w:fldCharType="end"/>
-      </w:r>
-      <w:r>
-        <w:rPr>
-          <w:lang w:val="en-US"/>
-        </w:rPr>
-        <w:t xml:space="preserve"> how </w:t>
-      </w:r>
-      <w:proofErr w:type="spellStart"/>
-      <w:r>
-        <w:rPr>
-          <w:lang w:val="en-US"/>
-        </w:rPr>
-        <w:t>i</w:t>
-      </w:r>
-      <w:proofErr w:type="spellEnd"/>
-      <w:r>
-        <w:rPr>
-          <w:lang w:val="en-US"/>
-        </w:rPr>
-        <w:t xml:space="preserve"> lose my returns</w:t>
-      </w:r>
-      <w:r>
-        <w:rPr>
-          <w:lang w:val="en-US"/>
-        </w:rPr>
-        <w:t xml:space="preserve"> with severe </w:t>
-      </w:r>
-      <w:proofErr w:type="spellStart"/>
-      <w:r>
-        <w:rPr>
-          <w:lang w:val="en-US"/>
-        </w:rPr>
-        <w:t>whispays</w:t>
-      </w:r>
-      <w:proofErr w:type="spellEnd"/>
+      <w:fldSimple w:instr=" SEQ Figure \* ARABIC ">
+        <w:r>
+          <w:rPr>
+            <w:noProof/>
+          </w:rPr>
+          <w:t>27</w:t>
+        </w:r>
+      </w:fldSimple>
+      <w:r>
+        <w:rPr>
+          <w:lang w:val="en-US"/>
+        </w:rPr>
+        <w:t xml:space="preserve"> how i lose my returns</w:t>
+      </w:r>
+      <w:r>
+        <w:rPr>
+          <w:lang w:val="en-US"/>
+        </w:rPr>
+        <w:t xml:space="preserve"> with severe whispays</w:t>
+      </w:r>
     </w:p>
     <w:p>
       <w:pPr>
@@ -9349,6 +9675,7 @@
       <w:r>
         <w:rPr>
           <w:rFonts w:ascii="Arial" w:eastAsiaTheme="majorEastAsia" w:hAnsi="Arial" w:cs="Arial"/>
+          <w:noProof/>
           <w:color w:val="70AD47" w:themeColor="accent6"/>
           <w:sz w:val="22"/>
           <w:szCs w:val="22"/>
@@ -9370,7 +9697,7 @@
                     <pic:cNvPicPr/>
                   </pic:nvPicPr>
                   <pic:blipFill>
-                    <a:blip r:embed="rId38"/>
+                    <a:blip r:embed="rId44"/>
                     <a:stretch>
                       <a:fillRect/>
                     </a:stretch>
@@ -9406,24 +9733,14 @@
       <w:r>
         <w:t xml:space="preserve">Figure </w:t>
       </w:r>
-      <w:r>
-        <w:fldChar w:fldCharType="begin"/>
-      </w:r>
-      <w:r>
-        <w:instrText xml:space="preserve"> SEQ Figure \* ARABIC </w:instrText>
-      </w:r>
-      <w:r>
-        <w:fldChar w:fldCharType="separate"/>
-      </w:r>
-      <w:r>
-        <w:rPr>
-          <w:noProof/>
-        </w:rPr>
-        <w:t>28</w:t>
-      </w:r>
-      <w:r>
-        <w:fldChar w:fldCharType="end"/>
-      </w:r>
+      <w:fldSimple w:instr=" SEQ Figure \* ARABIC ">
+        <w:r>
+          <w:rPr>
+            <w:noProof/>
+          </w:rPr>
+          <w:t>28</w:t>
+        </w:r>
+      </w:fldSimple>
       <w:r>
         <w:rPr>
           <w:lang w:val="en-US"/>
@@ -9548,7 +9865,6 @@
           <w:szCs w:val="22"/>
           <w:lang w:val="en-US"/>
         </w:rPr>
-        <w:lastRenderedPageBreak/>
         <w:drawing>
           <wp:inline distT="0" distB="0" distL="0" distR="0" wp14:anchorId="45086658" wp14:editId="0FF7277F">
             <wp:extent cx="5731510" cy="2664786"/>
@@ -9567,7 +9883,7 @@
                     </pic:cNvPicPr>
                   </pic:nvPicPr>
                   <pic:blipFill>
-                    <a:blip r:embed="rId39">
+                    <a:blip r:embed="rId45">
                       <a:extLst>
                         <a:ext uri="{28A0092B-C50C-407E-A947-70E740481C1C}">
                           <a14:useLocalDpi xmlns:a14="http://schemas.microsoft.com/office/drawing/2010/main" val="0"/>
@@ -9614,43 +9930,27 @@
       <w:r>
         <w:t xml:space="preserve">Figure </w:t>
       </w:r>
-      <w:r>
-        <w:fldChar w:fldCharType="begin"/>
-      </w:r>
-      <w:r>
-        <w:instrText xml:space="preserve"> SEQ Figure \* ARABIC </w:instrText>
-      </w:r>
-      <w:r>
-        <w:fldChar w:fldCharType="separate"/>
-      </w:r>
-      <w:r>
-        <w:rPr>
-          <w:noProof/>
-        </w:rPr>
-        <w:t>29</w:t>
-      </w:r>
-      <w:r>
-        <w:fldChar w:fldCharType="end"/>
-      </w:r>
-      <w:r>
-        <w:rPr>
-          <w:lang w:val="en-US"/>
-        </w:rPr>
+      <w:fldSimple w:instr=" SEQ Figure \* ARABIC ">
+        <w:r>
+          <w:rPr>
+            <w:noProof/>
+          </w:rPr>
+          <w:t>29</w:t>
+        </w:r>
+      </w:fldSimple>
+      <w:r>
+        <w:rPr>
+          <w:lang w:val="en-US"/>
+        </w:rPr>
+        <w:t xml:space="preserve"> H1 60% reject with previous year</w:t>
+      </w:r>
+      <w:r>
         <w:t xml:space="preserve"> </w:t>
       </w:r>
       <w:r>
         <w:rPr>
           <w:lang w:val="en-US"/>
         </w:rPr>
-        <w:t>H1 60% reject with previous year</w:t>
-      </w:r>
-      <w:r>
-        <w:t xml:space="preserve"> </w:t>
-      </w:r>
-      <w:r>
-        <w:rPr>
-          <w:lang w:val="en-US"/>
-        </w:rPr>
         <w:t>EXCURSION</w:t>
       </w:r>
     </w:p>
@@ -9678,6 +9978,7 @@
           <w:szCs w:val="22"/>
           <w:lang w:val="en-US"/>
         </w:rPr>
+        <w:lastRenderedPageBreak/>
         <w:t>Python correlations</w:t>
       </w:r>
     </w:p>
@@ -9725,7 +10026,7 @@
                     </pic:cNvPicPr>
                   </pic:nvPicPr>
                   <pic:blipFill>
-                    <a:blip r:embed="rId40" cstate="print">
+                    <a:blip r:embed="rId46" cstate="print">
                       <a:extLst>
                         <a:ext uri="{28A0092B-C50C-407E-A947-70E740481C1C}">
                           <a14:useLocalDpi xmlns:a14="http://schemas.microsoft.com/office/drawing/2010/main" val="0"/>
@@ -9772,24 +10073,14 @@
       <w:r>
         <w:t xml:space="preserve">Figure </w:t>
       </w:r>
-      <w:r>
-        <w:fldChar w:fldCharType="begin"/>
-      </w:r>
-      <w:r>
-        <w:instrText xml:space="preserve"> SEQ Figure \* ARABIC </w:instrText>
-      </w:r>
-      <w:r>
-        <w:fldChar w:fldCharType="separate"/>
-      </w:r>
-      <w:r>
-        <w:rPr>
-          <w:noProof/>
-        </w:rPr>
-        <w:t>30</w:t>
-      </w:r>
-      <w:r>
-        <w:fldChar w:fldCharType="end"/>
-      </w:r>
+      <w:fldSimple w:instr=" SEQ Figure \* ARABIC ">
+        <w:r>
+          <w:rPr>
+            <w:noProof/>
+          </w:rPr>
+          <w:t>30</w:t>
+        </w:r>
+      </w:fldSimple>
       <w:r>
         <w:t>H1 60% REJECT WITH PREVIOUS YE</w:t>
       </w:r>
@@ -9871,7 +10162,6 @@
           <w:szCs w:val="22"/>
           <w:lang w:val="en-US"/>
         </w:rPr>
-        <w:lastRenderedPageBreak/>
         <w:drawing>
           <wp:inline distT="0" distB="0" distL="0" distR="0" wp14:anchorId="23F53B86" wp14:editId="3672A916">
             <wp:extent cx="4585855" cy="3440635"/>
@@ -9890,7 +10180,7 @@
                     </pic:cNvPicPr>
                   </pic:nvPicPr>
                   <pic:blipFill>
-                    <a:blip r:embed="rId41">
+                    <a:blip r:embed="rId47">
                       <a:extLst>
                         <a:ext uri="{28A0092B-C50C-407E-A947-70E740481C1C}">
                           <a14:useLocalDpi xmlns:a14="http://schemas.microsoft.com/office/drawing/2010/main" val="0"/>
@@ -9929,7 +10219,7 @@
           <w:lang w:val="en-US"/>
         </w:rPr>
       </w:pPr>
-      <w:bookmarkStart w:id="2" w:name="_Ref118322397"/>
+      <w:bookmarkStart w:id="3" w:name="_Ref118322397"/>
       <w:r>
         <w:tab/>
       </w:r>
@@ -9937,79 +10227,69 @@
         <w:tab/>
         <w:t xml:space="preserve">Figure </w:t>
       </w:r>
-      <w:r>
+      <w:fldSimple w:instr=" SEQ Figure \* ARABIC ">
+        <w:r>
+          <w:rPr>
+            <w:noProof/>
+          </w:rPr>
+          <w:t>31</w:t>
+        </w:r>
+      </w:fldSimple>
+      <w:bookmarkEnd w:id="3"/>
+      <w:r>
+        <w:rPr>
+          <w:lang w:val="en-US"/>
+        </w:rPr>
+        <w:t xml:space="preserve"> </w:t>
+      </w:r>
+      <w:bookmarkStart w:id="4" w:name="_Ref118322392"/>
+      <w:r>
+        <w:rPr>
+          <w:lang w:val="en-US"/>
+        </w:rPr>
+        <w:t xml:space="preserve">: </w:t>
+      </w:r>
+      <w:r>
+        <w:rPr>
+          <w:lang w:val="en-US"/>
+        </w:rPr>
+        <w:t>H1 60% reject with previous year</w:t>
+      </w:r>
+      <w:r>
+        <w:rPr>
+          <w:lang w:val="en-US"/>
+        </w:rPr>
+        <w:t xml:space="preserve">  </w:t>
+      </w:r>
+      <w:r>
+        <w:rPr>
+          <w:lang w:val="en-US"/>
+        </w:rPr>
+        <w:t xml:space="preserve">Trade durations </w:t>
+      </w:r>
+      <w:r>
+        <w:rPr>
+          <w:lang w:val="en-US"/>
+        </w:rPr>
+        <w:t>comparisons</w:t>
+      </w:r>
+      <w:bookmarkEnd w:id="4"/>
+    </w:p>
+    <w:p>
+      <w:pPr>
+        <w:rPr>
+          <w:rFonts w:ascii="Arial" w:hAnsi="Arial" w:cs="Arial"/>
+          <w:lang w:val="en-US"/>
+        </w:rPr>
+      </w:pPr>
+      <w:r>
+        <w:rPr>
+          <w:rFonts w:ascii="Arial" w:hAnsi="Arial" w:cs="Arial"/>
+          <w:lang w:val="en-US"/>
+        </w:rPr>
         <w:fldChar w:fldCharType="begin"/>
       </w:r>
       <w:r>
-        <w:instrText xml:space="preserve"> SEQ Figure \* ARABIC </w:instrText>
-      </w:r>
-      <w:r>
-        <w:fldChar w:fldCharType="separate"/>
-      </w:r>
-      <w:r>
-        <w:rPr>
-          <w:noProof/>
-        </w:rPr>
-        <w:t>31</w:t>
-      </w:r>
-      <w:r>
-        <w:fldChar w:fldCharType="end"/>
-      </w:r>
-      <w:bookmarkEnd w:id="2"/>
-      <w:r>
-        <w:rPr>
-          <w:lang w:val="en-US"/>
-        </w:rPr>
-        <w:t xml:space="preserve"> </w:t>
-      </w:r>
-      <w:bookmarkStart w:id="3" w:name="_Ref118322392"/>
-      <w:r>
-        <w:rPr>
-          <w:lang w:val="en-US"/>
-        </w:rPr>
-        <w:t xml:space="preserve">: </w:t>
-      </w:r>
-      <w:r>
-        <w:rPr>
-          <w:lang w:val="en-US"/>
-        </w:rPr>
-        <w:t>H1 60% reject with previous year</w:t>
-      </w:r>
-      <w:r>
-        <w:rPr>
-          <w:lang w:val="en-US"/>
-        </w:rPr>
-        <w:t xml:space="preserve">  </w:t>
-      </w:r>
-      <w:r>
-        <w:rPr>
-          <w:lang w:val="en-US"/>
-        </w:rPr>
-        <w:t xml:space="preserve">Trade durations </w:t>
-      </w:r>
-      <w:r>
-        <w:rPr>
-          <w:lang w:val="en-US"/>
-        </w:rPr>
-        <w:t>comparisons</w:t>
-      </w:r>
-      <w:bookmarkEnd w:id="3"/>
-    </w:p>
-    <w:p>
-      <w:pPr>
-        <w:rPr>
-          <w:rFonts w:ascii="Arial" w:hAnsi="Arial" w:cs="Arial"/>
-          <w:lang w:val="en-US"/>
-        </w:rPr>
-      </w:pPr>
-      <w:r>
-        <w:rPr>
-          <w:rFonts w:ascii="Arial" w:hAnsi="Arial" w:cs="Arial"/>
-          <w:lang w:val="en-US"/>
-        </w:rPr>
-        <w:fldChar w:fldCharType="begin"/>
-      </w:r>
-      <w:r>
         <w:rPr>
           <w:rFonts w:ascii="Arial" w:hAnsi="Arial" w:cs="Arial"/>
           <w:lang w:val="en-US"/>
@@ -10021,13 +10301,13 @@
           <w:rFonts w:ascii="Arial" w:hAnsi="Arial" w:cs="Arial"/>
           <w:lang w:val="en-US"/>
         </w:rPr>
-      </w:r>
-      <w:r>
-        <w:rPr>
-          <w:rFonts w:ascii="Arial" w:hAnsi="Arial" w:cs="Arial"/>
-          <w:lang w:val="en-US"/>
-        </w:rPr>
         <w:instrText xml:space="preserve"> \* MERGEFORMAT </w:instrText>
+      </w:r>
+      <w:r>
+        <w:rPr>
+          <w:rFonts w:ascii="Arial" w:hAnsi="Arial" w:cs="Arial"/>
+          <w:lang w:val="en-US"/>
+        </w:rPr>
       </w:r>
       <w:r>
         <w:rPr>
@@ -10185,7 +10465,7 @@
                     <pic:cNvPicPr/>
                   </pic:nvPicPr>
                   <pic:blipFill>
-                    <a:blip r:embed="rId42"/>
+                    <a:blip r:embed="rId48"/>
                     <a:stretch>
                       <a:fillRect/>
                     </a:stretch>
@@ -10221,24 +10501,14 @@
       <w:r>
         <w:t xml:space="preserve">Figure </w:t>
       </w:r>
-      <w:r>
-        <w:fldChar w:fldCharType="begin"/>
-      </w:r>
-      <w:r>
-        <w:instrText xml:space="preserve"> SEQ Figure \* ARABIC </w:instrText>
-      </w:r>
-      <w:r>
-        <w:fldChar w:fldCharType="separate"/>
-      </w:r>
-      <w:r>
-        <w:rPr>
-          <w:noProof/>
-        </w:rPr>
-        <w:t>32</w:t>
-      </w:r>
-      <w:r>
-        <w:fldChar w:fldCharType="end"/>
-      </w:r>
+      <w:fldSimple w:instr=" SEQ Figure \* ARABIC ">
+        <w:r>
+          <w:rPr>
+            <w:noProof/>
+          </w:rPr>
+          <w:t>32</w:t>
+        </w:r>
+      </w:fldSimple>
       <w:r>
         <w:t>MQL5 RETURNS : H</w:t>
       </w:r>
@@ -10462,29 +10732,7 @@
                 <w:szCs w:val="16"/>
                 <w:lang w:val="en-US"/>
               </w:rPr>
-              <w:t>Correlation (</w:t>
-            </w:r>
-            <w:proofErr w:type="spellStart"/>
-            <w:r>
-              <w:rPr>
-                <w:rFonts w:ascii="Tahoma" w:eastAsia="Times New Roman" w:hAnsi="Tahoma" w:cs="Tahoma"/>
-                <w:color w:val="000000"/>
-                <w:sz w:val="16"/>
-                <w:szCs w:val="16"/>
-                <w:lang w:val="en-US"/>
-              </w:rPr>
-              <w:t>Profits,MFE</w:t>
-            </w:r>
-            <w:proofErr w:type="spellEnd"/>
-            <w:r>
-              <w:rPr>
-                <w:rFonts w:ascii="Tahoma" w:eastAsia="Times New Roman" w:hAnsi="Tahoma" w:cs="Tahoma"/>
-                <w:color w:val="000000"/>
-                <w:sz w:val="16"/>
-                <w:szCs w:val="16"/>
-                <w:lang w:val="en-US"/>
-              </w:rPr>
-              <w:t>):</w:t>
+              <w:t>Correlation (Profits,MFE):</w:t>
             </w:r>
           </w:p>
         </w:tc>
@@ -10548,29 +10796,7 @@
                 <w:szCs w:val="16"/>
                 <w:lang w:val="en-US"/>
               </w:rPr>
-              <w:t>Correlation (</w:t>
-            </w:r>
-            <w:proofErr w:type="spellStart"/>
-            <w:r>
-              <w:rPr>
-                <w:rFonts w:ascii="Tahoma" w:eastAsia="Times New Roman" w:hAnsi="Tahoma" w:cs="Tahoma"/>
-                <w:color w:val="000000"/>
-                <w:sz w:val="16"/>
-                <w:szCs w:val="16"/>
-                <w:lang w:val="en-US"/>
-              </w:rPr>
-              <w:t>Profits,MAE</w:t>
-            </w:r>
-            <w:proofErr w:type="spellEnd"/>
-            <w:r>
-              <w:rPr>
-                <w:rFonts w:ascii="Tahoma" w:eastAsia="Times New Roman" w:hAnsi="Tahoma" w:cs="Tahoma"/>
-                <w:color w:val="000000"/>
-                <w:sz w:val="16"/>
-                <w:szCs w:val="16"/>
-                <w:lang w:val="en-US"/>
-              </w:rPr>
-              <w:t>):</w:t>
+              <w:t>Correlation (Profits,MAE):</w:t>
             </w:r>
           </w:p>
         </w:tc>
@@ -10721,7 +10947,7 @@
                     </pic:cNvPicPr>
                   </pic:nvPicPr>
                   <pic:blipFill>
-                    <a:blip r:embed="rId43">
+                    <a:blip r:embed="rId49">
                       <a:extLst>
                         <a:ext uri="{28A0092B-C50C-407E-A947-70E740481C1C}">
                           <a14:useLocalDpi xmlns:a14="http://schemas.microsoft.com/office/drawing/2010/main" val="0"/>
@@ -10768,24 +10994,14 @@
       <w:r>
         <w:t xml:space="preserve">Figure </w:t>
       </w:r>
-      <w:r>
-        <w:fldChar w:fldCharType="begin"/>
-      </w:r>
-      <w:r>
-        <w:instrText xml:space="preserve"> SEQ Figure \* ARABIC </w:instrText>
-      </w:r>
-      <w:r>
-        <w:fldChar w:fldCharType="separate"/>
-      </w:r>
-      <w:r>
-        <w:rPr>
-          <w:noProof/>
-        </w:rPr>
-        <w:t>33</w:t>
-      </w:r>
-      <w:r>
-        <w:fldChar w:fldCharType="end"/>
-      </w:r>
+      <w:fldSimple w:instr=" SEQ Figure \* ARABIC ">
+        <w:r>
+          <w:rPr>
+            <w:noProof/>
+          </w:rPr>
+          <w:t>33</w:t>
+        </w:r>
+      </w:fldSimple>
       <w:r>
         <w:t xml:space="preserve">MQL5 </w:t>
       </w:r>
@@ -10841,6 +11057,7 @@
           <w:szCs w:val="22"/>
           <w:lang w:val="en-US"/>
         </w:rPr>
+        <w:lastRenderedPageBreak/>
         <w:drawing>
           <wp:inline distT="0" distB="0" distL="0" distR="0" wp14:anchorId="43A3C109" wp14:editId="01859E1A">
             <wp:extent cx="5731510" cy="2813528"/>
@@ -10859,7 +11076,7 @@
                     </pic:cNvPicPr>
                   </pic:nvPicPr>
                   <pic:blipFill>
-                    <a:blip r:embed="rId44" cstate="print">
+                    <a:blip r:embed="rId50" cstate="print">
                       <a:extLst>
                         <a:ext uri="{28A0092B-C50C-407E-A947-70E740481C1C}">
                           <a14:useLocalDpi xmlns:a14="http://schemas.microsoft.com/office/drawing/2010/main" val="0"/>
@@ -10906,24 +11123,14 @@
       <w:r>
         <w:t xml:space="preserve">Figure </w:t>
       </w:r>
-      <w:r>
-        <w:fldChar w:fldCharType="begin"/>
-      </w:r>
-      <w:r>
-        <w:instrText xml:space="preserve"> SEQ Figure \* ARABIC </w:instrText>
-      </w:r>
-      <w:r>
-        <w:fldChar w:fldCharType="separate"/>
-      </w:r>
-      <w:r>
-        <w:rPr>
-          <w:noProof/>
-        </w:rPr>
-        <w:t>34</w:t>
-      </w:r>
-      <w:r>
-        <w:fldChar w:fldCharType="end"/>
-      </w:r>
+      <w:fldSimple w:instr=" SEQ Figure \* ARABIC ">
+        <w:r>
+          <w:rPr>
+            <w:noProof/>
+          </w:rPr>
+          <w:t>34</w:t>
+        </w:r>
+      </w:fldSimple>
       <w:r>
         <w:t xml:space="preserve"> H4 60% REJECT WITH PREVIOUS YEAR</w:t>
       </w:r>
@@ -11003,7 +11210,6 @@
           <w:szCs w:val="22"/>
           <w:lang w:val="en-US"/>
         </w:rPr>
-        <w:lastRenderedPageBreak/>
         <w:drawing>
           <wp:inline distT="0" distB="0" distL="0" distR="0" wp14:anchorId="663D2A22" wp14:editId="057D76F0">
             <wp:extent cx="4350327" cy="3263925"/>
@@ -11022,7 +11228,7 @@
                     </pic:cNvPicPr>
                   </pic:nvPicPr>
                   <pic:blipFill>
-                    <a:blip r:embed="rId45">
+                    <a:blip r:embed="rId51">
                       <a:extLst>
                         <a:ext uri="{28A0092B-C50C-407E-A947-70E740481C1C}">
                           <a14:useLocalDpi xmlns:a14="http://schemas.microsoft.com/office/drawing/2010/main" val="0"/>
@@ -11072,24 +11278,14 @@
         <w:tab/>
         <w:t xml:space="preserve">Figure </w:t>
       </w:r>
-      <w:r>
-        <w:fldChar w:fldCharType="begin"/>
-      </w:r>
-      <w:r>
-        <w:instrText xml:space="preserve"> SEQ Figure \* ARABIC </w:instrText>
-      </w:r>
-      <w:r>
-        <w:fldChar w:fldCharType="separate"/>
-      </w:r>
-      <w:r>
-        <w:rPr>
-          <w:noProof/>
-        </w:rPr>
-        <w:t>35</w:t>
-      </w:r>
-      <w:r>
-        <w:fldChar w:fldCharType="end"/>
-      </w:r>
+      <w:fldSimple w:instr=" SEQ Figure \* ARABIC ">
+        <w:r>
+          <w:rPr>
+            <w:noProof/>
+          </w:rPr>
+          <w:t>35</w:t>
+        </w:r>
+      </w:fldSimple>
       <w:r>
         <w:rPr>
           <w:lang w:val="en-US"/>
@@ -11112,13 +11308,7 @@
         <w:rPr>
           <w:lang w:val="en-US"/>
         </w:rPr>
-        <w:t xml:space="preserve"> </w:t>
-      </w:r>
-      <w:r>
-        <w:rPr>
-          <w:lang w:val="en-US"/>
-        </w:rPr>
-        <w:t xml:space="preserve">Trade durations </w:t>
+        <w:t xml:space="preserve"> Trade durations </w:t>
       </w:r>
       <w:r>
         <w:rPr>
@@ -11188,8 +11378,10 @@
       </w:pPr>
       <w:r>
         <w:rPr>
-          <w:lang w:val="en-US"/>
-        </w:rPr>
+          <w:noProof/>
+          <w:lang w:val="en-US"/>
+        </w:rPr>
+        <w:lastRenderedPageBreak/>
         <w:drawing>
           <wp:inline distT="0" distB="0" distL="0" distR="0" wp14:anchorId="6903512F" wp14:editId="3F4E773A">
             <wp:extent cx="4808637" cy="2484335"/>
@@ -11206,7 +11398,7 @@
                     <pic:cNvPicPr/>
                   </pic:nvPicPr>
                   <pic:blipFill>
-                    <a:blip r:embed="rId46"/>
+                    <a:blip r:embed="rId52"/>
                     <a:stretch>
                       <a:fillRect/>
                     </a:stretch>
@@ -11238,52 +11430,20 @@
       <w:r>
         <w:t xml:space="preserve">Figure </w:t>
       </w:r>
-      <w:r>
-        <w:fldChar w:fldCharType="begin"/>
-      </w:r>
-      <w:r>
-        <w:instrText xml:space="preserve"> SEQ Figure \* ARABIC </w:instrText>
-      </w:r>
-      <w:r>
-        <w:fldChar w:fldCharType="separate"/>
-      </w:r>
-      <w:r>
-        <w:rPr>
-          <w:noProof/>
-        </w:rPr>
-        <w:t>36</w:t>
-      </w:r>
-      <w:r>
-        <w:fldChar w:fldCharType="end"/>
-      </w:r>
+      <w:fldSimple w:instr=" SEQ Figure \* ARABIC ">
+        <w:r>
+          <w:rPr>
+            <w:noProof/>
+          </w:rPr>
+          <w:t>36</w:t>
+        </w:r>
+      </w:fldSimple>
       <w:r>
         <w:rPr>
           <w:lang w:val="fr-BE"/>
         </w:rPr>
-        <w:t xml:space="preserve"> </w:t>
-      </w:r>
-      <w:proofErr w:type="spellStart"/>
-      <w:r>
-        <w:rPr>
-          <w:lang w:val="fr-BE"/>
-        </w:rPr>
-        <w:t>Unforgivable</w:t>
-      </w:r>
-      <w:proofErr w:type="spellEnd"/>
-      <w:r>
-        <w:rPr>
-          <w:lang w:val="fr-BE"/>
-        </w:rPr>
-        <w:t xml:space="preserve"> </w:t>
-      </w:r>
-      <w:proofErr w:type="spellStart"/>
-      <w:r>
-        <w:rPr>
-          <w:lang w:val="fr-BE"/>
-        </w:rPr>
-        <w:t>Loss</w:t>
-      </w:r>
-      <w:proofErr w:type="spellEnd"/>
+        <w:t xml:space="preserve"> Unforgivable Loss</w:t>
+      </w:r>
     </w:p>
     <w:p>
       <w:pPr>
@@ -11337,7 +11497,7 @@
                     <pic:cNvPicPr/>
                   </pic:nvPicPr>
                   <pic:blipFill>
-                    <a:blip r:embed="rId47"/>
+                    <a:blip r:embed="rId53"/>
                     <a:stretch>
                       <a:fillRect/>
                     </a:stretch>
@@ -11369,24 +11529,14 @@
       <w:r>
         <w:t xml:space="preserve">Figure </w:t>
       </w:r>
-      <w:r>
-        <w:fldChar w:fldCharType="begin"/>
-      </w:r>
-      <w:r>
-        <w:instrText xml:space="preserve"> SEQ Figure \* ARABIC </w:instrText>
-      </w:r>
-      <w:r>
-        <w:fldChar w:fldCharType="separate"/>
-      </w:r>
-      <w:r>
-        <w:rPr>
-          <w:noProof/>
-        </w:rPr>
-        <w:t>37</w:t>
-      </w:r>
-      <w:r>
-        <w:fldChar w:fldCharType="end"/>
-      </w:r>
+      <w:fldSimple w:instr=" SEQ Figure \* ARABIC ">
+        <w:r>
+          <w:rPr>
+            <w:noProof/>
+          </w:rPr>
+          <w:t>37</w:t>
+        </w:r>
+      </w:fldSimple>
       <w:r>
         <w:t xml:space="preserve">MQL5 RETURNS : </w:t>
       </w:r>
@@ -11424,7 +11574,6 @@
           <w:szCs w:val="22"/>
           <w:lang w:val="en-US"/>
         </w:rPr>
-        <w:lastRenderedPageBreak/>
         <w:t>Python returns</w:t>
       </w:r>
     </w:p>
@@ -11506,29 +11655,7 @@
                 <w:szCs w:val="16"/>
                 <w:lang w:val="en-US"/>
               </w:rPr>
-              <w:t>Correlation (</w:t>
-            </w:r>
-            <w:proofErr w:type="spellStart"/>
-            <w:r>
-              <w:rPr>
-                <w:rFonts w:ascii="Tahoma" w:eastAsia="Times New Roman" w:hAnsi="Tahoma" w:cs="Tahoma"/>
-                <w:color w:val="000000"/>
-                <w:sz w:val="16"/>
-                <w:szCs w:val="16"/>
-                <w:lang w:val="en-US"/>
-              </w:rPr>
-              <w:t>Profits,MFE</w:t>
-            </w:r>
-            <w:proofErr w:type="spellEnd"/>
-            <w:r>
-              <w:rPr>
-                <w:rFonts w:ascii="Tahoma" w:eastAsia="Times New Roman" w:hAnsi="Tahoma" w:cs="Tahoma"/>
-                <w:color w:val="000000"/>
-                <w:sz w:val="16"/>
-                <w:szCs w:val="16"/>
-                <w:lang w:val="en-US"/>
-              </w:rPr>
-              <w:t>):</w:t>
+              <w:t>Correlation (Profits,MFE):</w:t>
             </w:r>
           </w:p>
         </w:tc>
@@ -11592,29 +11719,7 @@
                 <w:szCs w:val="16"/>
                 <w:lang w:val="en-US"/>
               </w:rPr>
-              <w:t>Correlation (</w:t>
-            </w:r>
-            <w:proofErr w:type="spellStart"/>
-            <w:r>
-              <w:rPr>
-                <w:rFonts w:ascii="Tahoma" w:eastAsia="Times New Roman" w:hAnsi="Tahoma" w:cs="Tahoma"/>
-                <w:color w:val="000000"/>
-                <w:sz w:val="16"/>
-                <w:szCs w:val="16"/>
-                <w:lang w:val="en-US"/>
-              </w:rPr>
-              <w:t>Profits,MAE</w:t>
-            </w:r>
-            <w:proofErr w:type="spellEnd"/>
-            <w:r>
-              <w:rPr>
-                <w:rFonts w:ascii="Tahoma" w:eastAsia="Times New Roman" w:hAnsi="Tahoma" w:cs="Tahoma"/>
-                <w:color w:val="000000"/>
-                <w:sz w:val="16"/>
-                <w:szCs w:val="16"/>
-                <w:lang w:val="en-US"/>
-              </w:rPr>
-              <w:t>):</w:t>
+              <w:t>Correlation (Profits,MAE):</w:t>
             </w:r>
           </w:p>
         </w:tc>
@@ -11763,7 +11868,7 @@
                     </pic:cNvPicPr>
                   </pic:nvPicPr>
                   <pic:blipFill>
-                    <a:blip r:embed="rId48">
+                    <a:blip r:embed="rId54">
                       <a:extLst>
                         <a:ext uri="{28A0092B-C50C-407E-A947-70E740481C1C}">
                           <a14:useLocalDpi xmlns:a14="http://schemas.microsoft.com/office/drawing/2010/main" val="0"/>
@@ -11810,24 +11915,14 @@
       <w:r>
         <w:t xml:space="preserve">Figure </w:t>
       </w:r>
-      <w:r>
-        <w:fldChar w:fldCharType="begin"/>
-      </w:r>
-      <w:r>
-        <w:instrText xml:space="preserve"> SEQ Figure \* ARABIC </w:instrText>
-      </w:r>
-      <w:r>
-        <w:fldChar w:fldCharType="separate"/>
-      </w:r>
-      <w:r>
-        <w:rPr>
-          <w:noProof/>
-        </w:rPr>
-        <w:t>38</w:t>
-      </w:r>
-      <w:r>
-        <w:fldChar w:fldCharType="end"/>
-      </w:r>
+      <w:fldSimple w:instr=" SEQ Figure \* ARABIC ">
+        <w:r>
+          <w:rPr>
+            <w:noProof/>
+          </w:rPr>
+          <w:t>38</w:t>
+        </w:r>
+      </w:fldSimple>
       <w:r>
         <w:t xml:space="preserve">EXCURSIONS : </w:t>
       </w:r>
@@ -11919,6 +12014,7 @@
           <w:szCs w:val="22"/>
           <w:lang w:val="en-US"/>
         </w:rPr>
+        <w:lastRenderedPageBreak/>
         <w:t>Python trade duration</w:t>
       </w:r>
     </w:p>
@@ -11961,7 +12057,7 @@
                     </pic:cNvPicPr>
                   </pic:nvPicPr>
                   <pic:blipFill>
-                    <a:blip r:embed="rId49">
+                    <a:blip r:embed="rId55">
                       <a:extLst>
                         <a:ext uri="{28A0092B-C50C-407E-A947-70E740481C1C}">
                           <a14:useLocalDpi xmlns:a14="http://schemas.microsoft.com/office/drawing/2010/main" val="0"/>
@@ -12048,24 +12144,8 @@
         <w:rPr>
           <w:lang w:val="en-US"/>
         </w:rPr>
-        <w:lastRenderedPageBreak/>
-        <w:t xml:space="preserve">30 </w:t>
-      </w:r>
-      <w:proofErr w:type="spellStart"/>
-      <w:r>
-        <w:rPr>
-          <w:lang w:val="en-US"/>
-        </w:rPr>
-        <w:t>procent</w:t>
-      </w:r>
-      <w:proofErr w:type="spellEnd"/>
-      <w:r>
-        <w:rPr>
-          <w:lang w:val="en-US"/>
-        </w:rPr>
-        <w:t xml:space="preserve"> </w:t>
-      </w:r>
-      <w:proofErr w:type="spellStart"/>
+        <w:t xml:space="preserve">30 procent </w:t>
+      </w:r>
       <w:r>
         <w:rPr>
           <w:lang w:val="en-US"/>
@@ -12076,14 +12156,7 @@
         <w:rPr>
           <w:lang w:val="en-US"/>
         </w:rPr>
-        <w:t>cumulative</w:t>
-      </w:r>
-      <w:proofErr w:type="spellEnd"/>
-      <w:r>
-        <w:rPr>
-          <w:lang w:val="en-US"/>
-        </w:rPr>
-        <w:t xml:space="preserve"> with</w:t>
+        <w:t>cumulative with</w:t>
       </w:r>
       <w:r>
         <w:rPr>
@@ -12365,19 +12438,7 @@
           <w:szCs w:val="22"/>
           <w:lang w:val="en-US"/>
         </w:rPr>
-        <w:t>Python trad</w:t>
-      </w:r>
-      <w:bookmarkStart w:id="4" w:name="_GoBack"/>
-      <w:bookmarkEnd w:id="4"/>
-      <w:r>
-        <w:rPr>
-          <w:rFonts w:ascii="Arial" w:eastAsiaTheme="majorEastAsia" w:hAnsi="Arial" w:cs="Arial"/>
-          <w:color w:val="70AD47" w:themeColor="accent6"/>
-          <w:sz w:val="22"/>
-          <w:szCs w:val="22"/>
-          <w:lang w:val="en-US"/>
-        </w:rPr>
-        <w:t>e duration</w:t>
+        <w:t>Python trade duration</w:t>
       </w:r>
     </w:p>
     <w:p>
@@ -12417,43 +12478,19 @@
       <w:r>
         <w:t xml:space="preserve">Figure </w:t>
       </w:r>
-      <w:r>
-        <w:fldChar w:fldCharType="begin"/>
-      </w:r>
-      <w:r>
-        <w:instrText xml:space="preserve"> SEQ Figure \* ARABIC </w:instrText>
-      </w:r>
-      <w:r>
-        <w:fldChar w:fldCharType="separate"/>
-      </w:r>
-      <w:r>
-        <w:rPr>
-          <w:noProof/>
-        </w:rPr>
-        <w:t>39</w:t>
-      </w:r>
-      <w:r>
-        <w:fldChar w:fldCharType="end"/>
-      </w:r>
-      <w:r>
-        <w:rPr>
-          <w:lang w:val="en-US"/>
-        </w:rPr>
-        <w:t xml:space="preserve">Still too many </w:t>
-      </w:r>
-      <w:proofErr w:type="spellStart"/>
-      <w:r>
-        <w:rPr>
-          <w:lang w:val="en-US"/>
-        </w:rPr>
-        <w:t>whispays</w:t>
-      </w:r>
-      <w:proofErr w:type="spellEnd"/>
-      <w:r>
-        <w:rPr>
-          <w:lang w:val="en-US"/>
-        </w:rPr>
-        <w:t xml:space="preserve"> for any profitability</w:t>
+      <w:fldSimple w:instr=" SEQ Figure \* ARABIC ">
+        <w:r>
+          <w:rPr>
+            <w:noProof/>
+          </w:rPr>
+          <w:t>39</w:t>
+        </w:r>
+      </w:fldSimple>
+      <w:r>
+        <w:rPr>
+          <w:lang w:val="en-US"/>
+        </w:rPr>
+        <w:t>Still too many whispays for any profitability</w:t>
       </w:r>
     </w:p>
     <w:p>
@@ -12504,24 +12541,14 @@
       <w:r>
         <w:t xml:space="preserve">Figure </w:t>
       </w:r>
-      <w:r>
-        <w:fldChar w:fldCharType="begin"/>
-      </w:r>
-      <w:r>
-        <w:instrText xml:space="preserve"> SEQ Figure \* ARABIC </w:instrText>
-      </w:r>
-      <w:r>
-        <w:fldChar w:fldCharType="separate"/>
-      </w:r>
-      <w:r>
-        <w:rPr>
-          <w:noProof/>
-        </w:rPr>
-        <w:t>40</w:t>
-      </w:r>
-      <w:r>
-        <w:fldChar w:fldCharType="end"/>
-      </w:r>
+      <w:fldSimple w:instr=" SEQ Figure \* ARABIC ">
+        <w:r>
+          <w:rPr>
+            <w:noProof/>
+          </w:rPr>
+          <w:t>40</w:t>
+        </w:r>
+      </w:fldSimple>
       <w:r>
         <w:rPr>
           <w:lang w:val="en-US"/>
@@ -12532,42 +12559,14 @@
         <w:rPr>
           <w:lang w:val="en-US"/>
         </w:rPr>
-        <w:t xml:space="preserve">30 </w:t>
-      </w:r>
-      <w:proofErr w:type="spellStart"/>
-      <w:r>
-        <w:rPr>
-          <w:lang w:val="en-US"/>
-        </w:rPr>
-        <w:t>procent</w:t>
-      </w:r>
-      <w:proofErr w:type="spellEnd"/>
+        <w:t>30 procent non cumulative without SL/TP</w:t>
+      </w:r>
       <w:r>
         <w:rPr>
           <w:lang w:val="en-US"/>
         </w:rPr>
         <w:t xml:space="preserve"> </w:t>
       </w:r>
-      <w:proofErr w:type="spellStart"/>
-      <w:r>
-        <w:rPr>
-          <w:lang w:val="en-US"/>
-        </w:rPr>
-        <w:t>non cumulative</w:t>
-      </w:r>
-      <w:proofErr w:type="spellEnd"/>
-      <w:r>
-        <w:rPr>
-          <w:lang w:val="en-US"/>
-        </w:rPr>
-        <w:t xml:space="preserve"> without SL/TP</w:t>
-      </w:r>
-      <w:r>
-        <w:rPr>
-          <w:lang w:val="en-US"/>
-        </w:rPr>
-        <w:t xml:space="preserve"> </w:t>
-      </w:r>
       <w:r>
         <w:rPr>
           <w:lang w:val="en-US"/>
@@ -12599,6 +12598,7 @@
           <w:szCs w:val="22"/>
           <w:lang w:val="en-US"/>
         </w:rPr>
+        <w:lastRenderedPageBreak/>
         <w:t>Python returns</w:t>
       </w:r>
     </w:p>
@@ -12650,24 +12650,14 @@
       <w:r>
         <w:t xml:space="preserve">Figure </w:t>
       </w:r>
-      <w:r>
-        <w:fldChar w:fldCharType="begin"/>
-      </w:r>
-      <w:r>
-        <w:instrText xml:space="preserve"> SEQ Figure \* ARABIC </w:instrText>
-      </w:r>
-      <w:r>
-        <w:fldChar w:fldCharType="separate"/>
-      </w:r>
-      <w:r>
-        <w:rPr>
-          <w:noProof/>
-        </w:rPr>
-        <w:t>41</w:t>
-      </w:r>
-      <w:r>
-        <w:fldChar w:fldCharType="end"/>
-      </w:r>
+      <w:fldSimple w:instr=" SEQ Figure \* ARABIC ">
+        <w:r>
+          <w:rPr>
+            <w:noProof/>
+          </w:rPr>
+          <w:t>41</w:t>
+        </w:r>
+      </w:fldSimple>
       <w:r>
         <w:t xml:space="preserve"> </w:t>
       </w:r>
@@ -12809,47 +12799,7 @@
           <w:szCs w:val="22"/>
           <w:lang w:val="en-US"/>
         </w:rPr>
-        <w:t xml:space="preserve">We can see </w:t>
-      </w:r>
-      <w:proofErr w:type="spellStart"/>
-      <w:r>
-        <w:rPr>
-          <w:rFonts w:ascii="Arial" w:eastAsiaTheme="majorEastAsia" w:hAnsi="Arial" w:cs="Arial"/>
-          <w:sz w:val="22"/>
-          <w:szCs w:val="22"/>
-          <w:lang w:val="en-US"/>
-        </w:rPr>
-        <w:t>Brexit</w:t>
-      </w:r>
-      <w:proofErr w:type="spellEnd"/>
-      <w:r>
-        <w:rPr>
-          <w:rFonts w:ascii="Arial" w:eastAsiaTheme="majorEastAsia" w:hAnsi="Arial" w:cs="Arial"/>
-          <w:sz w:val="22"/>
-          <w:szCs w:val="22"/>
-          <w:lang w:val="en-US"/>
-        </w:rPr>
-        <w:t xml:space="preserve"> </w:t>
-      </w:r>
-      <w:proofErr w:type="spellStart"/>
-      <w:r>
-        <w:rPr>
-          <w:rFonts w:ascii="Arial" w:eastAsiaTheme="majorEastAsia" w:hAnsi="Arial" w:cs="Arial"/>
-          <w:sz w:val="22"/>
-          <w:szCs w:val="22"/>
-          <w:lang w:val="en-US"/>
-        </w:rPr>
-        <w:t>positionnning</w:t>
-      </w:r>
-      <w:proofErr w:type="spellEnd"/>
-      <w:r>
-        <w:rPr>
-          <w:rFonts w:ascii="Arial" w:eastAsiaTheme="majorEastAsia" w:hAnsi="Arial" w:cs="Arial"/>
-          <w:sz w:val="22"/>
-          <w:szCs w:val="22"/>
-          <w:lang w:val="en-US"/>
-        </w:rPr>
-        <w:t xml:space="preserve"> plays a huge role </w:t>
+        <w:t xml:space="preserve">We can see Brexit positionnning plays a huge role </w:t>
       </w:r>
       <w:r>
         <w:rPr>
@@ -12880,7 +12830,6 @@
         </w:rPr>
         <w:t xml:space="preserve">Too many </w:t>
       </w:r>
-      <w:proofErr w:type="spellStart"/>
       <w:r>
         <w:rPr>
           <w:rFonts w:ascii="Arial" w:eastAsiaTheme="majorEastAsia" w:hAnsi="Arial" w:cs="Arial"/>
@@ -12889,31 +12838,8 @@
           <w:szCs w:val="22"/>
           <w:lang w:val="en-US"/>
         </w:rPr>
-        <w:t>va</w:t>
-      </w:r>
-      <w:proofErr w:type="spellEnd"/>
-      <w:r>
-        <w:rPr>
-          <w:rFonts w:ascii="Arial" w:eastAsiaTheme="majorEastAsia" w:hAnsi="Arial" w:cs="Arial"/>
-          <w:i/>
-          <w:sz w:val="22"/>
-          <w:szCs w:val="22"/>
-          <w:lang w:val="en-US"/>
-        </w:rPr>
-        <w:t xml:space="preserve"> et </w:t>
-      </w:r>
-      <w:proofErr w:type="spellStart"/>
-      <w:r>
-        <w:rPr>
-          <w:rFonts w:ascii="Arial" w:eastAsiaTheme="majorEastAsia" w:hAnsi="Arial" w:cs="Arial"/>
-          <w:i/>
-          <w:sz w:val="22"/>
-          <w:szCs w:val="22"/>
-          <w:lang w:val="en-US"/>
-        </w:rPr>
-        <w:t>viens</w:t>
-      </w:r>
-      <w:proofErr w:type="spellEnd"/>
+        <w:t>va et viens</w:t>
+      </w:r>
       <w:r>
         <w:rPr>
           <w:rFonts w:ascii="Arial" w:eastAsiaTheme="majorEastAsia" w:hAnsi="Arial" w:cs="Arial"/>
@@ -13276,21 +13202,7 @@
         <w:rPr>
           <w:lang w:val="en-US"/>
         </w:rPr>
-        <w:t xml:space="preserve">30 </w:t>
-      </w:r>
-      <w:proofErr w:type="spellStart"/>
-      <w:r>
-        <w:rPr>
-          <w:lang w:val="en-US"/>
-        </w:rPr>
-        <w:t>procent</w:t>
-      </w:r>
-      <w:proofErr w:type="spellEnd"/>
-      <w:r>
-        <w:rPr>
-          <w:lang w:val="en-US"/>
-        </w:rPr>
-        <w:t xml:space="preserve"> cumulative with SL/no TP</w:t>
+        <w:t>30 procent cumulative with SL/no TP</w:t>
       </w:r>
     </w:p>
     <w:p>
@@ -13339,21 +13251,7 @@
         <w:rPr>
           <w:lang w:val="en-US"/>
         </w:rPr>
-        <w:t xml:space="preserve">30 </w:t>
-      </w:r>
-      <w:proofErr w:type="spellStart"/>
-      <w:r>
-        <w:rPr>
-          <w:lang w:val="en-US"/>
-        </w:rPr>
-        <w:t>procent</w:t>
-      </w:r>
-      <w:proofErr w:type="spellEnd"/>
-      <w:r>
-        <w:rPr>
-          <w:lang w:val="en-US"/>
-        </w:rPr>
-        <w:t xml:space="preserve"> cumulative with SL/wide TP</w:t>
+        <w:t>30 procent cumulative with SL/wide TP</w:t>
       </w:r>
     </w:p>
     <w:p>
@@ -13836,7 +13734,6 @@
           <w:rFonts w:ascii="Arial" w:hAnsi="Arial" w:cs="Arial"/>
           <w:lang w:val="en-US"/>
         </w:rPr>
-        <w:lastRenderedPageBreak/>
         <w:t>D1</w:t>
       </w:r>
     </w:p>
@@ -14178,7 +14075,6 @@
           <w:lang w:val="en-US"/>
         </w:rPr>
       </w:pPr>
-      <w:proofErr w:type="spellStart"/>
       <w:r>
         <w:rPr>
           <w:rFonts w:ascii="Arial" w:hAnsi="Arial" w:cs="Arial"/>
@@ -14186,7 +14082,6 @@
         </w:rPr>
         <w:t>onclusions</w:t>
       </w:r>
-      <w:proofErr w:type="spellEnd"/>
     </w:p>
     <w:p>
       <w:pPr>
@@ -14566,6 +14461,7 @@
         <w:rPr>
           <w:lang w:val="en-US"/>
         </w:rPr>
+        <w:lastRenderedPageBreak/>
         <w:t>Long</w:t>
       </w:r>
     </w:p>
@@ -15267,16 +15163,8 @@
         <w:rPr>
           <w:lang w:val="en-US"/>
         </w:rPr>
-        <w:t xml:space="preserve"> </w:t>
-      </w:r>
-      <w:proofErr w:type="spellStart"/>
-      <w:r>
-        <w:rPr>
-          <w:lang w:val="en-US"/>
-        </w:rPr>
-        <w:t>Misc</w:t>
-      </w:r>
-      <w:proofErr w:type="spellEnd"/>
+        <w:t xml:space="preserve"> Misc</w:t>
+      </w:r>
     </w:p>
     <w:p>
       <w:pPr>
@@ -15311,7 +15199,6 @@
           <w:rFonts w:ascii="Arial" w:hAnsi="Arial" w:cs="Arial"/>
           <w:lang w:val="en-US"/>
         </w:rPr>
-        <w:lastRenderedPageBreak/>
         <w:t>Close Long =&gt; Open Short</w:t>
       </w:r>
     </w:p>
@@ -15825,6 +15712,7 @@
           <w:szCs w:val="22"/>
           <w:lang w:val="en-US"/>
         </w:rPr>
+        <w:lastRenderedPageBreak/>
         <w:t>Python returns</w:t>
       </w:r>
     </w:p>
@@ -16078,32 +15966,6 @@
     </w:p>
     <w:p>
       <w:pPr>
-        <w:pStyle w:val="Paragraphedeliste"/>
-        <w:numPr>
-          <w:ilvl w:val="3"/>
-          <w:numId w:val="1"/>
-        </w:numPr>
-        <w:rPr>
-          <w:rFonts w:ascii="Arial" w:eastAsiaTheme="majorEastAsia" w:hAnsi="Arial" w:cs="Arial"/>
-          <w:color w:val="70AD47" w:themeColor="accent6"/>
-          <w:sz w:val="22"/>
-          <w:szCs w:val="22"/>
-          <w:lang w:val="en-US"/>
-        </w:rPr>
-      </w:pPr>
-      <w:r>
-        <w:rPr>
-          <w:rFonts w:ascii="Arial" w:eastAsiaTheme="majorEastAsia" w:hAnsi="Arial" w:cs="Arial"/>
-          <w:color w:val="70AD47" w:themeColor="accent6"/>
-          <w:sz w:val="22"/>
-          <w:szCs w:val="22"/>
-          <w:lang w:val="en-US"/>
-        </w:rPr>
-        <w:t>Python trade duration</w:t>
-      </w:r>
-    </w:p>
-    <w:p>
-      <w:pPr>
         <w:rPr>
           <w:rFonts w:ascii="Arial" w:hAnsi="Arial" w:cs="Arial"/>
           <w:lang w:val="en-US"/>
@@ -16127,7 +15989,6 @@
           <w:rFonts w:ascii="Arial" w:hAnsi="Arial" w:cs="Arial"/>
           <w:lang w:val="en-US"/>
         </w:rPr>
-        <w:lastRenderedPageBreak/>
         <w:t>Conclusions</w:t>
       </w:r>
     </w:p>
@@ -16737,7 +16598,7 @@
       <w:lvlText w:val="%1.%2.%3."/>
       <w:lvlJc w:val="left"/>
       <w:pPr>
-        <w:ind w:left="1071" w:hanging="504"/>
+        <w:ind w:left="504" w:hanging="504"/>
       </w:pPr>
     </w:lvl>
     <w:lvl w:ilvl="3">
@@ -19222,7 +19083,7 @@
 </file>
 
 <file path=customXml/itemProps1.xml><?xml version="1.0" encoding="utf-8"?>
-<ds:datastoreItem xmlns:ds="http://schemas.openxmlformats.org/officeDocument/2006/customXml" ds:itemID="{1D69610D-47E7-4E0C-B6BE-9DEC89073C3D}">
+<ds:datastoreItem xmlns:ds="http://schemas.openxmlformats.org/officeDocument/2006/customXml" ds:itemID="{02D80263-F840-4244-8E20-9FBFFC7A633E}">
   <ds:schemaRefs>
     <ds:schemaRef ds:uri="http://schemas.openxmlformats.org/officeDocument/2006/bibliography"/>
   </ds:schemaRefs>

</xml_diff>

<commit_message>
git commit -m "MF-46 <Outpoint Point value in MT5 output>"
</commit_message>
<xml_diff>
--- a/Strategies/Report_Strategy_1_MM_Hysteresis_v2.docx
+++ b/Strategies/Report_Strategy_1_MM_Hysteresis_v2.docx
@@ -1291,8 +1291,31 @@
         <w:t>;</w:t>
       </w:r>
       <w:r>
-        <w:t xml:space="preserve"> </w:t>
-      </w:r>
+        <w:rPr>
+          <w:rFonts w:ascii="Arial" w:hAnsi="Arial" w:cs="Arial"/>
+          <w:sz w:val="18"/>
+          <w:szCs w:val="18"/>
+          <w:lang w:val="en-US"/>
+        </w:rPr>
+        <w:t>GBPJPY</w:t>
+      </w:r>
+      <w:bookmarkStart w:id="0" w:name="_GoBack"/>
+      <w:bookmarkEnd w:id="0"/>
+    </w:p>
+    <w:p>
+      <w:pPr>
+        <w:pStyle w:val="Paragraphedeliste"/>
+        <w:numPr>
+          <w:ilvl w:val="0"/>
+          <w:numId w:val="7"/>
+        </w:numPr>
+        <w:rPr>
+          <w:rFonts w:ascii="Arial" w:hAnsi="Arial" w:cs="Arial"/>
+          <w:sz w:val="18"/>
+          <w:szCs w:val="18"/>
+          <w:lang w:val="en-US"/>
+        </w:rPr>
+      </w:pPr>
       <w:r>
         <w:rPr>
           <w:rFonts w:ascii="Arial" w:hAnsi="Arial" w:cs="Arial"/>
@@ -2541,14 +2564,36 @@
     <w:p>
       <w:pPr>
         <w:rPr>
-          <w:lang w:val="en-US"/>
-        </w:rPr>
-      </w:pPr>
-      <w:r>
-        <w:rPr>
+          <w:rFonts w:ascii="Arial" w:hAnsi="Arial" w:cs="Arial"/>
+          <w:lang w:val="en-US"/>
+        </w:rPr>
+      </w:pPr>
+      <w:r>
+        <w:rPr>
+          <w:rFonts w:ascii="Arial" w:hAnsi="Arial" w:cs="Arial"/>
           <w:lang w:val="en-US"/>
         </w:rPr>
         <w:t>We go here for a “fast” MA calibration. This will resolve in a lot of intermediairies trades, only reaping significant profits on very sharp trends</w:t>
+      </w:r>
+    </w:p>
+    <w:p>
+      <w:pPr>
+        <w:pStyle w:val="Paragraphedeliste"/>
+        <w:numPr>
+          <w:ilvl w:val="0"/>
+          <w:numId w:val="17"/>
+        </w:numPr>
+        <w:rPr>
+          <w:rFonts w:ascii="Arial" w:hAnsi="Arial" w:cs="Arial"/>
+          <w:lang w:val="en-US"/>
+        </w:rPr>
+      </w:pPr>
+      <w:r>
+        <w:rPr>
+          <w:rFonts w:ascii="Arial" w:hAnsi="Arial" w:cs="Arial"/>
+          <w:lang w:val="en-US"/>
+        </w:rPr>
+        <w:t>Plot me duration graphs</w:t>
       </w:r>
     </w:p>
     <w:p>
@@ -2670,8 +2715,6 @@
         </w:rPr>
         <w:t>0</w:t>
       </w:r>
-      <w:bookmarkStart w:id="0" w:name="_GoBack"/>
-      <w:bookmarkEnd w:id="0"/>
       <w:r>
         <w:rPr>
           <w:rFonts w:ascii="Arial" w:eastAsiaTheme="majorEastAsia" w:hAnsi="Arial" w:cs="Arial"/>
@@ -2739,6 +2782,1247 @@
       <w:pPr>
         <w:pStyle w:val="Paragraphedeliste"/>
         <w:numPr>
+          <w:ilvl w:val="5"/>
+          <w:numId w:val="1"/>
+        </w:numPr>
+        <w:rPr>
+          <w:rFonts w:ascii="Arial" w:eastAsiaTheme="majorEastAsia" w:hAnsi="Arial" w:cs="Arial"/>
+          <w:color w:val="70AD47" w:themeColor="accent6"/>
+          <w:sz w:val="22"/>
+          <w:szCs w:val="22"/>
+          <w:lang w:val="en-US"/>
+        </w:rPr>
+      </w:pPr>
+      <w:r>
+        <w:rPr>
+          <w:rFonts w:ascii="Arial" w:eastAsiaTheme="majorEastAsia" w:hAnsi="Arial" w:cs="Arial"/>
+          <w:color w:val="70AD47" w:themeColor="accent6"/>
+          <w:sz w:val="22"/>
+          <w:szCs w:val="22"/>
+          <w:lang w:val="en-US"/>
+        </w:rPr>
+        <w:t>Python trade duration</w:t>
+      </w:r>
+    </w:p>
+    <w:p>
+      <w:pPr>
+        <w:pStyle w:val="Titre4"/>
+        <w:numPr>
+          <w:ilvl w:val="4"/>
+          <w:numId w:val="1"/>
+        </w:numPr>
+        <w:rPr>
+          <w:rFonts w:ascii="Arial" w:hAnsi="Arial" w:cs="Arial"/>
+          <w:lang w:val="en-US"/>
+        </w:rPr>
+      </w:pPr>
+      <w:r>
+        <w:rPr>
+          <w:rFonts w:ascii="Arial" w:hAnsi="Arial" w:cs="Arial"/>
+          <w:lang w:val="en-US"/>
+        </w:rPr>
+        <w:t>H4</w:t>
+      </w:r>
+    </w:p>
+    <w:p>
+      <w:pPr>
+        <w:pStyle w:val="Paragraphedeliste"/>
+        <w:numPr>
+          <w:ilvl w:val="5"/>
+          <w:numId w:val="1"/>
+        </w:numPr>
+        <w:rPr>
+          <w:rFonts w:ascii="Arial" w:eastAsiaTheme="majorEastAsia" w:hAnsi="Arial" w:cs="Arial"/>
+          <w:color w:val="70AD47" w:themeColor="accent6"/>
+          <w:sz w:val="22"/>
+          <w:szCs w:val="22"/>
+          <w:lang w:val="en-US"/>
+        </w:rPr>
+      </w:pPr>
+      <w:r>
+        <w:rPr>
+          <w:rFonts w:ascii="Arial" w:eastAsiaTheme="majorEastAsia" w:hAnsi="Arial" w:cs="Arial"/>
+          <w:color w:val="70AD47" w:themeColor="accent6"/>
+          <w:sz w:val="22"/>
+          <w:szCs w:val="22"/>
+          <w:lang w:val="en-US"/>
+        </w:rPr>
+        <w:t>Mql5 returns</w:t>
+      </w:r>
+    </w:p>
+    <w:p>
+      <w:pPr>
+        <w:pStyle w:val="Paragraphedeliste"/>
+        <w:numPr>
+          <w:ilvl w:val="5"/>
+          <w:numId w:val="1"/>
+        </w:numPr>
+        <w:rPr>
+          <w:rFonts w:ascii="Arial" w:eastAsiaTheme="majorEastAsia" w:hAnsi="Arial" w:cs="Arial"/>
+          <w:color w:val="70AD47" w:themeColor="accent6"/>
+          <w:sz w:val="22"/>
+          <w:szCs w:val="22"/>
+          <w:lang w:val="en-US"/>
+        </w:rPr>
+      </w:pPr>
+      <w:r>
+        <w:rPr>
+          <w:rFonts w:ascii="Arial" w:eastAsiaTheme="majorEastAsia" w:hAnsi="Arial" w:cs="Arial"/>
+          <w:color w:val="70AD47" w:themeColor="accent6"/>
+          <w:sz w:val="22"/>
+          <w:szCs w:val="22"/>
+          <w:lang w:val="en-US"/>
+        </w:rPr>
+        <w:t>Python returns</w:t>
+      </w:r>
+    </w:p>
+    <w:p>
+      <w:pPr>
+        <w:pStyle w:val="Paragraphedeliste"/>
+        <w:numPr>
+          <w:ilvl w:val="5"/>
+          <w:numId w:val="1"/>
+        </w:numPr>
+        <w:rPr>
+          <w:rFonts w:ascii="Arial" w:eastAsiaTheme="majorEastAsia" w:hAnsi="Arial" w:cs="Arial"/>
+          <w:color w:val="70AD47" w:themeColor="accent6"/>
+          <w:sz w:val="22"/>
+          <w:szCs w:val="22"/>
+          <w:lang w:val="en-US"/>
+        </w:rPr>
+      </w:pPr>
+      <w:r>
+        <w:rPr>
+          <w:rFonts w:ascii="Arial" w:eastAsiaTheme="majorEastAsia" w:hAnsi="Arial" w:cs="Arial"/>
+          <w:color w:val="70AD47" w:themeColor="accent6"/>
+          <w:sz w:val="22"/>
+          <w:szCs w:val="22"/>
+          <w:lang w:val="en-US"/>
+        </w:rPr>
+        <w:t>Python correlations</w:t>
+      </w:r>
+    </w:p>
+    <w:p>
+      <w:pPr>
+        <w:pStyle w:val="Paragraphedeliste"/>
+        <w:numPr>
+          <w:ilvl w:val="5"/>
+          <w:numId w:val="1"/>
+        </w:numPr>
+        <w:rPr>
+          <w:rFonts w:ascii="Arial" w:eastAsiaTheme="majorEastAsia" w:hAnsi="Arial" w:cs="Arial"/>
+          <w:color w:val="70AD47" w:themeColor="accent6"/>
+          <w:sz w:val="22"/>
+          <w:szCs w:val="22"/>
+          <w:lang w:val="en-US"/>
+        </w:rPr>
+      </w:pPr>
+      <w:r>
+        <w:rPr>
+          <w:rFonts w:ascii="Arial" w:eastAsiaTheme="majorEastAsia" w:hAnsi="Arial" w:cs="Arial"/>
+          <w:color w:val="70AD47" w:themeColor="accent6"/>
+          <w:sz w:val="22"/>
+          <w:szCs w:val="22"/>
+          <w:lang w:val="en-US"/>
+        </w:rPr>
+        <w:t>Python SL/TP Histogram</w:t>
+      </w:r>
+    </w:p>
+    <w:p>
+      <w:pPr>
+        <w:pStyle w:val="Paragraphedeliste"/>
+        <w:numPr>
+          <w:ilvl w:val="5"/>
+          <w:numId w:val="1"/>
+        </w:numPr>
+        <w:rPr>
+          <w:rFonts w:ascii="Arial" w:eastAsiaTheme="majorEastAsia" w:hAnsi="Arial" w:cs="Arial"/>
+          <w:color w:val="70AD47" w:themeColor="accent6"/>
+          <w:sz w:val="22"/>
+          <w:szCs w:val="22"/>
+          <w:lang w:val="en-US"/>
+        </w:rPr>
+      </w:pPr>
+      <w:r>
+        <w:rPr>
+          <w:rFonts w:ascii="Arial" w:eastAsiaTheme="majorEastAsia" w:hAnsi="Arial" w:cs="Arial"/>
+          <w:color w:val="70AD47" w:themeColor="accent6"/>
+          <w:sz w:val="22"/>
+          <w:szCs w:val="22"/>
+          <w:lang w:val="en-US"/>
+        </w:rPr>
+        <w:t>Python trade duration</w:t>
+      </w:r>
+    </w:p>
+    <w:p>
+      <w:pPr>
+        <w:pStyle w:val="Titre4"/>
+        <w:numPr>
+          <w:ilvl w:val="4"/>
+          <w:numId w:val="1"/>
+        </w:numPr>
+        <w:rPr>
+          <w:rFonts w:ascii="Arial" w:hAnsi="Arial" w:cs="Arial"/>
+          <w:lang w:val="en-US"/>
+        </w:rPr>
+      </w:pPr>
+      <w:r>
+        <w:rPr>
+          <w:rFonts w:ascii="Arial" w:hAnsi="Arial" w:cs="Arial"/>
+          <w:lang w:val="en-US"/>
+        </w:rPr>
+        <w:t>D1</w:t>
+      </w:r>
+    </w:p>
+    <w:p>
+      <w:pPr>
+        <w:pStyle w:val="Paragraphedeliste"/>
+        <w:numPr>
+          <w:ilvl w:val="5"/>
+          <w:numId w:val="1"/>
+        </w:numPr>
+        <w:rPr>
+          <w:rFonts w:ascii="Arial" w:eastAsiaTheme="majorEastAsia" w:hAnsi="Arial" w:cs="Arial"/>
+          <w:color w:val="70AD47" w:themeColor="accent6"/>
+          <w:sz w:val="22"/>
+          <w:szCs w:val="22"/>
+          <w:lang w:val="en-US"/>
+        </w:rPr>
+      </w:pPr>
+      <w:r>
+        <w:rPr>
+          <w:rFonts w:ascii="Arial" w:eastAsiaTheme="majorEastAsia" w:hAnsi="Arial" w:cs="Arial"/>
+          <w:color w:val="70AD47" w:themeColor="accent6"/>
+          <w:sz w:val="22"/>
+          <w:szCs w:val="22"/>
+          <w:lang w:val="en-US"/>
+        </w:rPr>
+        <w:t>Mql5 returns</w:t>
+      </w:r>
+    </w:p>
+    <w:p>
+      <w:pPr>
+        <w:pStyle w:val="Paragraphedeliste"/>
+        <w:numPr>
+          <w:ilvl w:val="5"/>
+          <w:numId w:val="1"/>
+        </w:numPr>
+        <w:rPr>
+          <w:rFonts w:ascii="Arial" w:eastAsiaTheme="majorEastAsia" w:hAnsi="Arial" w:cs="Arial"/>
+          <w:color w:val="70AD47" w:themeColor="accent6"/>
+          <w:sz w:val="22"/>
+          <w:szCs w:val="22"/>
+          <w:lang w:val="en-US"/>
+        </w:rPr>
+      </w:pPr>
+      <w:r>
+        <w:rPr>
+          <w:rFonts w:ascii="Arial" w:eastAsiaTheme="majorEastAsia" w:hAnsi="Arial" w:cs="Arial"/>
+          <w:color w:val="70AD47" w:themeColor="accent6"/>
+          <w:sz w:val="22"/>
+          <w:szCs w:val="22"/>
+          <w:lang w:val="en-US"/>
+        </w:rPr>
+        <w:t>Python returns</w:t>
+      </w:r>
+    </w:p>
+    <w:p>
+      <w:pPr>
+        <w:pStyle w:val="Paragraphedeliste"/>
+        <w:numPr>
+          <w:ilvl w:val="5"/>
+          <w:numId w:val="1"/>
+        </w:numPr>
+        <w:rPr>
+          <w:rFonts w:ascii="Arial" w:eastAsiaTheme="majorEastAsia" w:hAnsi="Arial" w:cs="Arial"/>
+          <w:color w:val="70AD47" w:themeColor="accent6"/>
+          <w:sz w:val="22"/>
+          <w:szCs w:val="22"/>
+          <w:lang w:val="en-US"/>
+        </w:rPr>
+      </w:pPr>
+      <w:r>
+        <w:rPr>
+          <w:rFonts w:ascii="Arial" w:eastAsiaTheme="majorEastAsia" w:hAnsi="Arial" w:cs="Arial"/>
+          <w:color w:val="70AD47" w:themeColor="accent6"/>
+          <w:sz w:val="22"/>
+          <w:szCs w:val="22"/>
+          <w:lang w:val="en-US"/>
+        </w:rPr>
+        <w:t>Python correlations</w:t>
+      </w:r>
+    </w:p>
+    <w:p>
+      <w:pPr>
+        <w:pStyle w:val="Paragraphedeliste"/>
+        <w:numPr>
+          <w:ilvl w:val="5"/>
+          <w:numId w:val="1"/>
+        </w:numPr>
+        <w:rPr>
+          <w:rFonts w:ascii="Arial" w:eastAsiaTheme="majorEastAsia" w:hAnsi="Arial" w:cs="Arial"/>
+          <w:color w:val="70AD47" w:themeColor="accent6"/>
+          <w:sz w:val="22"/>
+          <w:szCs w:val="22"/>
+          <w:lang w:val="en-US"/>
+        </w:rPr>
+      </w:pPr>
+      <w:r>
+        <w:rPr>
+          <w:rFonts w:ascii="Arial" w:eastAsiaTheme="majorEastAsia" w:hAnsi="Arial" w:cs="Arial"/>
+          <w:color w:val="70AD47" w:themeColor="accent6"/>
+          <w:sz w:val="22"/>
+          <w:szCs w:val="22"/>
+          <w:lang w:val="en-US"/>
+        </w:rPr>
+        <w:t>Python SL/TP Histogram</w:t>
+      </w:r>
+    </w:p>
+    <w:p>
+      <w:pPr>
+        <w:pStyle w:val="Paragraphedeliste"/>
+        <w:numPr>
+          <w:ilvl w:val="5"/>
+          <w:numId w:val="1"/>
+        </w:numPr>
+        <w:rPr>
+          <w:rFonts w:ascii="Arial" w:eastAsiaTheme="majorEastAsia" w:hAnsi="Arial" w:cs="Arial"/>
+          <w:color w:val="70AD47" w:themeColor="accent6"/>
+          <w:sz w:val="22"/>
+          <w:szCs w:val="22"/>
+          <w:lang w:val="en-US"/>
+        </w:rPr>
+      </w:pPr>
+      <w:r>
+        <w:rPr>
+          <w:rFonts w:ascii="Arial" w:eastAsiaTheme="majorEastAsia" w:hAnsi="Arial" w:cs="Arial"/>
+          <w:color w:val="70AD47" w:themeColor="accent6"/>
+          <w:sz w:val="22"/>
+          <w:szCs w:val="22"/>
+          <w:lang w:val="en-US"/>
+        </w:rPr>
+        <w:t>Python trade duration</w:t>
+      </w:r>
+    </w:p>
+    <w:p>
+      <w:pPr>
+        <w:pStyle w:val="Titre4"/>
+        <w:numPr>
+          <w:ilvl w:val="4"/>
+          <w:numId w:val="1"/>
+        </w:numPr>
+        <w:rPr>
+          <w:rFonts w:ascii="Arial" w:hAnsi="Arial" w:cs="Arial"/>
+          <w:lang w:val="en-US"/>
+        </w:rPr>
+      </w:pPr>
+      <w:r>
+        <w:rPr>
+          <w:rFonts w:ascii="Arial" w:hAnsi="Arial" w:cs="Arial"/>
+          <w:lang w:val="en-US"/>
+        </w:rPr>
+        <w:t>W1</w:t>
+      </w:r>
+    </w:p>
+    <w:p>
+      <w:pPr>
+        <w:pStyle w:val="Paragraphedeliste"/>
+        <w:numPr>
+          <w:ilvl w:val="5"/>
+          <w:numId w:val="1"/>
+        </w:numPr>
+        <w:rPr>
+          <w:rFonts w:ascii="Arial" w:eastAsiaTheme="majorEastAsia" w:hAnsi="Arial" w:cs="Arial"/>
+          <w:color w:val="70AD47" w:themeColor="accent6"/>
+          <w:sz w:val="22"/>
+          <w:szCs w:val="22"/>
+          <w:lang w:val="en-US"/>
+        </w:rPr>
+      </w:pPr>
+      <w:r>
+        <w:rPr>
+          <w:rFonts w:ascii="Arial" w:eastAsiaTheme="majorEastAsia" w:hAnsi="Arial" w:cs="Arial"/>
+          <w:color w:val="70AD47" w:themeColor="accent6"/>
+          <w:sz w:val="22"/>
+          <w:szCs w:val="22"/>
+          <w:lang w:val="en-US"/>
+        </w:rPr>
+        <w:t>Mql5 returns</w:t>
+      </w:r>
+    </w:p>
+    <w:p>
+      <w:pPr>
+        <w:pStyle w:val="Paragraphedeliste"/>
+        <w:numPr>
+          <w:ilvl w:val="5"/>
+          <w:numId w:val="1"/>
+        </w:numPr>
+        <w:rPr>
+          <w:rFonts w:ascii="Arial" w:eastAsiaTheme="majorEastAsia" w:hAnsi="Arial" w:cs="Arial"/>
+          <w:color w:val="70AD47" w:themeColor="accent6"/>
+          <w:sz w:val="22"/>
+          <w:szCs w:val="22"/>
+          <w:lang w:val="en-US"/>
+        </w:rPr>
+      </w:pPr>
+      <w:r>
+        <w:rPr>
+          <w:rFonts w:ascii="Arial" w:eastAsiaTheme="majorEastAsia" w:hAnsi="Arial" w:cs="Arial"/>
+          <w:color w:val="70AD47" w:themeColor="accent6"/>
+          <w:sz w:val="22"/>
+          <w:szCs w:val="22"/>
+          <w:lang w:val="en-US"/>
+        </w:rPr>
+        <w:t>Python returns</w:t>
+      </w:r>
+    </w:p>
+    <w:p>
+      <w:pPr>
+        <w:pStyle w:val="Paragraphedeliste"/>
+        <w:numPr>
+          <w:ilvl w:val="5"/>
+          <w:numId w:val="1"/>
+        </w:numPr>
+        <w:rPr>
+          <w:rFonts w:ascii="Arial" w:eastAsiaTheme="majorEastAsia" w:hAnsi="Arial" w:cs="Arial"/>
+          <w:color w:val="70AD47" w:themeColor="accent6"/>
+          <w:sz w:val="22"/>
+          <w:szCs w:val="22"/>
+          <w:lang w:val="en-US"/>
+        </w:rPr>
+      </w:pPr>
+      <w:r>
+        <w:rPr>
+          <w:rFonts w:ascii="Arial" w:eastAsiaTheme="majorEastAsia" w:hAnsi="Arial" w:cs="Arial"/>
+          <w:color w:val="70AD47" w:themeColor="accent6"/>
+          <w:sz w:val="22"/>
+          <w:szCs w:val="22"/>
+          <w:lang w:val="en-US"/>
+        </w:rPr>
+        <w:t>Python correlations</w:t>
+      </w:r>
+    </w:p>
+    <w:p>
+      <w:pPr>
+        <w:pStyle w:val="Paragraphedeliste"/>
+        <w:numPr>
+          <w:ilvl w:val="5"/>
+          <w:numId w:val="1"/>
+        </w:numPr>
+        <w:rPr>
+          <w:rFonts w:ascii="Arial" w:eastAsiaTheme="majorEastAsia" w:hAnsi="Arial" w:cs="Arial"/>
+          <w:color w:val="70AD47" w:themeColor="accent6"/>
+          <w:sz w:val="22"/>
+          <w:szCs w:val="22"/>
+          <w:lang w:val="en-US"/>
+        </w:rPr>
+      </w:pPr>
+      <w:r>
+        <w:rPr>
+          <w:rFonts w:ascii="Arial" w:eastAsiaTheme="majorEastAsia" w:hAnsi="Arial" w:cs="Arial"/>
+          <w:color w:val="70AD47" w:themeColor="accent6"/>
+          <w:sz w:val="22"/>
+          <w:szCs w:val="22"/>
+          <w:lang w:val="en-US"/>
+        </w:rPr>
+        <w:t>Python SL/TP Histogram</w:t>
+      </w:r>
+    </w:p>
+    <w:p>
+      <w:pPr>
+        <w:pStyle w:val="Paragraphedeliste"/>
+        <w:numPr>
+          <w:ilvl w:val="5"/>
+          <w:numId w:val="1"/>
+        </w:numPr>
+        <w:rPr>
+          <w:rFonts w:ascii="Arial" w:eastAsiaTheme="majorEastAsia" w:hAnsi="Arial" w:cs="Arial"/>
+          <w:color w:val="70AD47" w:themeColor="accent6"/>
+          <w:sz w:val="22"/>
+          <w:szCs w:val="22"/>
+          <w:lang w:val="en-US"/>
+        </w:rPr>
+      </w:pPr>
+      <w:r>
+        <w:rPr>
+          <w:rFonts w:ascii="Arial" w:eastAsiaTheme="majorEastAsia" w:hAnsi="Arial" w:cs="Arial"/>
+          <w:color w:val="70AD47" w:themeColor="accent6"/>
+          <w:sz w:val="22"/>
+          <w:szCs w:val="22"/>
+          <w:lang w:val="en-US"/>
+        </w:rPr>
+        <w:t>Python trade duration</w:t>
+      </w:r>
+    </w:p>
+    <w:p>
+      <w:pPr>
+        <w:pStyle w:val="Titre4"/>
+        <w:numPr>
+          <w:ilvl w:val="3"/>
+          <w:numId w:val="1"/>
+        </w:numPr>
+        <w:rPr>
+          <w:rFonts w:ascii="Arial" w:hAnsi="Arial" w:cs="Arial"/>
+          <w:lang w:val="en-US"/>
+        </w:rPr>
+      </w:pPr>
+      <w:r>
+        <w:rPr>
+          <w:rFonts w:ascii="Arial" w:hAnsi="Arial" w:cs="Arial"/>
+          <w:lang w:val="en-US"/>
+        </w:rPr>
+        <w:lastRenderedPageBreak/>
+        <w:t>15/30</w:t>
+      </w:r>
+    </w:p>
+    <w:p>
+      <w:pPr>
+        <w:pStyle w:val="Titre4"/>
+        <w:numPr>
+          <w:ilvl w:val="4"/>
+          <w:numId w:val="1"/>
+        </w:numPr>
+        <w:rPr>
+          <w:rFonts w:ascii="Arial" w:hAnsi="Arial" w:cs="Arial"/>
+          <w:lang w:val="en-US"/>
+        </w:rPr>
+      </w:pPr>
+      <w:r>
+        <w:rPr>
+          <w:rFonts w:ascii="Arial" w:hAnsi="Arial" w:cs="Arial"/>
+          <w:lang w:val="en-US"/>
+        </w:rPr>
+        <w:t>H1</w:t>
+      </w:r>
+    </w:p>
+    <w:p>
+      <w:pPr>
+        <w:pStyle w:val="Paragraphedeliste"/>
+        <w:numPr>
+          <w:ilvl w:val="5"/>
+          <w:numId w:val="1"/>
+        </w:numPr>
+        <w:rPr>
+          <w:rFonts w:ascii="Arial" w:eastAsiaTheme="majorEastAsia" w:hAnsi="Arial" w:cs="Arial"/>
+          <w:color w:val="70AD47" w:themeColor="accent6"/>
+          <w:sz w:val="22"/>
+          <w:szCs w:val="22"/>
+          <w:lang w:val="en-US"/>
+        </w:rPr>
+      </w:pPr>
+      <w:r>
+        <w:rPr>
+          <w:rFonts w:ascii="Arial" w:eastAsiaTheme="majorEastAsia" w:hAnsi="Arial" w:cs="Arial"/>
+          <w:color w:val="70AD47" w:themeColor="accent6"/>
+          <w:sz w:val="22"/>
+          <w:szCs w:val="22"/>
+          <w:lang w:val="en-US"/>
+        </w:rPr>
+        <w:t>Mql5 returns</w:t>
+      </w:r>
+    </w:p>
+    <w:p>
+      <w:pPr>
+        <w:pStyle w:val="Paragraphedeliste"/>
+        <w:numPr>
+          <w:ilvl w:val="5"/>
+          <w:numId w:val="1"/>
+        </w:numPr>
+        <w:rPr>
+          <w:rFonts w:ascii="Arial" w:eastAsiaTheme="majorEastAsia" w:hAnsi="Arial" w:cs="Arial"/>
+          <w:color w:val="70AD47" w:themeColor="accent6"/>
+          <w:sz w:val="22"/>
+          <w:szCs w:val="22"/>
+          <w:lang w:val="en-US"/>
+        </w:rPr>
+      </w:pPr>
+      <w:r>
+        <w:rPr>
+          <w:rFonts w:ascii="Arial" w:eastAsiaTheme="majorEastAsia" w:hAnsi="Arial" w:cs="Arial"/>
+          <w:color w:val="70AD47" w:themeColor="accent6"/>
+          <w:sz w:val="22"/>
+          <w:szCs w:val="22"/>
+          <w:lang w:val="en-US"/>
+        </w:rPr>
+        <w:t>Python returns</w:t>
+      </w:r>
+    </w:p>
+    <w:p>
+      <w:pPr>
+        <w:pStyle w:val="Paragraphedeliste"/>
+        <w:numPr>
+          <w:ilvl w:val="5"/>
+          <w:numId w:val="1"/>
+        </w:numPr>
+        <w:rPr>
+          <w:rFonts w:ascii="Arial" w:eastAsiaTheme="majorEastAsia" w:hAnsi="Arial" w:cs="Arial"/>
+          <w:color w:val="70AD47" w:themeColor="accent6"/>
+          <w:sz w:val="22"/>
+          <w:szCs w:val="22"/>
+          <w:lang w:val="en-US"/>
+        </w:rPr>
+      </w:pPr>
+      <w:r>
+        <w:rPr>
+          <w:rFonts w:ascii="Arial" w:eastAsiaTheme="majorEastAsia" w:hAnsi="Arial" w:cs="Arial"/>
+          <w:color w:val="70AD47" w:themeColor="accent6"/>
+          <w:sz w:val="22"/>
+          <w:szCs w:val="22"/>
+          <w:lang w:val="en-US"/>
+        </w:rPr>
+        <w:t>Python correlations</w:t>
+      </w:r>
+    </w:p>
+    <w:p>
+      <w:pPr>
+        <w:pStyle w:val="Paragraphedeliste"/>
+        <w:numPr>
+          <w:ilvl w:val="5"/>
+          <w:numId w:val="1"/>
+        </w:numPr>
+        <w:rPr>
+          <w:rFonts w:ascii="Arial" w:eastAsiaTheme="majorEastAsia" w:hAnsi="Arial" w:cs="Arial"/>
+          <w:color w:val="70AD47" w:themeColor="accent6"/>
+          <w:sz w:val="22"/>
+          <w:szCs w:val="22"/>
+          <w:lang w:val="en-US"/>
+        </w:rPr>
+      </w:pPr>
+      <w:r>
+        <w:rPr>
+          <w:rFonts w:ascii="Arial" w:eastAsiaTheme="majorEastAsia" w:hAnsi="Arial" w:cs="Arial"/>
+          <w:color w:val="70AD47" w:themeColor="accent6"/>
+          <w:sz w:val="22"/>
+          <w:szCs w:val="22"/>
+          <w:lang w:val="en-US"/>
+        </w:rPr>
+        <w:t>Python SL/TP Histogram</w:t>
+      </w:r>
+    </w:p>
+    <w:p>
+      <w:pPr>
+        <w:pStyle w:val="Paragraphedeliste"/>
+        <w:numPr>
+          <w:ilvl w:val="5"/>
+          <w:numId w:val="1"/>
+        </w:numPr>
+        <w:rPr>
+          <w:rFonts w:ascii="Arial" w:eastAsiaTheme="majorEastAsia" w:hAnsi="Arial" w:cs="Arial"/>
+          <w:color w:val="70AD47" w:themeColor="accent6"/>
+          <w:sz w:val="22"/>
+          <w:szCs w:val="22"/>
+          <w:lang w:val="en-US"/>
+        </w:rPr>
+      </w:pPr>
+      <w:r>
+        <w:rPr>
+          <w:rFonts w:ascii="Arial" w:eastAsiaTheme="majorEastAsia" w:hAnsi="Arial" w:cs="Arial"/>
+          <w:color w:val="70AD47" w:themeColor="accent6"/>
+          <w:sz w:val="22"/>
+          <w:szCs w:val="22"/>
+          <w:lang w:val="en-US"/>
+        </w:rPr>
+        <w:t>Python trade duration</w:t>
+      </w:r>
+    </w:p>
+    <w:p>
+      <w:pPr>
+        <w:pStyle w:val="Titre4"/>
+        <w:numPr>
+          <w:ilvl w:val="4"/>
+          <w:numId w:val="1"/>
+        </w:numPr>
+        <w:rPr>
+          <w:rFonts w:ascii="Arial" w:hAnsi="Arial" w:cs="Arial"/>
+          <w:lang w:val="en-US"/>
+        </w:rPr>
+      </w:pPr>
+      <w:r>
+        <w:rPr>
+          <w:rFonts w:ascii="Arial" w:hAnsi="Arial" w:cs="Arial"/>
+          <w:lang w:val="en-US"/>
+        </w:rPr>
+        <w:t>H4</w:t>
+      </w:r>
+    </w:p>
+    <w:p>
+      <w:pPr>
+        <w:pStyle w:val="Paragraphedeliste"/>
+        <w:numPr>
+          <w:ilvl w:val="5"/>
+          <w:numId w:val="1"/>
+        </w:numPr>
+        <w:rPr>
+          <w:rFonts w:ascii="Arial" w:eastAsiaTheme="majorEastAsia" w:hAnsi="Arial" w:cs="Arial"/>
+          <w:color w:val="70AD47" w:themeColor="accent6"/>
+          <w:sz w:val="22"/>
+          <w:szCs w:val="22"/>
+          <w:lang w:val="en-US"/>
+        </w:rPr>
+      </w:pPr>
+      <w:r>
+        <w:rPr>
+          <w:rFonts w:ascii="Arial" w:eastAsiaTheme="majorEastAsia" w:hAnsi="Arial" w:cs="Arial"/>
+          <w:color w:val="70AD47" w:themeColor="accent6"/>
+          <w:sz w:val="22"/>
+          <w:szCs w:val="22"/>
+          <w:lang w:val="en-US"/>
+        </w:rPr>
+        <w:t>Mql5 returns</w:t>
+      </w:r>
+    </w:p>
+    <w:p>
+      <w:pPr>
+        <w:pStyle w:val="Paragraphedeliste"/>
+        <w:numPr>
+          <w:ilvl w:val="5"/>
+          <w:numId w:val="1"/>
+        </w:numPr>
+        <w:rPr>
+          <w:rFonts w:ascii="Arial" w:eastAsiaTheme="majorEastAsia" w:hAnsi="Arial" w:cs="Arial"/>
+          <w:color w:val="70AD47" w:themeColor="accent6"/>
+          <w:sz w:val="22"/>
+          <w:szCs w:val="22"/>
+          <w:lang w:val="en-US"/>
+        </w:rPr>
+      </w:pPr>
+      <w:r>
+        <w:rPr>
+          <w:rFonts w:ascii="Arial" w:eastAsiaTheme="majorEastAsia" w:hAnsi="Arial" w:cs="Arial"/>
+          <w:color w:val="70AD47" w:themeColor="accent6"/>
+          <w:sz w:val="22"/>
+          <w:szCs w:val="22"/>
+          <w:lang w:val="en-US"/>
+        </w:rPr>
+        <w:t>Python returns</w:t>
+      </w:r>
+    </w:p>
+    <w:p>
+      <w:pPr>
+        <w:pStyle w:val="Paragraphedeliste"/>
+        <w:numPr>
+          <w:ilvl w:val="5"/>
+          <w:numId w:val="1"/>
+        </w:numPr>
+        <w:rPr>
+          <w:rFonts w:ascii="Arial" w:eastAsiaTheme="majorEastAsia" w:hAnsi="Arial" w:cs="Arial"/>
+          <w:color w:val="70AD47" w:themeColor="accent6"/>
+          <w:sz w:val="22"/>
+          <w:szCs w:val="22"/>
+          <w:lang w:val="en-US"/>
+        </w:rPr>
+      </w:pPr>
+      <w:r>
+        <w:rPr>
+          <w:rFonts w:ascii="Arial" w:eastAsiaTheme="majorEastAsia" w:hAnsi="Arial" w:cs="Arial"/>
+          <w:color w:val="70AD47" w:themeColor="accent6"/>
+          <w:sz w:val="22"/>
+          <w:szCs w:val="22"/>
+          <w:lang w:val="en-US"/>
+        </w:rPr>
+        <w:t>Python correlations</w:t>
+      </w:r>
+    </w:p>
+    <w:p>
+      <w:pPr>
+        <w:pStyle w:val="Paragraphedeliste"/>
+        <w:numPr>
+          <w:ilvl w:val="5"/>
+          <w:numId w:val="1"/>
+        </w:numPr>
+        <w:rPr>
+          <w:rFonts w:ascii="Arial" w:eastAsiaTheme="majorEastAsia" w:hAnsi="Arial" w:cs="Arial"/>
+          <w:color w:val="70AD47" w:themeColor="accent6"/>
+          <w:sz w:val="22"/>
+          <w:szCs w:val="22"/>
+          <w:lang w:val="en-US"/>
+        </w:rPr>
+      </w:pPr>
+      <w:r>
+        <w:rPr>
+          <w:rFonts w:ascii="Arial" w:eastAsiaTheme="majorEastAsia" w:hAnsi="Arial" w:cs="Arial"/>
+          <w:color w:val="70AD47" w:themeColor="accent6"/>
+          <w:sz w:val="22"/>
+          <w:szCs w:val="22"/>
+          <w:lang w:val="en-US"/>
+        </w:rPr>
+        <w:t>Python SL/TP Histogram</w:t>
+      </w:r>
+    </w:p>
+    <w:p>
+      <w:pPr>
+        <w:pStyle w:val="Paragraphedeliste"/>
+        <w:numPr>
+          <w:ilvl w:val="5"/>
+          <w:numId w:val="1"/>
+        </w:numPr>
+        <w:rPr>
+          <w:rFonts w:ascii="Arial" w:eastAsiaTheme="majorEastAsia" w:hAnsi="Arial" w:cs="Arial"/>
+          <w:color w:val="70AD47" w:themeColor="accent6"/>
+          <w:sz w:val="22"/>
+          <w:szCs w:val="22"/>
+          <w:lang w:val="en-US"/>
+        </w:rPr>
+      </w:pPr>
+      <w:r>
+        <w:rPr>
+          <w:rFonts w:ascii="Arial" w:eastAsiaTheme="majorEastAsia" w:hAnsi="Arial" w:cs="Arial"/>
+          <w:color w:val="70AD47" w:themeColor="accent6"/>
+          <w:sz w:val="22"/>
+          <w:szCs w:val="22"/>
+          <w:lang w:val="en-US"/>
+        </w:rPr>
+        <w:t>Python trade duration</w:t>
+      </w:r>
+    </w:p>
+    <w:p>
+      <w:pPr>
+        <w:pStyle w:val="Titre4"/>
+        <w:numPr>
+          <w:ilvl w:val="4"/>
+          <w:numId w:val="1"/>
+        </w:numPr>
+        <w:rPr>
+          <w:rFonts w:ascii="Arial" w:hAnsi="Arial" w:cs="Arial"/>
+          <w:lang w:val="en-US"/>
+        </w:rPr>
+      </w:pPr>
+      <w:r>
+        <w:rPr>
+          <w:rFonts w:ascii="Arial" w:hAnsi="Arial" w:cs="Arial"/>
+          <w:lang w:val="en-US"/>
+        </w:rPr>
+        <w:t>D1</w:t>
+      </w:r>
+    </w:p>
+    <w:p>
+      <w:pPr>
+        <w:pStyle w:val="Paragraphedeliste"/>
+        <w:numPr>
+          <w:ilvl w:val="5"/>
+          <w:numId w:val="1"/>
+        </w:numPr>
+        <w:rPr>
+          <w:rFonts w:ascii="Arial" w:eastAsiaTheme="majorEastAsia" w:hAnsi="Arial" w:cs="Arial"/>
+          <w:color w:val="70AD47" w:themeColor="accent6"/>
+          <w:sz w:val="22"/>
+          <w:szCs w:val="22"/>
+          <w:lang w:val="en-US"/>
+        </w:rPr>
+      </w:pPr>
+      <w:r>
+        <w:rPr>
+          <w:rFonts w:ascii="Arial" w:eastAsiaTheme="majorEastAsia" w:hAnsi="Arial" w:cs="Arial"/>
+          <w:color w:val="70AD47" w:themeColor="accent6"/>
+          <w:sz w:val="22"/>
+          <w:szCs w:val="22"/>
+          <w:lang w:val="en-US"/>
+        </w:rPr>
+        <w:t>Mql5 returns</w:t>
+      </w:r>
+    </w:p>
+    <w:p>
+      <w:pPr>
+        <w:pStyle w:val="Paragraphedeliste"/>
+        <w:numPr>
+          <w:ilvl w:val="5"/>
+          <w:numId w:val="1"/>
+        </w:numPr>
+        <w:rPr>
+          <w:rFonts w:ascii="Arial" w:eastAsiaTheme="majorEastAsia" w:hAnsi="Arial" w:cs="Arial"/>
+          <w:color w:val="70AD47" w:themeColor="accent6"/>
+          <w:sz w:val="22"/>
+          <w:szCs w:val="22"/>
+          <w:lang w:val="en-US"/>
+        </w:rPr>
+      </w:pPr>
+      <w:r>
+        <w:rPr>
+          <w:rFonts w:ascii="Arial" w:eastAsiaTheme="majorEastAsia" w:hAnsi="Arial" w:cs="Arial"/>
+          <w:color w:val="70AD47" w:themeColor="accent6"/>
+          <w:sz w:val="22"/>
+          <w:szCs w:val="22"/>
+          <w:lang w:val="en-US"/>
+        </w:rPr>
+        <w:t>Python returns</w:t>
+      </w:r>
+    </w:p>
+    <w:p>
+      <w:pPr>
+        <w:pStyle w:val="Paragraphedeliste"/>
+        <w:numPr>
+          <w:ilvl w:val="5"/>
+          <w:numId w:val="1"/>
+        </w:numPr>
+        <w:rPr>
+          <w:rFonts w:ascii="Arial" w:eastAsiaTheme="majorEastAsia" w:hAnsi="Arial" w:cs="Arial"/>
+          <w:color w:val="70AD47" w:themeColor="accent6"/>
+          <w:sz w:val="22"/>
+          <w:szCs w:val="22"/>
+          <w:lang w:val="en-US"/>
+        </w:rPr>
+      </w:pPr>
+      <w:r>
+        <w:rPr>
+          <w:rFonts w:ascii="Arial" w:eastAsiaTheme="majorEastAsia" w:hAnsi="Arial" w:cs="Arial"/>
+          <w:color w:val="70AD47" w:themeColor="accent6"/>
+          <w:sz w:val="22"/>
+          <w:szCs w:val="22"/>
+          <w:lang w:val="en-US"/>
+        </w:rPr>
+        <w:t>Python correlations</w:t>
+      </w:r>
+    </w:p>
+    <w:p>
+      <w:pPr>
+        <w:pStyle w:val="Paragraphedeliste"/>
+        <w:numPr>
+          <w:ilvl w:val="5"/>
+          <w:numId w:val="1"/>
+        </w:numPr>
+        <w:rPr>
+          <w:rFonts w:ascii="Arial" w:eastAsiaTheme="majorEastAsia" w:hAnsi="Arial" w:cs="Arial"/>
+          <w:color w:val="70AD47" w:themeColor="accent6"/>
+          <w:sz w:val="22"/>
+          <w:szCs w:val="22"/>
+          <w:lang w:val="en-US"/>
+        </w:rPr>
+      </w:pPr>
+      <w:r>
+        <w:rPr>
+          <w:rFonts w:ascii="Arial" w:eastAsiaTheme="majorEastAsia" w:hAnsi="Arial" w:cs="Arial"/>
+          <w:color w:val="70AD47" w:themeColor="accent6"/>
+          <w:sz w:val="22"/>
+          <w:szCs w:val="22"/>
+          <w:lang w:val="en-US"/>
+        </w:rPr>
+        <w:t>Python SL/TP Histogram</w:t>
+      </w:r>
+    </w:p>
+    <w:p>
+      <w:pPr>
+        <w:pStyle w:val="Paragraphedeliste"/>
+        <w:numPr>
+          <w:ilvl w:val="5"/>
+          <w:numId w:val="1"/>
+        </w:numPr>
+        <w:rPr>
+          <w:rFonts w:ascii="Arial" w:eastAsiaTheme="majorEastAsia" w:hAnsi="Arial" w:cs="Arial"/>
+          <w:color w:val="70AD47" w:themeColor="accent6"/>
+          <w:sz w:val="22"/>
+          <w:szCs w:val="22"/>
+          <w:lang w:val="en-US"/>
+        </w:rPr>
+      </w:pPr>
+      <w:r>
+        <w:rPr>
+          <w:rFonts w:ascii="Arial" w:eastAsiaTheme="majorEastAsia" w:hAnsi="Arial" w:cs="Arial"/>
+          <w:color w:val="70AD47" w:themeColor="accent6"/>
+          <w:sz w:val="22"/>
+          <w:szCs w:val="22"/>
+          <w:lang w:val="en-US"/>
+        </w:rPr>
+        <w:t>Python trade duration</w:t>
+      </w:r>
+    </w:p>
+    <w:p>
+      <w:pPr>
+        <w:pStyle w:val="Titre4"/>
+        <w:numPr>
+          <w:ilvl w:val="4"/>
+          <w:numId w:val="1"/>
+        </w:numPr>
+        <w:rPr>
+          <w:rFonts w:ascii="Arial" w:hAnsi="Arial" w:cs="Arial"/>
+          <w:lang w:val="en-US"/>
+        </w:rPr>
+      </w:pPr>
+      <w:r>
+        <w:rPr>
+          <w:rFonts w:ascii="Arial" w:hAnsi="Arial" w:cs="Arial"/>
+          <w:lang w:val="en-US"/>
+        </w:rPr>
+        <w:t>W1</w:t>
+      </w:r>
+    </w:p>
+    <w:p>
+      <w:pPr>
+        <w:pStyle w:val="Paragraphedeliste"/>
+        <w:numPr>
+          <w:ilvl w:val="5"/>
+          <w:numId w:val="1"/>
+        </w:numPr>
+        <w:rPr>
+          <w:rFonts w:ascii="Arial" w:eastAsiaTheme="majorEastAsia" w:hAnsi="Arial" w:cs="Arial"/>
+          <w:color w:val="70AD47" w:themeColor="accent6"/>
+          <w:sz w:val="22"/>
+          <w:szCs w:val="22"/>
+          <w:lang w:val="en-US"/>
+        </w:rPr>
+      </w:pPr>
+      <w:r>
+        <w:rPr>
+          <w:rFonts w:ascii="Arial" w:eastAsiaTheme="majorEastAsia" w:hAnsi="Arial" w:cs="Arial"/>
+          <w:color w:val="70AD47" w:themeColor="accent6"/>
+          <w:sz w:val="22"/>
+          <w:szCs w:val="22"/>
+          <w:lang w:val="en-US"/>
+        </w:rPr>
+        <w:t>Mql5 returns</w:t>
+      </w:r>
+    </w:p>
+    <w:p>
+      <w:pPr>
+        <w:pStyle w:val="Paragraphedeliste"/>
+        <w:numPr>
+          <w:ilvl w:val="5"/>
+          <w:numId w:val="1"/>
+        </w:numPr>
+        <w:rPr>
+          <w:rFonts w:ascii="Arial" w:eastAsiaTheme="majorEastAsia" w:hAnsi="Arial" w:cs="Arial"/>
+          <w:color w:val="70AD47" w:themeColor="accent6"/>
+          <w:sz w:val="22"/>
+          <w:szCs w:val="22"/>
+          <w:lang w:val="en-US"/>
+        </w:rPr>
+      </w:pPr>
+      <w:r>
+        <w:rPr>
+          <w:rFonts w:ascii="Arial" w:eastAsiaTheme="majorEastAsia" w:hAnsi="Arial" w:cs="Arial"/>
+          <w:color w:val="70AD47" w:themeColor="accent6"/>
+          <w:sz w:val="22"/>
+          <w:szCs w:val="22"/>
+          <w:lang w:val="en-US"/>
+        </w:rPr>
+        <w:t>Python returns</w:t>
+      </w:r>
+    </w:p>
+    <w:p>
+      <w:pPr>
+        <w:pStyle w:val="Paragraphedeliste"/>
+        <w:numPr>
+          <w:ilvl w:val="5"/>
+          <w:numId w:val="1"/>
+        </w:numPr>
+        <w:rPr>
+          <w:rFonts w:ascii="Arial" w:eastAsiaTheme="majorEastAsia" w:hAnsi="Arial" w:cs="Arial"/>
+          <w:color w:val="70AD47" w:themeColor="accent6"/>
+          <w:sz w:val="22"/>
+          <w:szCs w:val="22"/>
+          <w:lang w:val="en-US"/>
+        </w:rPr>
+      </w:pPr>
+      <w:r>
+        <w:rPr>
+          <w:rFonts w:ascii="Arial" w:eastAsiaTheme="majorEastAsia" w:hAnsi="Arial" w:cs="Arial"/>
+          <w:color w:val="70AD47" w:themeColor="accent6"/>
+          <w:sz w:val="22"/>
+          <w:szCs w:val="22"/>
+          <w:lang w:val="en-US"/>
+        </w:rPr>
+        <w:t>Python correlations</w:t>
+      </w:r>
+    </w:p>
+    <w:p>
+      <w:pPr>
+        <w:pStyle w:val="Paragraphedeliste"/>
+        <w:numPr>
+          <w:ilvl w:val="5"/>
+          <w:numId w:val="1"/>
+        </w:numPr>
+        <w:rPr>
+          <w:rFonts w:ascii="Arial" w:eastAsiaTheme="majorEastAsia" w:hAnsi="Arial" w:cs="Arial"/>
+          <w:color w:val="70AD47" w:themeColor="accent6"/>
+          <w:sz w:val="22"/>
+          <w:szCs w:val="22"/>
+          <w:lang w:val="en-US"/>
+        </w:rPr>
+      </w:pPr>
+      <w:r>
+        <w:rPr>
+          <w:rFonts w:ascii="Arial" w:eastAsiaTheme="majorEastAsia" w:hAnsi="Arial" w:cs="Arial"/>
+          <w:color w:val="70AD47" w:themeColor="accent6"/>
+          <w:sz w:val="22"/>
+          <w:szCs w:val="22"/>
+          <w:lang w:val="en-US"/>
+        </w:rPr>
+        <w:t>Python SL/TP Histogram</w:t>
+      </w:r>
+    </w:p>
+    <w:p>
+      <w:pPr>
+        <w:pStyle w:val="Paragraphedeliste"/>
+        <w:numPr>
+          <w:ilvl w:val="5"/>
+          <w:numId w:val="1"/>
+        </w:numPr>
+        <w:rPr>
+          <w:rFonts w:ascii="Arial" w:eastAsiaTheme="majorEastAsia" w:hAnsi="Arial" w:cs="Arial"/>
+          <w:color w:val="70AD47" w:themeColor="accent6"/>
+          <w:sz w:val="22"/>
+          <w:szCs w:val="22"/>
+          <w:lang w:val="en-US"/>
+        </w:rPr>
+      </w:pPr>
+      <w:r>
+        <w:rPr>
+          <w:rFonts w:ascii="Arial" w:eastAsiaTheme="majorEastAsia" w:hAnsi="Arial" w:cs="Arial"/>
+          <w:color w:val="70AD47" w:themeColor="accent6"/>
+          <w:sz w:val="22"/>
+          <w:szCs w:val="22"/>
+          <w:lang w:val="en-US"/>
+        </w:rPr>
+        <w:t>Python trade duration</w:t>
+      </w:r>
+    </w:p>
+    <w:p>
+      <w:pPr>
+        <w:pStyle w:val="Titre4"/>
+        <w:numPr>
+          <w:ilvl w:val="3"/>
+          <w:numId w:val="1"/>
+        </w:numPr>
+        <w:rPr>
+          <w:rFonts w:ascii="Arial" w:hAnsi="Arial" w:cs="Arial"/>
+          <w:lang w:val="en-US"/>
+        </w:rPr>
+      </w:pPr>
+      <w:r>
+        <w:rPr>
+          <w:rFonts w:ascii="Arial" w:hAnsi="Arial" w:cs="Arial"/>
+          <w:lang w:val="en-US"/>
+        </w:rPr>
+        <w:t>21/50</w:t>
+      </w:r>
+    </w:p>
+    <w:p>
+      <w:pPr>
+        <w:pStyle w:val="Titre4"/>
+        <w:numPr>
+          <w:ilvl w:val="4"/>
+          <w:numId w:val="1"/>
+        </w:numPr>
+        <w:rPr>
+          <w:rFonts w:ascii="Arial" w:hAnsi="Arial" w:cs="Arial"/>
+          <w:lang w:val="en-US"/>
+        </w:rPr>
+      </w:pPr>
+      <w:r>
+        <w:rPr>
+          <w:rFonts w:ascii="Arial" w:hAnsi="Arial" w:cs="Arial"/>
+          <w:lang w:val="en-US"/>
+        </w:rPr>
+        <w:t>H1</w:t>
+      </w:r>
+    </w:p>
+    <w:p>
+      <w:pPr>
+        <w:pStyle w:val="Paragraphedeliste"/>
+        <w:numPr>
+          <w:ilvl w:val="5"/>
+          <w:numId w:val="1"/>
+        </w:numPr>
+        <w:rPr>
+          <w:rFonts w:ascii="Arial" w:eastAsiaTheme="majorEastAsia" w:hAnsi="Arial" w:cs="Arial"/>
+          <w:color w:val="70AD47" w:themeColor="accent6"/>
+          <w:sz w:val="22"/>
+          <w:szCs w:val="22"/>
+          <w:lang w:val="en-US"/>
+        </w:rPr>
+      </w:pPr>
+      <w:r>
+        <w:rPr>
+          <w:rFonts w:ascii="Arial" w:eastAsiaTheme="majorEastAsia" w:hAnsi="Arial" w:cs="Arial"/>
+          <w:color w:val="70AD47" w:themeColor="accent6"/>
+          <w:sz w:val="22"/>
+          <w:szCs w:val="22"/>
+          <w:lang w:val="en-US"/>
+        </w:rPr>
+        <w:t>Mql5 returns</w:t>
+      </w:r>
+    </w:p>
+    <w:p>
+      <w:pPr>
+        <w:pStyle w:val="Paragraphedeliste"/>
+        <w:numPr>
+          <w:ilvl w:val="5"/>
+          <w:numId w:val="1"/>
+        </w:numPr>
+        <w:rPr>
+          <w:rFonts w:ascii="Arial" w:eastAsiaTheme="majorEastAsia" w:hAnsi="Arial" w:cs="Arial"/>
+          <w:color w:val="70AD47" w:themeColor="accent6"/>
+          <w:sz w:val="22"/>
+          <w:szCs w:val="22"/>
+          <w:lang w:val="en-US"/>
+        </w:rPr>
+      </w:pPr>
+      <w:r>
+        <w:rPr>
+          <w:rFonts w:ascii="Arial" w:eastAsiaTheme="majorEastAsia" w:hAnsi="Arial" w:cs="Arial"/>
+          <w:color w:val="70AD47" w:themeColor="accent6"/>
+          <w:sz w:val="22"/>
+          <w:szCs w:val="22"/>
+          <w:lang w:val="en-US"/>
+        </w:rPr>
+        <w:t>Python returns</w:t>
+      </w:r>
+    </w:p>
+    <w:p>
+      <w:pPr>
+        <w:pStyle w:val="Paragraphedeliste"/>
+        <w:numPr>
+          <w:ilvl w:val="5"/>
+          <w:numId w:val="1"/>
+        </w:numPr>
+        <w:rPr>
+          <w:rFonts w:ascii="Arial" w:eastAsiaTheme="majorEastAsia" w:hAnsi="Arial" w:cs="Arial"/>
+          <w:color w:val="70AD47" w:themeColor="accent6"/>
+          <w:sz w:val="22"/>
+          <w:szCs w:val="22"/>
+          <w:lang w:val="en-US"/>
+        </w:rPr>
+      </w:pPr>
+      <w:r>
+        <w:rPr>
+          <w:rFonts w:ascii="Arial" w:eastAsiaTheme="majorEastAsia" w:hAnsi="Arial" w:cs="Arial"/>
+          <w:color w:val="70AD47" w:themeColor="accent6"/>
+          <w:sz w:val="22"/>
+          <w:szCs w:val="22"/>
+          <w:lang w:val="en-US"/>
+        </w:rPr>
+        <w:t>Python correlations</w:t>
+      </w:r>
+    </w:p>
+    <w:p>
+      <w:pPr>
+        <w:pStyle w:val="Paragraphedeliste"/>
+        <w:numPr>
+          <w:ilvl w:val="5"/>
+          <w:numId w:val="1"/>
+        </w:numPr>
+        <w:rPr>
+          <w:rFonts w:ascii="Arial" w:eastAsiaTheme="majorEastAsia" w:hAnsi="Arial" w:cs="Arial"/>
+          <w:color w:val="70AD47" w:themeColor="accent6"/>
+          <w:sz w:val="22"/>
+          <w:szCs w:val="22"/>
+          <w:lang w:val="en-US"/>
+        </w:rPr>
+      </w:pPr>
+      <w:r>
+        <w:rPr>
+          <w:rFonts w:ascii="Arial" w:eastAsiaTheme="majorEastAsia" w:hAnsi="Arial" w:cs="Arial"/>
+          <w:color w:val="70AD47" w:themeColor="accent6"/>
+          <w:sz w:val="22"/>
+          <w:szCs w:val="22"/>
+          <w:lang w:val="en-US"/>
+        </w:rPr>
+        <w:t>Python SL/TP Histogram</w:t>
+      </w:r>
+    </w:p>
+    <w:p>
+      <w:pPr>
+        <w:pStyle w:val="Paragraphedeliste"/>
+        <w:numPr>
           <w:ilvl w:val="6"/>
           <w:numId w:val="1"/>
         </w:numPr>
@@ -3006,6 +4290,7 @@
           <w:szCs w:val="22"/>
           <w:lang w:val="en-US"/>
         </w:rPr>
+        <w:lastRenderedPageBreak/>
         <w:t>Python correlations</w:t>
       </w:r>
     </w:p>
@@ -3213,6 +4498,13 @@
     </w:p>
     <w:p>
       <w:pPr>
+        <w:rPr>
+          <w:lang w:val="en-US"/>
+        </w:rPr>
+      </w:pPr>
+    </w:p>
+    <w:p>
+      <w:pPr>
         <w:pStyle w:val="Titre4"/>
         <w:numPr>
           <w:ilvl w:val="3"/>
@@ -3228,7 +4520,7 @@
           <w:rFonts w:ascii="Arial" w:hAnsi="Arial" w:cs="Arial"/>
           <w:lang w:val="en-US"/>
         </w:rPr>
-        <w:t>15/30</w:t>
+        <w:t>50/160</w:t>
       </w:r>
     </w:p>
     <w:p>
@@ -3300,7 +4592,635 @@
           <w:szCs w:val="22"/>
           <w:lang w:val="en-US"/>
         </w:rPr>
+        <w:t>Python returns</w:t>
+      </w:r>
+    </w:p>
+    <w:p>
+      <w:pPr>
+        <w:pStyle w:val="Paragraphedeliste"/>
+        <w:numPr>
+          <w:ilvl w:val="5"/>
+          <w:numId w:val="1"/>
+        </w:numPr>
+        <w:rPr>
+          <w:rFonts w:ascii="Arial" w:eastAsiaTheme="majorEastAsia" w:hAnsi="Arial" w:cs="Arial"/>
+          <w:color w:val="70AD47" w:themeColor="accent6"/>
+          <w:sz w:val="22"/>
+          <w:szCs w:val="22"/>
+          <w:lang w:val="en-US"/>
+        </w:rPr>
+      </w:pPr>
+      <w:r>
+        <w:rPr>
+          <w:rFonts w:ascii="Arial" w:eastAsiaTheme="majorEastAsia" w:hAnsi="Arial" w:cs="Arial"/>
+          <w:color w:val="70AD47" w:themeColor="accent6"/>
+          <w:sz w:val="22"/>
+          <w:szCs w:val="22"/>
+          <w:lang w:val="en-US"/>
+        </w:rPr>
+        <w:t>Python correlations</w:t>
+      </w:r>
+    </w:p>
+    <w:p>
+      <w:pPr>
+        <w:pStyle w:val="Paragraphedeliste"/>
+        <w:numPr>
+          <w:ilvl w:val="5"/>
+          <w:numId w:val="1"/>
+        </w:numPr>
+        <w:rPr>
+          <w:rFonts w:ascii="Arial" w:eastAsiaTheme="majorEastAsia" w:hAnsi="Arial" w:cs="Arial"/>
+          <w:color w:val="70AD47" w:themeColor="accent6"/>
+          <w:sz w:val="22"/>
+          <w:szCs w:val="22"/>
+          <w:lang w:val="en-US"/>
+        </w:rPr>
+      </w:pPr>
+      <w:r>
+        <w:rPr>
+          <w:rFonts w:ascii="Arial" w:eastAsiaTheme="majorEastAsia" w:hAnsi="Arial" w:cs="Arial"/>
+          <w:color w:val="70AD47" w:themeColor="accent6"/>
+          <w:sz w:val="22"/>
+          <w:szCs w:val="22"/>
+          <w:lang w:val="en-US"/>
+        </w:rPr>
+        <w:t>Python SL/TP Histogram</w:t>
+      </w:r>
+    </w:p>
+    <w:p>
+      <w:pPr>
+        <w:pStyle w:val="Paragraphedeliste"/>
+        <w:numPr>
+          <w:ilvl w:val="6"/>
+          <w:numId w:val="1"/>
+        </w:numPr>
+        <w:rPr>
+          <w:rFonts w:ascii="Arial" w:eastAsiaTheme="majorEastAsia" w:hAnsi="Arial" w:cs="Arial"/>
+          <w:color w:val="70AD47" w:themeColor="accent6"/>
+          <w:sz w:val="22"/>
+          <w:szCs w:val="22"/>
+          <w:lang w:val="en-US"/>
+        </w:rPr>
+      </w:pPr>
+      <w:r>
+        <w:rPr>
+          <w:rFonts w:ascii="Arial" w:eastAsiaTheme="majorEastAsia" w:hAnsi="Arial" w:cs="Arial"/>
+          <w:color w:val="70AD47" w:themeColor="accent6"/>
+          <w:sz w:val="22"/>
+          <w:szCs w:val="22"/>
+          <w:lang w:val="en-US"/>
+        </w:rPr>
+        <w:t>Python trade duration</w:t>
+      </w:r>
+    </w:p>
+    <w:p>
+      <w:pPr>
+        <w:pStyle w:val="Titre4"/>
+        <w:numPr>
+          <w:ilvl w:val="4"/>
+          <w:numId w:val="1"/>
+        </w:numPr>
+        <w:rPr>
+          <w:rFonts w:ascii="Arial" w:hAnsi="Arial" w:cs="Arial"/>
+          <w:lang w:val="en-US"/>
+        </w:rPr>
+      </w:pPr>
+      <w:r>
+        <w:rPr>
+          <w:rFonts w:ascii="Arial" w:hAnsi="Arial" w:cs="Arial"/>
+          <w:lang w:val="en-US"/>
+        </w:rPr>
+        <w:t>H4</w:t>
+      </w:r>
+    </w:p>
+    <w:p>
+      <w:pPr>
+        <w:pStyle w:val="Paragraphedeliste"/>
+        <w:numPr>
+          <w:ilvl w:val="5"/>
+          <w:numId w:val="1"/>
+        </w:numPr>
+        <w:rPr>
+          <w:rFonts w:ascii="Arial" w:eastAsiaTheme="majorEastAsia" w:hAnsi="Arial" w:cs="Arial"/>
+          <w:color w:val="70AD47" w:themeColor="accent6"/>
+          <w:sz w:val="22"/>
+          <w:szCs w:val="22"/>
+          <w:lang w:val="en-US"/>
+        </w:rPr>
+      </w:pPr>
+      <w:r>
+        <w:rPr>
+          <w:rFonts w:ascii="Arial" w:eastAsiaTheme="majorEastAsia" w:hAnsi="Arial" w:cs="Arial"/>
+          <w:color w:val="70AD47" w:themeColor="accent6"/>
+          <w:sz w:val="22"/>
+          <w:szCs w:val="22"/>
+          <w:lang w:val="en-US"/>
+        </w:rPr>
+        <w:t>Mql5 returns</w:t>
+      </w:r>
+    </w:p>
+    <w:p>
+      <w:pPr>
+        <w:pStyle w:val="Paragraphedeliste"/>
+        <w:numPr>
+          <w:ilvl w:val="5"/>
+          <w:numId w:val="1"/>
+        </w:numPr>
+        <w:rPr>
+          <w:rFonts w:ascii="Arial" w:eastAsiaTheme="majorEastAsia" w:hAnsi="Arial" w:cs="Arial"/>
+          <w:color w:val="70AD47" w:themeColor="accent6"/>
+          <w:sz w:val="22"/>
+          <w:szCs w:val="22"/>
+          <w:lang w:val="en-US"/>
+        </w:rPr>
+      </w:pPr>
+      <w:r>
+        <w:rPr>
+          <w:rFonts w:ascii="Arial" w:eastAsiaTheme="majorEastAsia" w:hAnsi="Arial" w:cs="Arial"/>
+          <w:color w:val="70AD47" w:themeColor="accent6"/>
+          <w:sz w:val="22"/>
+          <w:szCs w:val="22"/>
+          <w:lang w:val="en-US"/>
+        </w:rPr>
+        <w:t>Python returns</w:t>
+      </w:r>
+    </w:p>
+    <w:p>
+      <w:pPr>
+        <w:pStyle w:val="Paragraphedeliste"/>
+        <w:numPr>
+          <w:ilvl w:val="5"/>
+          <w:numId w:val="1"/>
+        </w:numPr>
+        <w:rPr>
+          <w:rFonts w:ascii="Arial" w:eastAsiaTheme="majorEastAsia" w:hAnsi="Arial" w:cs="Arial"/>
+          <w:color w:val="70AD47" w:themeColor="accent6"/>
+          <w:sz w:val="22"/>
+          <w:szCs w:val="22"/>
+          <w:lang w:val="en-US"/>
+        </w:rPr>
+      </w:pPr>
+      <w:r>
+        <w:rPr>
+          <w:rFonts w:ascii="Arial" w:eastAsiaTheme="majorEastAsia" w:hAnsi="Arial" w:cs="Arial"/>
+          <w:color w:val="70AD47" w:themeColor="accent6"/>
+          <w:sz w:val="22"/>
+          <w:szCs w:val="22"/>
+          <w:lang w:val="en-US"/>
+        </w:rPr>
+        <w:t>Python correlations</w:t>
+      </w:r>
+    </w:p>
+    <w:p>
+      <w:pPr>
+        <w:pStyle w:val="Paragraphedeliste"/>
+        <w:numPr>
+          <w:ilvl w:val="5"/>
+          <w:numId w:val="1"/>
+        </w:numPr>
+        <w:rPr>
+          <w:rFonts w:ascii="Arial" w:eastAsiaTheme="majorEastAsia" w:hAnsi="Arial" w:cs="Arial"/>
+          <w:color w:val="70AD47" w:themeColor="accent6"/>
+          <w:sz w:val="22"/>
+          <w:szCs w:val="22"/>
+          <w:lang w:val="en-US"/>
+        </w:rPr>
+      </w:pPr>
+      <w:r>
+        <w:rPr>
+          <w:rFonts w:ascii="Arial" w:eastAsiaTheme="majorEastAsia" w:hAnsi="Arial" w:cs="Arial"/>
+          <w:color w:val="70AD47" w:themeColor="accent6"/>
+          <w:sz w:val="22"/>
+          <w:szCs w:val="22"/>
+          <w:lang w:val="en-US"/>
+        </w:rPr>
+        <w:t>Python SL/TP Histogram</w:t>
+      </w:r>
+    </w:p>
+    <w:p>
+      <w:pPr>
+        <w:pStyle w:val="Paragraphedeliste"/>
+        <w:numPr>
+          <w:ilvl w:val="5"/>
+          <w:numId w:val="1"/>
+        </w:numPr>
+        <w:rPr>
+          <w:rFonts w:ascii="Arial" w:eastAsiaTheme="majorEastAsia" w:hAnsi="Arial" w:cs="Arial"/>
+          <w:color w:val="70AD47" w:themeColor="accent6"/>
+          <w:sz w:val="22"/>
+          <w:szCs w:val="22"/>
+          <w:lang w:val="en-US"/>
+        </w:rPr>
+      </w:pPr>
+      <w:r>
+        <w:rPr>
+          <w:rFonts w:ascii="Arial" w:eastAsiaTheme="majorEastAsia" w:hAnsi="Arial" w:cs="Arial"/>
+          <w:color w:val="70AD47" w:themeColor="accent6"/>
+          <w:sz w:val="22"/>
+          <w:szCs w:val="22"/>
+          <w:lang w:val="en-US"/>
+        </w:rPr>
+        <w:t>Python trade duration</w:t>
+      </w:r>
+    </w:p>
+    <w:p>
+      <w:pPr>
+        <w:pStyle w:val="Titre4"/>
+        <w:numPr>
+          <w:ilvl w:val="4"/>
+          <w:numId w:val="1"/>
+        </w:numPr>
+        <w:rPr>
+          <w:rFonts w:ascii="Arial" w:hAnsi="Arial" w:cs="Arial"/>
+          <w:lang w:val="en-US"/>
+        </w:rPr>
+      </w:pPr>
+      <w:r>
+        <w:rPr>
+          <w:rFonts w:ascii="Arial" w:hAnsi="Arial" w:cs="Arial"/>
+          <w:lang w:val="en-US"/>
+        </w:rPr>
+        <w:t>D1</w:t>
+      </w:r>
+    </w:p>
+    <w:p>
+      <w:pPr>
+        <w:pStyle w:val="Paragraphedeliste"/>
+        <w:numPr>
+          <w:ilvl w:val="5"/>
+          <w:numId w:val="1"/>
+        </w:numPr>
+        <w:rPr>
+          <w:rFonts w:ascii="Arial" w:eastAsiaTheme="majorEastAsia" w:hAnsi="Arial" w:cs="Arial"/>
+          <w:color w:val="70AD47" w:themeColor="accent6"/>
+          <w:sz w:val="22"/>
+          <w:szCs w:val="22"/>
+          <w:lang w:val="en-US"/>
+        </w:rPr>
+      </w:pPr>
+      <w:r>
+        <w:rPr>
+          <w:rFonts w:ascii="Arial" w:eastAsiaTheme="majorEastAsia" w:hAnsi="Arial" w:cs="Arial"/>
+          <w:color w:val="70AD47" w:themeColor="accent6"/>
+          <w:sz w:val="22"/>
+          <w:szCs w:val="22"/>
+          <w:lang w:val="en-US"/>
+        </w:rPr>
+        <w:t>Mql5 returns</w:t>
+      </w:r>
+    </w:p>
+    <w:p>
+      <w:pPr>
+        <w:pStyle w:val="Paragraphedeliste"/>
+        <w:numPr>
+          <w:ilvl w:val="5"/>
+          <w:numId w:val="1"/>
+        </w:numPr>
+        <w:rPr>
+          <w:rFonts w:ascii="Arial" w:eastAsiaTheme="majorEastAsia" w:hAnsi="Arial" w:cs="Arial"/>
+          <w:color w:val="70AD47" w:themeColor="accent6"/>
+          <w:sz w:val="22"/>
+          <w:szCs w:val="22"/>
+          <w:lang w:val="en-US"/>
+        </w:rPr>
+      </w:pPr>
+      <w:r>
+        <w:rPr>
+          <w:rFonts w:ascii="Arial" w:eastAsiaTheme="majorEastAsia" w:hAnsi="Arial" w:cs="Arial"/>
+          <w:color w:val="70AD47" w:themeColor="accent6"/>
+          <w:sz w:val="22"/>
+          <w:szCs w:val="22"/>
+          <w:lang w:val="en-US"/>
+        </w:rPr>
+        <w:t>Python returns</w:t>
+      </w:r>
+    </w:p>
+    <w:p>
+      <w:pPr>
+        <w:pStyle w:val="Paragraphedeliste"/>
+        <w:numPr>
+          <w:ilvl w:val="5"/>
+          <w:numId w:val="1"/>
+        </w:numPr>
+        <w:rPr>
+          <w:rFonts w:ascii="Arial" w:eastAsiaTheme="majorEastAsia" w:hAnsi="Arial" w:cs="Arial"/>
+          <w:color w:val="70AD47" w:themeColor="accent6"/>
+          <w:sz w:val="22"/>
+          <w:szCs w:val="22"/>
+          <w:lang w:val="en-US"/>
+        </w:rPr>
+      </w:pPr>
+      <w:r>
+        <w:rPr>
+          <w:rFonts w:ascii="Arial" w:eastAsiaTheme="majorEastAsia" w:hAnsi="Arial" w:cs="Arial"/>
+          <w:color w:val="70AD47" w:themeColor="accent6"/>
+          <w:sz w:val="22"/>
+          <w:szCs w:val="22"/>
+          <w:lang w:val="en-US"/>
+        </w:rPr>
+        <w:t>Python correlations</w:t>
+      </w:r>
+    </w:p>
+    <w:p>
+      <w:pPr>
+        <w:pStyle w:val="Paragraphedeliste"/>
+        <w:numPr>
+          <w:ilvl w:val="5"/>
+          <w:numId w:val="1"/>
+        </w:numPr>
+        <w:rPr>
+          <w:rFonts w:ascii="Arial" w:eastAsiaTheme="majorEastAsia" w:hAnsi="Arial" w:cs="Arial"/>
+          <w:color w:val="70AD47" w:themeColor="accent6"/>
+          <w:sz w:val="22"/>
+          <w:szCs w:val="22"/>
+          <w:lang w:val="en-US"/>
+        </w:rPr>
+      </w:pPr>
+      <w:r>
+        <w:rPr>
+          <w:rFonts w:ascii="Arial" w:eastAsiaTheme="majorEastAsia" w:hAnsi="Arial" w:cs="Arial"/>
+          <w:color w:val="70AD47" w:themeColor="accent6"/>
+          <w:sz w:val="22"/>
+          <w:szCs w:val="22"/>
+          <w:lang w:val="en-US"/>
+        </w:rPr>
+        <w:t>Python SL/TP Histogram</w:t>
+      </w:r>
+    </w:p>
+    <w:p>
+      <w:pPr>
+        <w:pStyle w:val="Paragraphedeliste"/>
+        <w:numPr>
+          <w:ilvl w:val="5"/>
+          <w:numId w:val="1"/>
+        </w:numPr>
+        <w:rPr>
+          <w:rFonts w:ascii="Arial" w:eastAsiaTheme="majorEastAsia" w:hAnsi="Arial" w:cs="Arial"/>
+          <w:color w:val="70AD47" w:themeColor="accent6"/>
+          <w:sz w:val="22"/>
+          <w:szCs w:val="22"/>
+          <w:lang w:val="en-US"/>
+        </w:rPr>
+      </w:pPr>
+      <w:r>
+        <w:rPr>
+          <w:rFonts w:ascii="Arial" w:eastAsiaTheme="majorEastAsia" w:hAnsi="Arial" w:cs="Arial"/>
+          <w:color w:val="70AD47" w:themeColor="accent6"/>
+          <w:sz w:val="22"/>
+          <w:szCs w:val="22"/>
+          <w:lang w:val="en-US"/>
+        </w:rPr>
+        <w:t>Python trade duration</w:t>
+      </w:r>
+    </w:p>
+    <w:p>
+      <w:pPr>
+        <w:pStyle w:val="Titre4"/>
+        <w:numPr>
+          <w:ilvl w:val="4"/>
+          <w:numId w:val="1"/>
+        </w:numPr>
+        <w:rPr>
+          <w:rFonts w:ascii="Arial" w:hAnsi="Arial" w:cs="Arial"/>
+          <w:lang w:val="en-US"/>
+        </w:rPr>
+      </w:pPr>
+      <w:r>
+        <w:rPr>
+          <w:rFonts w:ascii="Arial" w:hAnsi="Arial" w:cs="Arial"/>
+          <w:lang w:val="en-US"/>
+        </w:rPr>
+        <w:t>W1</w:t>
+      </w:r>
+    </w:p>
+    <w:p>
+      <w:pPr>
+        <w:pStyle w:val="Paragraphedeliste"/>
+        <w:numPr>
+          <w:ilvl w:val="5"/>
+          <w:numId w:val="1"/>
+        </w:numPr>
+        <w:rPr>
+          <w:rFonts w:ascii="Arial" w:eastAsiaTheme="majorEastAsia" w:hAnsi="Arial" w:cs="Arial"/>
+          <w:color w:val="70AD47" w:themeColor="accent6"/>
+          <w:sz w:val="22"/>
+          <w:szCs w:val="22"/>
+          <w:lang w:val="en-US"/>
+        </w:rPr>
+      </w:pPr>
+      <w:r>
+        <w:rPr>
+          <w:rFonts w:ascii="Arial" w:eastAsiaTheme="majorEastAsia" w:hAnsi="Arial" w:cs="Arial"/>
+          <w:color w:val="70AD47" w:themeColor="accent6"/>
+          <w:sz w:val="22"/>
+          <w:szCs w:val="22"/>
+          <w:lang w:val="en-US"/>
+        </w:rPr>
+        <w:t>Mql5 returns</w:t>
+      </w:r>
+    </w:p>
+    <w:p>
+      <w:pPr>
+        <w:pStyle w:val="Paragraphedeliste"/>
+        <w:numPr>
+          <w:ilvl w:val="5"/>
+          <w:numId w:val="1"/>
+        </w:numPr>
+        <w:rPr>
+          <w:rFonts w:ascii="Arial" w:eastAsiaTheme="majorEastAsia" w:hAnsi="Arial" w:cs="Arial"/>
+          <w:color w:val="70AD47" w:themeColor="accent6"/>
+          <w:sz w:val="22"/>
+          <w:szCs w:val="22"/>
+          <w:lang w:val="en-US"/>
+        </w:rPr>
+      </w:pPr>
+      <w:r>
+        <w:rPr>
+          <w:rFonts w:ascii="Arial" w:eastAsiaTheme="majorEastAsia" w:hAnsi="Arial" w:cs="Arial"/>
+          <w:color w:val="70AD47" w:themeColor="accent6"/>
+          <w:sz w:val="22"/>
+          <w:szCs w:val="22"/>
+          <w:lang w:val="en-US"/>
+        </w:rPr>
+        <w:t>Python returns</w:t>
+      </w:r>
+    </w:p>
+    <w:p>
+      <w:pPr>
+        <w:pStyle w:val="Paragraphedeliste"/>
+        <w:numPr>
+          <w:ilvl w:val="5"/>
+          <w:numId w:val="1"/>
+        </w:numPr>
+        <w:rPr>
+          <w:rFonts w:ascii="Arial" w:eastAsiaTheme="majorEastAsia" w:hAnsi="Arial" w:cs="Arial"/>
+          <w:color w:val="70AD47" w:themeColor="accent6"/>
+          <w:sz w:val="22"/>
+          <w:szCs w:val="22"/>
+          <w:lang w:val="en-US"/>
+        </w:rPr>
+      </w:pPr>
+      <w:r>
+        <w:rPr>
+          <w:rFonts w:ascii="Arial" w:eastAsiaTheme="majorEastAsia" w:hAnsi="Arial" w:cs="Arial"/>
+          <w:color w:val="70AD47" w:themeColor="accent6"/>
+          <w:sz w:val="22"/>
+          <w:szCs w:val="22"/>
+          <w:lang w:val="en-US"/>
+        </w:rPr>
+        <w:t>Python correlations</w:t>
+      </w:r>
+    </w:p>
+    <w:p>
+      <w:pPr>
+        <w:pStyle w:val="Paragraphedeliste"/>
+        <w:numPr>
+          <w:ilvl w:val="5"/>
+          <w:numId w:val="1"/>
+        </w:numPr>
+        <w:rPr>
+          <w:rFonts w:ascii="Arial" w:eastAsiaTheme="majorEastAsia" w:hAnsi="Arial" w:cs="Arial"/>
+          <w:color w:val="70AD47" w:themeColor="accent6"/>
+          <w:sz w:val="22"/>
+          <w:szCs w:val="22"/>
+          <w:lang w:val="en-US"/>
+        </w:rPr>
+      </w:pPr>
+      <w:r>
+        <w:rPr>
+          <w:rFonts w:ascii="Arial" w:eastAsiaTheme="majorEastAsia" w:hAnsi="Arial" w:cs="Arial"/>
+          <w:color w:val="70AD47" w:themeColor="accent6"/>
+          <w:sz w:val="22"/>
+          <w:szCs w:val="22"/>
+          <w:lang w:val="en-US"/>
+        </w:rPr>
+        <w:t>Python SL/TP Histogram</w:t>
+      </w:r>
+    </w:p>
+    <w:p>
+      <w:pPr>
+        <w:pStyle w:val="Paragraphedeliste"/>
+        <w:numPr>
+          <w:ilvl w:val="5"/>
+          <w:numId w:val="1"/>
+        </w:numPr>
+        <w:rPr>
+          <w:rFonts w:ascii="Arial" w:eastAsiaTheme="majorEastAsia" w:hAnsi="Arial" w:cs="Arial"/>
+          <w:color w:val="70AD47" w:themeColor="accent6"/>
+          <w:sz w:val="22"/>
+          <w:szCs w:val="22"/>
+          <w:lang w:val="en-US"/>
+        </w:rPr>
+      </w:pPr>
+      <w:r>
+        <w:rPr>
+          <w:rFonts w:ascii="Arial" w:eastAsiaTheme="majorEastAsia" w:hAnsi="Arial" w:cs="Arial"/>
+          <w:color w:val="70AD47" w:themeColor="accent6"/>
+          <w:sz w:val="22"/>
+          <w:szCs w:val="22"/>
+          <w:lang w:val="en-US"/>
+        </w:rPr>
+        <w:t>Python trade duration</w:t>
+      </w:r>
+    </w:p>
+    <w:p/>
+    <w:p>
+      <w:pPr>
+        <w:rPr>
+          <w:lang w:val="en-US"/>
+        </w:rPr>
+      </w:pPr>
+    </w:p>
+    <w:p>
+      <w:pPr>
+        <w:pStyle w:val="Titre4"/>
+        <w:numPr>
+          <w:ilvl w:val="3"/>
+          <w:numId w:val="1"/>
+        </w:numPr>
+        <w:rPr>
+          <w:rFonts w:ascii="Arial" w:hAnsi="Arial" w:cs="Arial"/>
+          <w:lang w:val="en-US"/>
+        </w:rPr>
+      </w:pPr>
+      <w:r>
+        <w:rPr>
+          <w:rFonts w:ascii="Arial" w:hAnsi="Arial" w:cs="Arial"/>
+          <w:lang w:val="en-US"/>
+        </w:rPr>
         <w:lastRenderedPageBreak/>
+        <w:t>50/200</w:t>
+      </w:r>
+    </w:p>
+    <w:p>
+      <w:pPr>
+        <w:pStyle w:val="Titre4"/>
+        <w:numPr>
+          <w:ilvl w:val="4"/>
+          <w:numId w:val="1"/>
+        </w:numPr>
+        <w:rPr>
+          <w:rFonts w:ascii="Arial" w:hAnsi="Arial" w:cs="Arial"/>
+          <w:lang w:val="en-US"/>
+        </w:rPr>
+      </w:pPr>
+      <w:r>
+        <w:rPr>
+          <w:rFonts w:ascii="Arial" w:hAnsi="Arial" w:cs="Arial"/>
+          <w:lang w:val="en-US"/>
+        </w:rPr>
+        <w:t>H1</w:t>
+      </w:r>
+    </w:p>
+    <w:p>
+      <w:pPr>
+        <w:pStyle w:val="Paragraphedeliste"/>
+        <w:numPr>
+          <w:ilvl w:val="5"/>
+          <w:numId w:val="1"/>
+        </w:numPr>
+        <w:rPr>
+          <w:rFonts w:ascii="Arial" w:eastAsiaTheme="majorEastAsia" w:hAnsi="Arial" w:cs="Arial"/>
+          <w:color w:val="70AD47" w:themeColor="accent6"/>
+          <w:sz w:val="22"/>
+          <w:szCs w:val="22"/>
+          <w:lang w:val="en-US"/>
+        </w:rPr>
+      </w:pPr>
+      <w:r>
+        <w:rPr>
+          <w:rFonts w:ascii="Arial" w:eastAsiaTheme="majorEastAsia" w:hAnsi="Arial" w:cs="Arial"/>
+          <w:color w:val="70AD47" w:themeColor="accent6"/>
+          <w:sz w:val="22"/>
+          <w:szCs w:val="22"/>
+          <w:lang w:val="en-US"/>
+        </w:rPr>
+        <w:t>Mql5 returns</w:t>
+      </w:r>
+    </w:p>
+    <w:p>
+      <w:pPr>
+        <w:pStyle w:val="Paragraphedeliste"/>
+        <w:numPr>
+          <w:ilvl w:val="5"/>
+          <w:numId w:val="1"/>
+        </w:numPr>
+        <w:rPr>
+          <w:rFonts w:ascii="Arial" w:eastAsiaTheme="majorEastAsia" w:hAnsi="Arial" w:cs="Arial"/>
+          <w:color w:val="70AD47" w:themeColor="accent6"/>
+          <w:sz w:val="22"/>
+          <w:szCs w:val="22"/>
+          <w:lang w:val="en-US"/>
+        </w:rPr>
+      </w:pPr>
+      <w:r>
+        <w:rPr>
+          <w:rFonts w:ascii="Arial" w:eastAsiaTheme="majorEastAsia" w:hAnsi="Arial" w:cs="Arial"/>
+          <w:color w:val="70AD47" w:themeColor="accent6"/>
+          <w:sz w:val="22"/>
+          <w:szCs w:val="22"/>
+          <w:lang w:val="en-US"/>
+        </w:rPr>
         <w:t>Python returns</w:t>
       </w:r>
     </w:p>
@@ -3360,7 +5280,147 @@
       <w:pPr>
         <w:pStyle w:val="Paragraphedeliste"/>
         <w:numPr>
-          <w:ilvl w:val="6"/>
+          <w:ilvl w:val="5"/>
+          <w:numId w:val="1"/>
+        </w:numPr>
+        <w:rPr>
+          <w:rFonts w:ascii="Arial" w:eastAsiaTheme="majorEastAsia" w:hAnsi="Arial" w:cs="Arial"/>
+          <w:color w:val="70AD47" w:themeColor="accent6"/>
+          <w:sz w:val="22"/>
+          <w:szCs w:val="22"/>
+          <w:lang w:val="en-US"/>
+        </w:rPr>
+      </w:pPr>
+    </w:p>
+    <w:p>
+      <w:pPr>
+        <w:pStyle w:val="Titre4"/>
+        <w:numPr>
+          <w:ilvl w:val="4"/>
+          <w:numId w:val="1"/>
+        </w:numPr>
+        <w:rPr>
+          <w:rFonts w:ascii="Arial" w:hAnsi="Arial" w:cs="Arial"/>
+          <w:lang w:val="en-US"/>
+        </w:rPr>
+      </w:pPr>
+      <w:r>
+        <w:rPr>
+          <w:rFonts w:ascii="Arial" w:hAnsi="Arial" w:cs="Arial"/>
+          <w:lang w:val="en-US"/>
+        </w:rPr>
+        <w:t>H4</w:t>
+      </w:r>
+    </w:p>
+    <w:p>
+      <w:pPr>
+        <w:pStyle w:val="Paragraphedeliste"/>
+        <w:numPr>
+          <w:ilvl w:val="5"/>
+          <w:numId w:val="1"/>
+        </w:numPr>
+        <w:rPr>
+          <w:rFonts w:ascii="Arial" w:eastAsiaTheme="majorEastAsia" w:hAnsi="Arial" w:cs="Arial"/>
+          <w:color w:val="70AD47" w:themeColor="accent6"/>
+          <w:sz w:val="22"/>
+          <w:szCs w:val="22"/>
+          <w:lang w:val="en-US"/>
+        </w:rPr>
+      </w:pPr>
+      <w:r>
+        <w:rPr>
+          <w:rFonts w:ascii="Arial" w:eastAsiaTheme="majorEastAsia" w:hAnsi="Arial" w:cs="Arial"/>
+          <w:color w:val="70AD47" w:themeColor="accent6"/>
+          <w:sz w:val="22"/>
+          <w:szCs w:val="22"/>
+          <w:lang w:val="en-US"/>
+        </w:rPr>
+        <w:t>Mql5 returns</w:t>
+      </w:r>
+    </w:p>
+    <w:p>
+      <w:pPr>
+        <w:pStyle w:val="Paragraphedeliste"/>
+        <w:numPr>
+          <w:ilvl w:val="5"/>
+          <w:numId w:val="1"/>
+        </w:numPr>
+        <w:rPr>
+          <w:rFonts w:ascii="Arial" w:eastAsiaTheme="majorEastAsia" w:hAnsi="Arial" w:cs="Arial"/>
+          <w:color w:val="70AD47" w:themeColor="accent6"/>
+          <w:sz w:val="22"/>
+          <w:szCs w:val="22"/>
+          <w:lang w:val="en-US"/>
+        </w:rPr>
+      </w:pPr>
+      <w:r>
+        <w:rPr>
+          <w:rFonts w:ascii="Arial" w:eastAsiaTheme="majorEastAsia" w:hAnsi="Arial" w:cs="Arial"/>
+          <w:color w:val="70AD47" w:themeColor="accent6"/>
+          <w:sz w:val="22"/>
+          <w:szCs w:val="22"/>
+          <w:lang w:val="en-US"/>
+        </w:rPr>
+        <w:t>Python returns</w:t>
+      </w:r>
+    </w:p>
+    <w:p>
+      <w:pPr>
+        <w:pStyle w:val="Paragraphedeliste"/>
+        <w:numPr>
+          <w:ilvl w:val="5"/>
+          <w:numId w:val="1"/>
+        </w:numPr>
+        <w:rPr>
+          <w:rFonts w:ascii="Arial" w:eastAsiaTheme="majorEastAsia" w:hAnsi="Arial" w:cs="Arial"/>
+          <w:color w:val="70AD47" w:themeColor="accent6"/>
+          <w:sz w:val="22"/>
+          <w:szCs w:val="22"/>
+          <w:lang w:val="en-US"/>
+        </w:rPr>
+      </w:pPr>
+      <w:r>
+        <w:rPr>
+          <w:rFonts w:ascii="Arial" w:eastAsiaTheme="majorEastAsia" w:hAnsi="Arial" w:cs="Arial"/>
+          <w:color w:val="70AD47" w:themeColor="accent6"/>
+          <w:sz w:val="22"/>
+          <w:szCs w:val="22"/>
+          <w:lang w:val="en-US"/>
+        </w:rPr>
+        <w:t>Python correlations</w:t>
+      </w:r>
+    </w:p>
+    <w:p>
+      <w:pPr>
+        <w:pStyle w:val="Paragraphedeliste"/>
+        <w:numPr>
+          <w:ilvl w:val="5"/>
+          <w:numId w:val="1"/>
+        </w:numPr>
+        <w:rPr>
+          <w:rFonts w:ascii="Arial" w:eastAsiaTheme="majorEastAsia" w:hAnsi="Arial" w:cs="Arial"/>
+          <w:color w:val="70AD47" w:themeColor="accent6"/>
+          <w:sz w:val="22"/>
+          <w:szCs w:val="22"/>
+          <w:lang w:val="en-US"/>
+        </w:rPr>
+      </w:pPr>
+      <w:r>
+        <w:rPr>
+          <w:rFonts w:ascii="Arial" w:eastAsiaTheme="majorEastAsia" w:hAnsi="Arial" w:cs="Arial"/>
+          <w:color w:val="70AD47" w:themeColor="accent6"/>
+          <w:sz w:val="22"/>
+          <w:szCs w:val="22"/>
+          <w:lang w:val="en-US"/>
+        </w:rPr>
+        <w:t>Python SL/TP Histogram</w:t>
+      </w:r>
+    </w:p>
+    <w:p>
+      <w:pPr>
+        <w:pStyle w:val="Paragraphedeliste"/>
+        <w:numPr>
+          <w:ilvl w:val="5"/>
           <w:numId w:val="1"/>
         </w:numPr>
         <w:rPr>
@@ -3399,7 +5459,7 @@
           <w:rFonts w:ascii="Arial" w:hAnsi="Arial" w:cs="Arial"/>
           <w:lang w:val="en-US"/>
         </w:rPr>
-        <w:t>H4</w:t>
+        <w:t>D1</w:t>
       </w:r>
     </w:p>
     <w:p>
@@ -3549,7 +5609,7 @@
           <w:rFonts w:ascii="Arial" w:hAnsi="Arial" w:cs="Arial"/>
           <w:lang w:val="en-US"/>
         </w:rPr>
-        <w:t>D1</w:t>
+        <w:t>W1</w:t>
       </w:r>
     </w:p>
     <w:p>
@@ -3684,1412 +5744,6 @@
     </w:p>
     <w:p>
       <w:pPr>
-        <w:pStyle w:val="Titre4"/>
-        <w:numPr>
-          <w:ilvl w:val="4"/>
-          <w:numId w:val="1"/>
-        </w:numPr>
-        <w:rPr>
-          <w:rFonts w:ascii="Arial" w:hAnsi="Arial" w:cs="Arial"/>
-          <w:lang w:val="en-US"/>
-        </w:rPr>
-      </w:pPr>
-      <w:r>
-        <w:rPr>
-          <w:rFonts w:ascii="Arial" w:hAnsi="Arial" w:cs="Arial"/>
-          <w:lang w:val="en-US"/>
-        </w:rPr>
-        <w:t>W1</w:t>
-      </w:r>
-    </w:p>
-    <w:p>
-      <w:pPr>
-        <w:pStyle w:val="Paragraphedeliste"/>
-        <w:numPr>
-          <w:ilvl w:val="5"/>
-          <w:numId w:val="1"/>
-        </w:numPr>
-        <w:rPr>
-          <w:rFonts w:ascii="Arial" w:eastAsiaTheme="majorEastAsia" w:hAnsi="Arial" w:cs="Arial"/>
-          <w:color w:val="70AD47" w:themeColor="accent6"/>
-          <w:sz w:val="22"/>
-          <w:szCs w:val="22"/>
-          <w:lang w:val="en-US"/>
-        </w:rPr>
-      </w:pPr>
-      <w:r>
-        <w:rPr>
-          <w:rFonts w:ascii="Arial" w:eastAsiaTheme="majorEastAsia" w:hAnsi="Arial" w:cs="Arial"/>
-          <w:color w:val="70AD47" w:themeColor="accent6"/>
-          <w:sz w:val="22"/>
-          <w:szCs w:val="22"/>
-          <w:lang w:val="en-US"/>
-        </w:rPr>
-        <w:t>Mql5 returns</w:t>
-      </w:r>
-    </w:p>
-    <w:p>
-      <w:pPr>
-        <w:pStyle w:val="Paragraphedeliste"/>
-        <w:numPr>
-          <w:ilvl w:val="5"/>
-          <w:numId w:val="1"/>
-        </w:numPr>
-        <w:rPr>
-          <w:rFonts w:ascii="Arial" w:eastAsiaTheme="majorEastAsia" w:hAnsi="Arial" w:cs="Arial"/>
-          <w:color w:val="70AD47" w:themeColor="accent6"/>
-          <w:sz w:val="22"/>
-          <w:szCs w:val="22"/>
-          <w:lang w:val="en-US"/>
-        </w:rPr>
-      </w:pPr>
-      <w:r>
-        <w:rPr>
-          <w:rFonts w:ascii="Arial" w:eastAsiaTheme="majorEastAsia" w:hAnsi="Arial" w:cs="Arial"/>
-          <w:color w:val="70AD47" w:themeColor="accent6"/>
-          <w:sz w:val="22"/>
-          <w:szCs w:val="22"/>
-          <w:lang w:val="en-US"/>
-        </w:rPr>
-        <w:t>Python returns</w:t>
-      </w:r>
-    </w:p>
-    <w:p>
-      <w:pPr>
-        <w:pStyle w:val="Paragraphedeliste"/>
-        <w:numPr>
-          <w:ilvl w:val="5"/>
-          <w:numId w:val="1"/>
-        </w:numPr>
-        <w:rPr>
-          <w:rFonts w:ascii="Arial" w:eastAsiaTheme="majorEastAsia" w:hAnsi="Arial" w:cs="Arial"/>
-          <w:color w:val="70AD47" w:themeColor="accent6"/>
-          <w:sz w:val="22"/>
-          <w:szCs w:val="22"/>
-          <w:lang w:val="en-US"/>
-        </w:rPr>
-      </w:pPr>
-      <w:r>
-        <w:rPr>
-          <w:rFonts w:ascii="Arial" w:eastAsiaTheme="majorEastAsia" w:hAnsi="Arial" w:cs="Arial"/>
-          <w:color w:val="70AD47" w:themeColor="accent6"/>
-          <w:sz w:val="22"/>
-          <w:szCs w:val="22"/>
-          <w:lang w:val="en-US"/>
-        </w:rPr>
-        <w:t>Python correlations</w:t>
-      </w:r>
-    </w:p>
-    <w:p>
-      <w:pPr>
-        <w:pStyle w:val="Paragraphedeliste"/>
-        <w:numPr>
-          <w:ilvl w:val="5"/>
-          <w:numId w:val="1"/>
-        </w:numPr>
-        <w:rPr>
-          <w:rFonts w:ascii="Arial" w:eastAsiaTheme="majorEastAsia" w:hAnsi="Arial" w:cs="Arial"/>
-          <w:color w:val="70AD47" w:themeColor="accent6"/>
-          <w:sz w:val="22"/>
-          <w:szCs w:val="22"/>
-          <w:lang w:val="en-US"/>
-        </w:rPr>
-      </w:pPr>
-      <w:r>
-        <w:rPr>
-          <w:rFonts w:ascii="Arial" w:eastAsiaTheme="majorEastAsia" w:hAnsi="Arial" w:cs="Arial"/>
-          <w:color w:val="70AD47" w:themeColor="accent6"/>
-          <w:sz w:val="22"/>
-          <w:szCs w:val="22"/>
-          <w:lang w:val="en-US"/>
-        </w:rPr>
-        <w:t>Python SL/TP Histogram</w:t>
-      </w:r>
-    </w:p>
-    <w:p>
-      <w:pPr>
-        <w:pStyle w:val="Paragraphedeliste"/>
-        <w:numPr>
-          <w:ilvl w:val="5"/>
-          <w:numId w:val="1"/>
-        </w:numPr>
-        <w:rPr>
-          <w:rFonts w:ascii="Arial" w:eastAsiaTheme="majorEastAsia" w:hAnsi="Arial" w:cs="Arial"/>
-          <w:color w:val="70AD47" w:themeColor="accent6"/>
-          <w:sz w:val="22"/>
-          <w:szCs w:val="22"/>
-          <w:lang w:val="en-US"/>
-        </w:rPr>
-      </w:pPr>
-      <w:r>
-        <w:rPr>
-          <w:rFonts w:ascii="Arial" w:eastAsiaTheme="majorEastAsia" w:hAnsi="Arial" w:cs="Arial"/>
-          <w:color w:val="70AD47" w:themeColor="accent6"/>
-          <w:sz w:val="22"/>
-          <w:szCs w:val="22"/>
-          <w:lang w:val="en-US"/>
-        </w:rPr>
-        <w:t>Python trade duration</w:t>
-      </w:r>
-    </w:p>
-    <w:p>
-      <w:pPr>
-        <w:pStyle w:val="Titre4"/>
-        <w:numPr>
-          <w:ilvl w:val="3"/>
-          <w:numId w:val="1"/>
-        </w:numPr>
-        <w:rPr>
-          <w:rFonts w:ascii="Arial" w:hAnsi="Arial" w:cs="Arial"/>
-          <w:lang w:val="en-US"/>
-        </w:rPr>
-      </w:pPr>
-      <w:r>
-        <w:rPr>
-          <w:rFonts w:ascii="Arial" w:hAnsi="Arial" w:cs="Arial"/>
-          <w:lang w:val="en-US"/>
-        </w:rPr>
-        <w:t>21/50</w:t>
-      </w:r>
-    </w:p>
-    <w:p>
-      <w:pPr>
-        <w:pStyle w:val="Titre4"/>
-        <w:numPr>
-          <w:ilvl w:val="4"/>
-          <w:numId w:val="1"/>
-        </w:numPr>
-        <w:rPr>
-          <w:rFonts w:ascii="Arial" w:hAnsi="Arial" w:cs="Arial"/>
-          <w:lang w:val="en-US"/>
-        </w:rPr>
-      </w:pPr>
-      <w:r>
-        <w:rPr>
-          <w:rFonts w:ascii="Arial" w:hAnsi="Arial" w:cs="Arial"/>
-          <w:lang w:val="en-US"/>
-        </w:rPr>
-        <w:t>H1</w:t>
-      </w:r>
-    </w:p>
-    <w:p>
-      <w:pPr>
-        <w:pStyle w:val="Paragraphedeliste"/>
-        <w:numPr>
-          <w:ilvl w:val="5"/>
-          <w:numId w:val="1"/>
-        </w:numPr>
-        <w:rPr>
-          <w:rFonts w:ascii="Arial" w:eastAsiaTheme="majorEastAsia" w:hAnsi="Arial" w:cs="Arial"/>
-          <w:color w:val="70AD47" w:themeColor="accent6"/>
-          <w:sz w:val="22"/>
-          <w:szCs w:val="22"/>
-          <w:lang w:val="en-US"/>
-        </w:rPr>
-      </w:pPr>
-      <w:r>
-        <w:rPr>
-          <w:rFonts w:ascii="Arial" w:eastAsiaTheme="majorEastAsia" w:hAnsi="Arial" w:cs="Arial"/>
-          <w:color w:val="70AD47" w:themeColor="accent6"/>
-          <w:sz w:val="22"/>
-          <w:szCs w:val="22"/>
-          <w:lang w:val="en-US"/>
-        </w:rPr>
-        <w:t>Mql5 returns</w:t>
-      </w:r>
-    </w:p>
-    <w:p>
-      <w:pPr>
-        <w:pStyle w:val="Paragraphedeliste"/>
-        <w:numPr>
-          <w:ilvl w:val="5"/>
-          <w:numId w:val="1"/>
-        </w:numPr>
-        <w:rPr>
-          <w:rFonts w:ascii="Arial" w:eastAsiaTheme="majorEastAsia" w:hAnsi="Arial" w:cs="Arial"/>
-          <w:color w:val="70AD47" w:themeColor="accent6"/>
-          <w:sz w:val="22"/>
-          <w:szCs w:val="22"/>
-          <w:lang w:val="en-US"/>
-        </w:rPr>
-      </w:pPr>
-      <w:r>
-        <w:rPr>
-          <w:rFonts w:ascii="Arial" w:eastAsiaTheme="majorEastAsia" w:hAnsi="Arial" w:cs="Arial"/>
-          <w:color w:val="70AD47" w:themeColor="accent6"/>
-          <w:sz w:val="22"/>
-          <w:szCs w:val="22"/>
-          <w:lang w:val="en-US"/>
-        </w:rPr>
-        <w:t>Python returns</w:t>
-      </w:r>
-    </w:p>
-    <w:p>
-      <w:pPr>
-        <w:pStyle w:val="Paragraphedeliste"/>
-        <w:numPr>
-          <w:ilvl w:val="5"/>
-          <w:numId w:val="1"/>
-        </w:numPr>
-        <w:rPr>
-          <w:rFonts w:ascii="Arial" w:eastAsiaTheme="majorEastAsia" w:hAnsi="Arial" w:cs="Arial"/>
-          <w:color w:val="70AD47" w:themeColor="accent6"/>
-          <w:sz w:val="22"/>
-          <w:szCs w:val="22"/>
-          <w:lang w:val="en-US"/>
-        </w:rPr>
-      </w:pPr>
-      <w:r>
-        <w:rPr>
-          <w:rFonts w:ascii="Arial" w:eastAsiaTheme="majorEastAsia" w:hAnsi="Arial" w:cs="Arial"/>
-          <w:color w:val="70AD47" w:themeColor="accent6"/>
-          <w:sz w:val="22"/>
-          <w:szCs w:val="22"/>
-          <w:lang w:val="en-US"/>
-        </w:rPr>
-        <w:t>Python correlations</w:t>
-      </w:r>
-    </w:p>
-    <w:p>
-      <w:pPr>
-        <w:pStyle w:val="Paragraphedeliste"/>
-        <w:numPr>
-          <w:ilvl w:val="5"/>
-          <w:numId w:val="1"/>
-        </w:numPr>
-        <w:rPr>
-          <w:rFonts w:ascii="Arial" w:eastAsiaTheme="majorEastAsia" w:hAnsi="Arial" w:cs="Arial"/>
-          <w:color w:val="70AD47" w:themeColor="accent6"/>
-          <w:sz w:val="22"/>
-          <w:szCs w:val="22"/>
-          <w:lang w:val="en-US"/>
-        </w:rPr>
-      </w:pPr>
-      <w:r>
-        <w:rPr>
-          <w:rFonts w:ascii="Arial" w:eastAsiaTheme="majorEastAsia" w:hAnsi="Arial" w:cs="Arial"/>
-          <w:color w:val="70AD47" w:themeColor="accent6"/>
-          <w:sz w:val="22"/>
-          <w:szCs w:val="22"/>
-          <w:lang w:val="en-US"/>
-        </w:rPr>
-        <w:t>Python SL/TP Histogram</w:t>
-      </w:r>
-    </w:p>
-    <w:p>
-      <w:pPr>
-        <w:pStyle w:val="Paragraphedeliste"/>
-        <w:numPr>
-          <w:ilvl w:val="6"/>
-          <w:numId w:val="1"/>
-        </w:numPr>
-        <w:rPr>
-          <w:rFonts w:ascii="Arial" w:eastAsiaTheme="majorEastAsia" w:hAnsi="Arial" w:cs="Arial"/>
-          <w:color w:val="70AD47" w:themeColor="accent6"/>
-          <w:sz w:val="22"/>
-          <w:szCs w:val="22"/>
-          <w:lang w:val="en-US"/>
-        </w:rPr>
-      </w:pPr>
-      <w:r>
-        <w:rPr>
-          <w:rFonts w:ascii="Arial" w:eastAsiaTheme="majorEastAsia" w:hAnsi="Arial" w:cs="Arial"/>
-          <w:color w:val="70AD47" w:themeColor="accent6"/>
-          <w:sz w:val="22"/>
-          <w:szCs w:val="22"/>
-          <w:lang w:val="en-US"/>
-        </w:rPr>
-        <w:t>Python trade duration</w:t>
-      </w:r>
-    </w:p>
-    <w:p>
-      <w:pPr>
-        <w:pStyle w:val="Titre4"/>
-        <w:numPr>
-          <w:ilvl w:val="4"/>
-          <w:numId w:val="1"/>
-        </w:numPr>
-        <w:rPr>
-          <w:rFonts w:ascii="Arial" w:hAnsi="Arial" w:cs="Arial"/>
-          <w:lang w:val="en-US"/>
-        </w:rPr>
-      </w:pPr>
-      <w:r>
-        <w:rPr>
-          <w:rFonts w:ascii="Arial" w:hAnsi="Arial" w:cs="Arial"/>
-          <w:lang w:val="en-US"/>
-        </w:rPr>
-        <w:t>H4</w:t>
-      </w:r>
-    </w:p>
-    <w:p>
-      <w:pPr>
-        <w:pStyle w:val="Paragraphedeliste"/>
-        <w:numPr>
-          <w:ilvl w:val="5"/>
-          <w:numId w:val="1"/>
-        </w:numPr>
-        <w:rPr>
-          <w:rFonts w:ascii="Arial" w:eastAsiaTheme="majorEastAsia" w:hAnsi="Arial" w:cs="Arial"/>
-          <w:color w:val="70AD47" w:themeColor="accent6"/>
-          <w:sz w:val="22"/>
-          <w:szCs w:val="22"/>
-          <w:lang w:val="en-US"/>
-        </w:rPr>
-      </w:pPr>
-      <w:r>
-        <w:rPr>
-          <w:rFonts w:ascii="Arial" w:eastAsiaTheme="majorEastAsia" w:hAnsi="Arial" w:cs="Arial"/>
-          <w:color w:val="70AD47" w:themeColor="accent6"/>
-          <w:sz w:val="22"/>
-          <w:szCs w:val="22"/>
-          <w:lang w:val="en-US"/>
-        </w:rPr>
-        <w:t>Mql5 returns</w:t>
-      </w:r>
-    </w:p>
-    <w:p>
-      <w:pPr>
-        <w:pStyle w:val="Paragraphedeliste"/>
-        <w:numPr>
-          <w:ilvl w:val="5"/>
-          <w:numId w:val="1"/>
-        </w:numPr>
-        <w:rPr>
-          <w:rFonts w:ascii="Arial" w:eastAsiaTheme="majorEastAsia" w:hAnsi="Arial" w:cs="Arial"/>
-          <w:color w:val="70AD47" w:themeColor="accent6"/>
-          <w:sz w:val="22"/>
-          <w:szCs w:val="22"/>
-          <w:lang w:val="en-US"/>
-        </w:rPr>
-      </w:pPr>
-      <w:r>
-        <w:rPr>
-          <w:rFonts w:ascii="Arial" w:eastAsiaTheme="majorEastAsia" w:hAnsi="Arial" w:cs="Arial"/>
-          <w:color w:val="70AD47" w:themeColor="accent6"/>
-          <w:sz w:val="22"/>
-          <w:szCs w:val="22"/>
-          <w:lang w:val="en-US"/>
-        </w:rPr>
-        <w:t>Python returns</w:t>
-      </w:r>
-    </w:p>
-    <w:p>
-      <w:pPr>
-        <w:pStyle w:val="Paragraphedeliste"/>
-        <w:numPr>
-          <w:ilvl w:val="5"/>
-          <w:numId w:val="1"/>
-        </w:numPr>
-        <w:rPr>
-          <w:rFonts w:ascii="Arial" w:eastAsiaTheme="majorEastAsia" w:hAnsi="Arial" w:cs="Arial"/>
-          <w:color w:val="70AD47" w:themeColor="accent6"/>
-          <w:sz w:val="22"/>
-          <w:szCs w:val="22"/>
-          <w:lang w:val="en-US"/>
-        </w:rPr>
-      </w:pPr>
-      <w:r>
-        <w:rPr>
-          <w:rFonts w:ascii="Arial" w:eastAsiaTheme="majorEastAsia" w:hAnsi="Arial" w:cs="Arial"/>
-          <w:color w:val="70AD47" w:themeColor="accent6"/>
-          <w:sz w:val="22"/>
-          <w:szCs w:val="22"/>
-          <w:lang w:val="en-US"/>
-        </w:rPr>
-        <w:t>Python correlations</w:t>
-      </w:r>
-    </w:p>
-    <w:p>
-      <w:pPr>
-        <w:pStyle w:val="Paragraphedeliste"/>
-        <w:numPr>
-          <w:ilvl w:val="5"/>
-          <w:numId w:val="1"/>
-        </w:numPr>
-        <w:rPr>
-          <w:rFonts w:ascii="Arial" w:eastAsiaTheme="majorEastAsia" w:hAnsi="Arial" w:cs="Arial"/>
-          <w:color w:val="70AD47" w:themeColor="accent6"/>
-          <w:sz w:val="22"/>
-          <w:szCs w:val="22"/>
-          <w:lang w:val="en-US"/>
-        </w:rPr>
-      </w:pPr>
-      <w:r>
-        <w:rPr>
-          <w:rFonts w:ascii="Arial" w:eastAsiaTheme="majorEastAsia" w:hAnsi="Arial" w:cs="Arial"/>
-          <w:color w:val="70AD47" w:themeColor="accent6"/>
-          <w:sz w:val="22"/>
-          <w:szCs w:val="22"/>
-          <w:lang w:val="en-US"/>
-        </w:rPr>
-        <w:t>Python SL/TP Histogram</w:t>
-      </w:r>
-    </w:p>
-    <w:p>
-      <w:pPr>
-        <w:pStyle w:val="Paragraphedeliste"/>
-        <w:numPr>
-          <w:ilvl w:val="5"/>
-          <w:numId w:val="1"/>
-        </w:numPr>
-        <w:rPr>
-          <w:rFonts w:ascii="Arial" w:eastAsiaTheme="majorEastAsia" w:hAnsi="Arial" w:cs="Arial"/>
-          <w:color w:val="70AD47" w:themeColor="accent6"/>
-          <w:sz w:val="22"/>
-          <w:szCs w:val="22"/>
-          <w:lang w:val="en-US"/>
-        </w:rPr>
-      </w:pPr>
-      <w:r>
-        <w:rPr>
-          <w:rFonts w:ascii="Arial" w:eastAsiaTheme="majorEastAsia" w:hAnsi="Arial" w:cs="Arial"/>
-          <w:color w:val="70AD47" w:themeColor="accent6"/>
-          <w:sz w:val="22"/>
-          <w:szCs w:val="22"/>
-          <w:lang w:val="en-US"/>
-        </w:rPr>
-        <w:t>Python trade duration</w:t>
-      </w:r>
-    </w:p>
-    <w:p>
-      <w:pPr>
-        <w:pStyle w:val="Titre4"/>
-        <w:numPr>
-          <w:ilvl w:val="4"/>
-          <w:numId w:val="1"/>
-        </w:numPr>
-        <w:rPr>
-          <w:rFonts w:ascii="Arial" w:hAnsi="Arial" w:cs="Arial"/>
-          <w:lang w:val="en-US"/>
-        </w:rPr>
-      </w:pPr>
-      <w:r>
-        <w:rPr>
-          <w:rFonts w:ascii="Arial" w:hAnsi="Arial" w:cs="Arial"/>
-          <w:lang w:val="en-US"/>
-        </w:rPr>
-        <w:t>D1</w:t>
-      </w:r>
-    </w:p>
-    <w:p>
-      <w:pPr>
-        <w:pStyle w:val="Paragraphedeliste"/>
-        <w:numPr>
-          <w:ilvl w:val="5"/>
-          <w:numId w:val="1"/>
-        </w:numPr>
-        <w:rPr>
-          <w:rFonts w:ascii="Arial" w:eastAsiaTheme="majorEastAsia" w:hAnsi="Arial" w:cs="Arial"/>
-          <w:color w:val="70AD47" w:themeColor="accent6"/>
-          <w:sz w:val="22"/>
-          <w:szCs w:val="22"/>
-          <w:lang w:val="en-US"/>
-        </w:rPr>
-      </w:pPr>
-      <w:r>
-        <w:rPr>
-          <w:rFonts w:ascii="Arial" w:eastAsiaTheme="majorEastAsia" w:hAnsi="Arial" w:cs="Arial"/>
-          <w:color w:val="70AD47" w:themeColor="accent6"/>
-          <w:sz w:val="22"/>
-          <w:szCs w:val="22"/>
-          <w:lang w:val="en-US"/>
-        </w:rPr>
-        <w:t>Mql5 returns</w:t>
-      </w:r>
-    </w:p>
-    <w:p>
-      <w:pPr>
-        <w:pStyle w:val="Paragraphedeliste"/>
-        <w:numPr>
-          <w:ilvl w:val="5"/>
-          <w:numId w:val="1"/>
-        </w:numPr>
-        <w:rPr>
-          <w:rFonts w:ascii="Arial" w:eastAsiaTheme="majorEastAsia" w:hAnsi="Arial" w:cs="Arial"/>
-          <w:color w:val="70AD47" w:themeColor="accent6"/>
-          <w:sz w:val="22"/>
-          <w:szCs w:val="22"/>
-          <w:lang w:val="en-US"/>
-        </w:rPr>
-      </w:pPr>
-      <w:r>
-        <w:rPr>
-          <w:rFonts w:ascii="Arial" w:eastAsiaTheme="majorEastAsia" w:hAnsi="Arial" w:cs="Arial"/>
-          <w:color w:val="70AD47" w:themeColor="accent6"/>
-          <w:sz w:val="22"/>
-          <w:szCs w:val="22"/>
-          <w:lang w:val="en-US"/>
-        </w:rPr>
-        <w:t>Python returns</w:t>
-      </w:r>
-    </w:p>
-    <w:p>
-      <w:pPr>
-        <w:pStyle w:val="Paragraphedeliste"/>
-        <w:numPr>
-          <w:ilvl w:val="5"/>
-          <w:numId w:val="1"/>
-        </w:numPr>
-        <w:rPr>
-          <w:rFonts w:ascii="Arial" w:eastAsiaTheme="majorEastAsia" w:hAnsi="Arial" w:cs="Arial"/>
-          <w:color w:val="70AD47" w:themeColor="accent6"/>
-          <w:sz w:val="22"/>
-          <w:szCs w:val="22"/>
-          <w:lang w:val="en-US"/>
-        </w:rPr>
-      </w:pPr>
-      <w:r>
-        <w:rPr>
-          <w:rFonts w:ascii="Arial" w:eastAsiaTheme="majorEastAsia" w:hAnsi="Arial" w:cs="Arial"/>
-          <w:color w:val="70AD47" w:themeColor="accent6"/>
-          <w:sz w:val="22"/>
-          <w:szCs w:val="22"/>
-          <w:lang w:val="en-US"/>
-        </w:rPr>
-        <w:t>Python correlations</w:t>
-      </w:r>
-    </w:p>
-    <w:p>
-      <w:pPr>
-        <w:pStyle w:val="Paragraphedeliste"/>
-        <w:numPr>
-          <w:ilvl w:val="5"/>
-          <w:numId w:val="1"/>
-        </w:numPr>
-        <w:rPr>
-          <w:rFonts w:ascii="Arial" w:eastAsiaTheme="majorEastAsia" w:hAnsi="Arial" w:cs="Arial"/>
-          <w:color w:val="70AD47" w:themeColor="accent6"/>
-          <w:sz w:val="22"/>
-          <w:szCs w:val="22"/>
-          <w:lang w:val="en-US"/>
-        </w:rPr>
-      </w:pPr>
-      <w:r>
-        <w:rPr>
-          <w:rFonts w:ascii="Arial" w:eastAsiaTheme="majorEastAsia" w:hAnsi="Arial" w:cs="Arial"/>
-          <w:color w:val="70AD47" w:themeColor="accent6"/>
-          <w:sz w:val="22"/>
-          <w:szCs w:val="22"/>
-          <w:lang w:val="en-US"/>
-        </w:rPr>
-        <w:t>Python SL/TP Histogram</w:t>
-      </w:r>
-    </w:p>
-    <w:p>
-      <w:pPr>
-        <w:pStyle w:val="Paragraphedeliste"/>
-        <w:numPr>
-          <w:ilvl w:val="5"/>
-          <w:numId w:val="1"/>
-        </w:numPr>
-        <w:rPr>
-          <w:rFonts w:ascii="Arial" w:eastAsiaTheme="majorEastAsia" w:hAnsi="Arial" w:cs="Arial"/>
-          <w:color w:val="70AD47" w:themeColor="accent6"/>
-          <w:sz w:val="22"/>
-          <w:szCs w:val="22"/>
-          <w:lang w:val="en-US"/>
-        </w:rPr>
-      </w:pPr>
-      <w:r>
-        <w:rPr>
-          <w:rFonts w:ascii="Arial" w:eastAsiaTheme="majorEastAsia" w:hAnsi="Arial" w:cs="Arial"/>
-          <w:color w:val="70AD47" w:themeColor="accent6"/>
-          <w:sz w:val="22"/>
-          <w:szCs w:val="22"/>
-          <w:lang w:val="en-US"/>
-        </w:rPr>
-        <w:t>Python trade duration</w:t>
-      </w:r>
-    </w:p>
-    <w:p>
-      <w:pPr>
-        <w:pStyle w:val="Titre4"/>
-        <w:numPr>
-          <w:ilvl w:val="4"/>
-          <w:numId w:val="1"/>
-        </w:numPr>
-        <w:rPr>
-          <w:rFonts w:ascii="Arial" w:hAnsi="Arial" w:cs="Arial"/>
-          <w:lang w:val="en-US"/>
-        </w:rPr>
-      </w:pPr>
-      <w:r>
-        <w:rPr>
-          <w:rFonts w:ascii="Arial" w:hAnsi="Arial" w:cs="Arial"/>
-          <w:lang w:val="en-US"/>
-        </w:rPr>
-        <w:lastRenderedPageBreak/>
-        <w:t>W1</w:t>
-      </w:r>
-    </w:p>
-    <w:p>
-      <w:pPr>
-        <w:pStyle w:val="Paragraphedeliste"/>
-        <w:numPr>
-          <w:ilvl w:val="5"/>
-          <w:numId w:val="1"/>
-        </w:numPr>
-        <w:rPr>
-          <w:rFonts w:ascii="Arial" w:eastAsiaTheme="majorEastAsia" w:hAnsi="Arial" w:cs="Arial"/>
-          <w:color w:val="70AD47" w:themeColor="accent6"/>
-          <w:sz w:val="22"/>
-          <w:szCs w:val="22"/>
-          <w:lang w:val="en-US"/>
-        </w:rPr>
-      </w:pPr>
-      <w:r>
-        <w:rPr>
-          <w:rFonts w:ascii="Arial" w:eastAsiaTheme="majorEastAsia" w:hAnsi="Arial" w:cs="Arial"/>
-          <w:color w:val="70AD47" w:themeColor="accent6"/>
-          <w:sz w:val="22"/>
-          <w:szCs w:val="22"/>
-          <w:lang w:val="en-US"/>
-        </w:rPr>
-        <w:t>Mql5 returns</w:t>
-      </w:r>
-    </w:p>
-    <w:p>
-      <w:pPr>
-        <w:pStyle w:val="Paragraphedeliste"/>
-        <w:numPr>
-          <w:ilvl w:val="5"/>
-          <w:numId w:val="1"/>
-        </w:numPr>
-        <w:rPr>
-          <w:rFonts w:ascii="Arial" w:eastAsiaTheme="majorEastAsia" w:hAnsi="Arial" w:cs="Arial"/>
-          <w:color w:val="70AD47" w:themeColor="accent6"/>
-          <w:sz w:val="22"/>
-          <w:szCs w:val="22"/>
-          <w:lang w:val="en-US"/>
-        </w:rPr>
-      </w:pPr>
-      <w:r>
-        <w:rPr>
-          <w:rFonts w:ascii="Arial" w:eastAsiaTheme="majorEastAsia" w:hAnsi="Arial" w:cs="Arial"/>
-          <w:color w:val="70AD47" w:themeColor="accent6"/>
-          <w:sz w:val="22"/>
-          <w:szCs w:val="22"/>
-          <w:lang w:val="en-US"/>
-        </w:rPr>
-        <w:t>Python returns</w:t>
-      </w:r>
-    </w:p>
-    <w:p>
-      <w:pPr>
-        <w:pStyle w:val="Paragraphedeliste"/>
-        <w:numPr>
-          <w:ilvl w:val="5"/>
-          <w:numId w:val="1"/>
-        </w:numPr>
-        <w:rPr>
-          <w:rFonts w:ascii="Arial" w:eastAsiaTheme="majorEastAsia" w:hAnsi="Arial" w:cs="Arial"/>
-          <w:color w:val="70AD47" w:themeColor="accent6"/>
-          <w:sz w:val="22"/>
-          <w:szCs w:val="22"/>
-          <w:lang w:val="en-US"/>
-        </w:rPr>
-      </w:pPr>
-      <w:r>
-        <w:rPr>
-          <w:rFonts w:ascii="Arial" w:eastAsiaTheme="majorEastAsia" w:hAnsi="Arial" w:cs="Arial"/>
-          <w:color w:val="70AD47" w:themeColor="accent6"/>
-          <w:sz w:val="22"/>
-          <w:szCs w:val="22"/>
-          <w:lang w:val="en-US"/>
-        </w:rPr>
-        <w:t>Python correlations</w:t>
-      </w:r>
-    </w:p>
-    <w:p>
-      <w:pPr>
-        <w:pStyle w:val="Paragraphedeliste"/>
-        <w:numPr>
-          <w:ilvl w:val="5"/>
-          <w:numId w:val="1"/>
-        </w:numPr>
-        <w:rPr>
-          <w:rFonts w:ascii="Arial" w:eastAsiaTheme="majorEastAsia" w:hAnsi="Arial" w:cs="Arial"/>
-          <w:color w:val="70AD47" w:themeColor="accent6"/>
-          <w:sz w:val="22"/>
-          <w:szCs w:val="22"/>
-          <w:lang w:val="en-US"/>
-        </w:rPr>
-      </w:pPr>
-      <w:r>
-        <w:rPr>
-          <w:rFonts w:ascii="Arial" w:eastAsiaTheme="majorEastAsia" w:hAnsi="Arial" w:cs="Arial"/>
-          <w:color w:val="70AD47" w:themeColor="accent6"/>
-          <w:sz w:val="22"/>
-          <w:szCs w:val="22"/>
-          <w:lang w:val="en-US"/>
-        </w:rPr>
-        <w:t>Python SL/TP Histogram</w:t>
-      </w:r>
-    </w:p>
-    <w:p>
-      <w:pPr>
-        <w:pStyle w:val="Paragraphedeliste"/>
-        <w:numPr>
-          <w:ilvl w:val="5"/>
-          <w:numId w:val="1"/>
-        </w:numPr>
-        <w:rPr>
-          <w:rFonts w:ascii="Arial" w:eastAsiaTheme="majorEastAsia" w:hAnsi="Arial" w:cs="Arial"/>
-          <w:color w:val="70AD47" w:themeColor="accent6"/>
-          <w:sz w:val="22"/>
-          <w:szCs w:val="22"/>
-          <w:lang w:val="en-US"/>
-        </w:rPr>
-      </w:pPr>
-      <w:r>
-        <w:rPr>
-          <w:rFonts w:ascii="Arial" w:eastAsiaTheme="majorEastAsia" w:hAnsi="Arial" w:cs="Arial"/>
-          <w:color w:val="70AD47" w:themeColor="accent6"/>
-          <w:sz w:val="22"/>
-          <w:szCs w:val="22"/>
-          <w:lang w:val="en-US"/>
-        </w:rPr>
-        <w:t>Python trade duration</w:t>
-      </w:r>
-    </w:p>
-    <w:p>
-      <w:pPr>
-        <w:rPr>
-          <w:lang w:val="en-US"/>
-        </w:rPr>
-      </w:pPr>
-    </w:p>
-    <w:p>
-      <w:pPr>
-        <w:pStyle w:val="Titre4"/>
-        <w:numPr>
-          <w:ilvl w:val="3"/>
-          <w:numId w:val="1"/>
-        </w:numPr>
-        <w:rPr>
-          <w:rFonts w:ascii="Arial" w:hAnsi="Arial" w:cs="Arial"/>
-          <w:lang w:val="en-US"/>
-        </w:rPr>
-      </w:pPr>
-      <w:r>
-        <w:rPr>
-          <w:rFonts w:ascii="Arial" w:hAnsi="Arial" w:cs="Arial"/>
-          <w:lang w:val="en-US"/>
-        </w:rPr>
-        <w:t>50/160</w:t>
-      </w:r>
-    </w:p>
-    <w:p>
-      <w:pPr>
-        <w:pStyle w:val="Titre4"/>
-        <w:numPr>
-          <w:ilvl w:val="4"/>
-          <w:numId w:val="1"/>
-        </w:numPr>
-        <w:rPr>
-          <w:rFonts w:ascii="Arial" w:hAnsi="Arial" w:cs="Arial"/>
-          <w:lang w:val="en-US"/>
-        </w:rPr>
-      </w:pPr>
-      <w:r>
-        <w:rPr>
-          <w:rFonts w:ascii="Arial" w:hAnsi="Arial" w:cs="Arial"/>
-          <w:lang w:val="en-US"/>
-        </w:rPr>
-        <w:t>H1</w:t>
-      </w:r>
-    </w:p>
-    <w:p>
-      <w:pPr>
-        <w:pStyle w:val="Paragraphedeliste"/>
-        <w:numPr>
-          <w:ilvl w:val="5"/>
-          <w:numId w:val="1"/>
-        </w:numPr>
-        <w:rPr>
-          <w:rFonts w:ascii="Arial" w:eastAsiaTheme="majorEastAsia" w:hAnsi="Arial" w:cs="Arial"/>
-          <w:color w:val="70AD47" w:themeColor="accent6"/>
-          <w:sz w:val="22"/>
-          <w:szCs w:val="22"/>
-          <w:lang w:val="en-US"/>
-        </w:rPr>
-      </w:pPr>
-      <w:r>
-        <w:rPr>
-          <w:rFonts w:ascii="Arial" w:eastAsiaTheme="majorEastAsia" w:hAnsi="Arial" w:cs="Arial"/>
-          <w:color w:val="70AD47" w:themeColor="accent6"/>
-          <w:sz w:val="22"/>
-          <w:szCs w:val="22"/>
-          <w:lang w:val="en-US"/>
-        </w:rPr>
-        <w:t>Mql5 returns</w:t>
-      </w:r>
-    </w:p>
-    <w:p>
-      <w:pPr>
-        <w:pStyle w:val="Paragraphedeliste"/>
-        <w:numPr>
-          <w:ilvl w:val="5"/>
-          <w:numId w:val="1"/>
-        </w:numPr>
-        <w:rPr>
-          <w:rFonts w:ascii="Arial" w:eastAsiaTheme="majorEastAsia" w:hAnsi="Arial" w:cs="Arial"/>
-          <w:color w:val="70AD47" w:themeColor="accent6"/>
-          <w:sz w:val="22"/>
-          <w:szCs w:val="22"/>
-          <w:lang w:val="en-US"/>
-        </w:rPr>
-      </w:pPr>
-      <w:r>
-        <w:rPr>
-          <w:rFonts w:ascii="Arial" w:eastAsiaTheme="majorEastAsia" w:hAnsi="Arial" w:cs="Arial"/>
-          <w:color w:val="70AD47" w:themeColor="accent6"/>
-          <w:sz w:val="22"/>
-          <w:szCs w:val="22"/>
-          <w:lang w:val="en-US"/>
-        </w:rPr>
-        <w:t>Python returns</w:t>
-      </w:r>
-    </w:p>
-    <w:p>
-      <w:pPr>
-        <w:pStyle w:val="Paragraphedeliste"/>
-        <w:numPr>
-          <w:ilvl w:val="5"/>
-          <w:numId w:val="1"/>
-        </w:numPr>
-        <w:rPr>
-          <w:rFonts w:ascii="Arial" w:eastAsiaTheme="majorEastAsia" w:hAnsi="Arial" w:cs="Arial"/>
-          <w:color w:val="70AD47" w:themeColor="accent6"/>
-          <w:sz w:val="22"/>
-          <w:szCs w:val="22"/>
-          <w:lang w:val="en-US"/>
-        </w:rPr>
-      </w:pPr>
-      <w:r>
-        <w:rPr>
-          <w:rFonts w:ascii="Arial" w:eastAsiaTheme="majorEastAsia" w:hAnsi="Arial" w:cs="Arial"/>
-          <w:color w:val="70AD47" w:themeColor="accent6"/>
-          <w:sz w:val="22"/>
-          <w:szCs w:val="22"/>
-          <w:lang w:val="en-US"/>
-        </w:rPr>
-        <w:t>Python correlations</w:t>
-      </w:r>
-    </w:p>
-    <w:p>
-      <w:pPr>
-        <w:pStyle w:val="Paragraphedeliste"/>
-        <w:numPr>
-          <w:ilvl w:val="5"/>
-          <w:numId w:val="1"/>
-        </w:numPr>
-        <w:rPr>
-          <w:rFonts w:ascii="Arial" w:eastAsiaTheme="majorEastAsia" w:hAnsi="Arial" w:cs="Arial"/>
-          <w:color w:val="70AD47" w:themeColor="accent6"/>
-          <w:sz w:val="22"/>
-          <w:szCs w:val="22"/>
-          <w:lang w:val="en-US"/>
-        </w:rPr>
-      </w:pPr>
-      <w:r>
-        <w:rPr>
-          <w:rFonts w:ascii="Arial" w:eastAsiaTheme="majorEastAsia" w:hAnsi="Arial" w:cs="Arial"/>
-          <w:color w:val="70AD47" w:themeColor="accent6"/>
-          <w:sz w:val="22"/>
-          <w:szCs w:val="22"/>
-          <w:lang w:val="en-US"/>
-        </w:rPr>
-        <w:t>Python SL/TP Histogram</w:t>
-      </w:r>
-    </w:p>
-    <w:p>
-      <w:pPr>
-        <w:pStyle w:val="Paragraphedeliste"/>
-        <w:numPr>
-          <w:ilvl w:val="6"/>
-          <w:numId w:val="1"/>
-        </w:numPr>
-        <w:rPr>
-          <w:rFonts w:ascii="Arial" w:eastAsiaTheme="majorEastAsia" w:hAnsi="Arial" w:cs="Arial"/>
-          <w:color w:val="70AD47" w:themeColor="accent6"/>
-          <w:sz w:val="22"/>
-          <w:szCs w:val="22"/>
-          <w:lang w:val="en-US"/>
-        </w:rPr>
-      </w:pPr>
-      <w:r>
-        <w:rPr>
-          <w:rFonts w:ascii="Arial" w:eastAsiaTheme="majorEastAsia" w:hAnsi="Arial" w:cs="Arial"/>
-          <w:color w:val="70AD47" w:themeColor="accent6"/>
-          <w:sz w:val="22"/>
-          <w:szCs w:val="22"/>
-          <w:lang w:val="en-US"/>
-        </w:rPr>
-        <w:t>Python trade duration</w:t>
-      </w:r>
-    </w:p>
-    <w:p>
-      <w:pPr>
-        <w:pStyle w:val="Titre4"/>
-        <w:numPr>
-          <w:ilvl w:val="4"/>
-          <w:numId w:val="1"/>
-        </w:numPr>
-        <w:rPr>
-          <w:rFonts w:ascii="Arial" w:hAnsi="Arial" w:cs="Arial"/>
-          <w:lang w:val="en-US"/>
-        </w:rPr>
-      </w:pPr>
-      <w:r>
-        <w:rPr>
-          <w:rFonts w:ascii="Arial" w:hAnsi="Arial" w:cs="Arial"/>
-          <w:lang w:val="en-US"/>
-        </w:rPr>
-        <w:t>H4</w:t>
-      </w:r>
-    </w:p>
-    <w:p>
-      <w:pPr>
-        <w:pStyle w:val="Paragraphedeliste"/>
-        <w:numPr>
-          <w:ilvl w:val="5"/>
-          <w:numId w:val="1"/>
-        </w:numPr>
-        <w:rPr>
-          <w:rFonts w:ascii="Arial" w:eastAsiaTheme="majorEastAsia" w:hAnsi="Arial" w:cs="Arial"/>
-          <w:color w:val="70AD47" w:themeColor="accent6"/>
-          <w:sz w:val="22"/>
-          <w:szCs w:val="22"/>
-          <w:lang w:val="en-US"/>
-        </w:rPr>
-      </w:pPr>
-      <w:r>
-        <w:rPr>
-          <w:rFonts w:ascii="Arial" w:eastAsiaTheme="majorEastAsia" w:hAnsi="Arial" w:cs="Arial"/>
-          <w:color w:val="70AD47" w:themeColor="accent6"/>
-          <w:sz w:val="22"/>
-          <w:szCs w:val="22"/>
-          <w:lang w:val="en-US"/>
-        </w:rPr>
-        <w:t>Mql5 returns</w:t>
-      </w:r>
-    </w:p>
-    <w:p>
-      <w:pPr>
-        <w:pStyle w:val="Paragraphedeliste"/>
-        <w:numPr>
-          <w:ilvl w:val="5"/>
-          <w:numId w:val="1"/>
-        </w:numPr>
-        <w:rPr>
-          <w:rFonts w:ascii="Arial" w:eastAsiaTheme="majorEastAsia" w:hAnsi="Arial" w:cs="Arial"/>
-          <w:color w:val="70AD47" w:themeColor="accent6"/>
-          <w:sz w:val="22"/>
-          <w:szCs w:val="22"/>
-          <w:lang w:val="en-US"/>
-        </w:rPr>
-      </w:pPr>
-      <w:r>
-        <w:rPr>
-          <w:rFonts w:ascii="Arial" w:eastAsiaTheme="majorEastAsia" w:hAnsi="Arial" w:cs="Arial"/>
-          <w:color w:val="70AD47" w:themeColor="accent6"/>
-          <w:sz w:val="22"/>
-          <w:szCs w:val="22"/>
-          <w:lang w:val="en-US"/>
-        </w:rPr>
-        <w:t>Python returns</w:t>
-      </w:r>
-    </w:p>
-    <w:p>
-      <w:pPr>
-        <w:pStyle w:val="Paragraphedeliste"/>
-        <w:numPr>
-          <w:ilvl w:val="5"/>
-          <w:numId w:val="1"/>
-        </w:numPr>
-        <w:rPr>
-          <w:rFonts w:ascii="Arial" w:eastAsiaTheme="majorEastAsia" w:hAnsi="Arial" w:cs="Arial"/>
-          <w:color w:val="70AD47" w:themeColor="accent6"/>
-          <w:sz w:val="22"/>
-          <w:szCs w:val="22"/>
-          <w:lang w:val="en-US"/>
-        </w:rPr>
-      </w:pPr>
-      <w:r>
-        <w:rPr>
-          <w:rFonts w:ascii="Arial" w:eastAsiaTheme="majorEastAsia" w:hAnsi="Arial" w:cs="Arial"/>
-          <w:color w:val="70AD47" w:themeColor="accent6"/>
-          <w:sz w:val="22"/>
-          <w:szCs w:val="22"/>
-          <w:lang w:val="en-US"/>
-        </w:rPr>
-        <w:t>Python correlations</w:t>
-      </w:r>
-    </w:p>
-    <w:p>
-      <w:pPr>
-        <w:pStyle w:val="Paragraphedeliste"/>
-        <w:numPr>
-          <w:ilvl w:val="5"/>
-          <w:numId w:val="1"/>
-        </w:numPr>
-        <w:rPr>
-          <w:rFonts w:ascii="Arial" w:eastAsiaTheme="majorEastAsia" w:hAnsi="Arial" w:cs="Arial"/>
-          <w:color w:val="70AD47" w:themeColor="accent6"/>
-          <w:sz w:val="22"/>
-          <w:szCs w:val="22"/>
-          <w:lang w:val="en-US"/>
-        </w:rPr>
-      </w:pPr>
-      <w:r>
-        <w:rPr>
-          <w:rFonts w:ascii="Arial" w:eastAsiaTheme="majorEastAsia" w:hAnsi="Arial" w:cs="Arial"/>
-          <w:color w:val="70AD47" w:themeColor="accent6"/>
-          <w:sz w:val="22"/>
-          <w:szCs w:val="22"/>
-          <w:lang w:val="en-US"/>
-        </w:rPr>
-        <w:t>Python SL/TP Histogram</w:t>
-      </w:r>
-    </w:p>
-    <w:p>
-      <w:pPr>
-        <w:pStyle w:val="Paragraphedeliste"/>
-        <w:numPr>
-          <w:ilvl w:val="5"/>
-          <w:numId w:val="1"/>
-        </w:numPr>
-        <w:rPr>
-          <w:rFonts w:ascii="Arial" w:eastAsiaTheme="majorEastAsia" w:hAnsi="Arial" w:cs="Arial"/>
-          <w:color w:val="70AD47" w:themeColor="accent6"/>
-          <w:sz w:val="22"/>
-          <w:szCs w:val="22"/>
-          <w:lang w:val="en-US"/>
-        </w:rPr>
-      </w:pPr>
-      <w:r>
-        <w:rPr>
-          <w:rFonts w:ascii="Arial" w:eastAsiaTheme="majorEastAsia" w:hAnsi="Arial" w:cs="Arial"/>
-          <w:color w:val="70AD47" w:themeColor="accent6"/>
-          <w:sz w:val="22"/>
-          <w:szCs w:val="22"/>
-          <w:lang w:val="en-US"/>
-        </w:rPr>
-        <w:t>Python trade duration</w:t>
-      </w:r>
-    </w:p>
-    <w:p>
-      <w:pPr>
-        <w:pStyle w:val="Titre4"/>
-        <w:numPr>
-          <w:ilvl w:val="4"/>
-          <w:numId w:val="1"/>
-        </w:numPr>
-        <w:rPr>
-          <w:rFonts w:ascii="Arial" w:hAnsi="Arial" w:cs="Arial"/>
-          <w:lang w:val="en-US"/>
-        </w:rPr>
-      </w:pPr>
-      <w:r>
-        <w:rPr>
-          <w:rFonts w:ascii="Arial" w:hAnsi="Arial" w:cs="Arial"/>
-          <w:lang w:val="en-US"/>
-        </w:rPr>
-        <w:t>D1</w:t>
-      </w:r>
-    </w:p>
-    <w:p>
-      <w:pPr>
-        <w:pStyle w:val="Paragraphedeliste"/>
-        <w:numPr>
-          <w:ilvl w:val="5"/>
-          <w:numId w:val="1"/>
-        </w:numPr>
-        <w:rPr>
-          <w:rFonts w:ascii="Arial" w:eastAsiaTheme="majorEastAsia" w:hAnsi="Arial" w:cs="Arial"/>
-          <w:color w:val="70AD47" w:themeColor="accent6"/>
-          <w:sz w:val="22"/>
-          <w:szCs w:val="22"/>
-          <w:lang w:val="en-US"/>
-        </w:rPr>
-      </w:pPr>
-      <w:r>
-        <w:rPr>
-          <w:rFonts w:ascii="Arial" w:eastAsiaTheme="majorEastAsia" w:hAnsi="Arial" w:cs="Arial"/>
-          <w:color w:val="70AD47" w:themeColor="accent6"/>
-          <w:sz w:val="22"/>
-          <w:szCs w:val="22"/>
-          <w:lang w:val="en-US"/>
-        </w:rPr>
-        <w:t>Mql5 returns</w:t>
-      </w:r>
-    </w:p>
-    <w:p>
-      <w:pPr>
-        <w:pStyle w:val="Paragraphedeliste"/>
-        <w:numPr>
-          <w:ilvl w:val="5"/>
-          <w:numId w:val="1"/>
-        </w:numPr>
-        <w:rPr>
-          <w:rFonts w:ascii="Arial" w:eastAsiaTheme="majorEastAsia" w:hAnsi="Arial" w:cs="Arial"/>
-          <w:color w:val="70AD47" w:themeColor="accent6"/>
-          <w:sz w:val="22"/>
-          <w:szCs w:val="22"/>
-          <w:lang w:val="en-US"/>
-        </w:rPr>
-      </w:pPr>
-      <w:r>
-        <w:rPr>
-          <w:rFonts w:ascii="Arial" w:eastAsiaTheme="majorEastAsia" w:hAnsi="Arial" w:cs="Arial"/>
-          <w:color w:val="70AD47" w:themeColor="accent6"/>
-          <w:sz w:val="22"/>
-          <w:szCs w:val="22"/>
-          <w:lang w:val="en-US"/>
-        </w:rPr>
-        <w:t>Python returns</w:t>
-      </w:r>
-    </w:p>
-    <w:p>
-      <w:pPr>
-        <w:pStyle w:val="Paragraphedeliste"/>
-        <w:numPr>
-          <w:ilvl w:val="5"/>
-          <w:numId w:val="1"/>
-        </w:numPr>
-        <w:rPr>
-          <w:rFonts w:ascii="Arial" w:eastAsiaTheme="majorEastAsia" w:hAnsi="Arial" w:cs="Arial"/>
-          <w:color w:val="70AD47" w:themeColor="accent6"/>
-          <w:sz w:val="22"/>
-          <w:szCs w:val="22"/>
-          <w:lang w:val="en-US"/>
-        </w:rPr>
-      </w:pPr>
-      <w:r>
-        <w:rPr>
-          <w:rFonts w:ascii="Arial" w:eastAsiaTheme="majorEastAsia" w:hAnsi="Arial" w:cs="Arial"/>
-          <w:color w:val="70AD47" w:themeColor="accent6"/>
-          <w:sz w:val="22"/>
-          <w:szCs w:val="22"/>
-          <w:lang w:val="en-US"/>
-        </w:rPr>
-        <w:t>Python correlations</w:t>
-      </w:r>
-    </w:p>
-    <w:p>
-      <w:pPr>
-        <w:pStyle w:val="Paragraphedeliste"/>
-        <w:numPr>
-          <w:ilvl w:val="5"/>
-          <w:numId w:val="1"/>
-        </w:numPr>
-        <w:rPr>
-          <w:rFonts w:ascii="Arial" w:eastAsiaTheme="majorEastAsia" w:hAnsi="Arial" w:cs="Arial"/>
-          <w:color w:val="70AD47" w:themeColor="accent6"/>
-          <w:sz w:val="22"/>
-          <w:szCs w:val="22"/>
-          <w:lang w:val="en-US"/>
-        </w:rPr>
-      </w:pPr>
-      <w:r>
-        <w:rPr>
-          <w:rFonts w:ascii="Arial" w:eastAsiaTheme="majorEastAsia" w:hAnsi="Arial" w:cs="Arial"/>
-          <w:color w:val="70AD47" w:themeColor="accent6"/>
-          <w:sz w:val="22"/>
-          <w:szCs w:val="22"/>
-          <w:lang w:val="en-US"/>
-        </w:rPr>
-        <w:t>Python SL/TP Histogram</w:t>
-      </w:r>
-    </w:p>
-    <w:p>
-      <w:pPr>
-        <w:pStyle w:val="Paragraphedeliste"/>
-        <w:numPr>
-          <w:ilvl w:val="5"/>
-          <w:numId w:val="1"/>
-        </w:numPr>
-        <w:rPr>
-          <w:rFonts w:ascii="Arial" w:eastAsiaTheme="majorEastAsia" w:hAnsi="Arial" w:cs="Arial"/>
-          <w:color w:val="70AD47" w:themeColor="accent6"/>
-          <w:sz w:val="22"/>
-          <w:szCs w:val="22"/>
-          <w:lang w:val="en-US"/>
-        </w:rPr>
-      </w:pPr>
-      <w:r>
-        <w:rPr>
-          <w:rFonts w:ascii="Arial" w:eastAsiaTheme="majorEastAsia" w:hAnsi="Arial" w:cs="Arial"/>
-          <w:color w:val="70AD47" w:themeColor="accent6"/>
-          <w:sz w:val="22"/>
-          <w:szCs w:val="22"/>
-          <w:lang w:val="en-US"/>
-        </w:rPr>
-        <w:t>Python trade duration</w:t>
-      </w:r>
-    </w:p>
-    <w:p>
-      <w:pPr>
-        <w:pStyle w:val="Titre4"/>
-        <w:numPr>
-          <w:ilvl w:val="4"/>
-          <w:numId w:val="1"/>
-        </w:numPr>
-        <w:rPr>
-          <w:rFonts w:ascii="Arial" w:hAnsi="Arial" w:cs="Arial"/>
-          <w:lang w:val="en-US"/>
-        </w:rPr>
-      </w:pPr>
-      <w:r>
-        <w:rPr>
-          <w:rFonts w:ascii="Arial" w:hAnsi="Arial" w:cs="Arial"/>
-          <w:lang w:val="en-US"/>
-        </w:rPr>
-        <w:t>W1</w:t>
-      </w:r>
-    </w:p>
-    <w:p>
-      <w:pPr>
-        <w:pStyle w:val="Paragraphedeliste"/>
-        <w:numPr>
-          <w:ilvl w:val="5"/>
-          <w:numId w:val="1"/>
-        </w:numPr>
-        <w:rPr>
-          <w:rFonts w:ascii="Arial" w:eastAsiaTheme="majorEastAsia" w:hAnsi="Arial" w:cs="Arial"/>
-          <w:color w:val="70AD47" w:themeColor="accent6"/>
-          <w:sz w:val="22"/>
-          <w:szCs w:val="22"/>
-          <w:lang w:val="en-US"/>
-        </w:rPr>
-      </w:pPr>
-      <w:r>
-        <w:rPr>
-          <w:rFonts w:ascii="Arial" w:eastAsiaTheme="majorEastAsia" w:hAnsi="Arial" w:cs="Arial"/>
-          <w:color w:val="70AD47" w:themeColor="accent6"/>
-          <w:sz w:val="22"/>
-          <w:szCs w:val="22"/>
-          <w:lang w:val="en-US"/>
-        </w:rPr>
-        <w:t>Mql5 returns</w:t>
-      </w:r>
-    </w:p>
-    <w:p>
-      <w:pPr>
-        <w:pStyle w:val="Paragraphedeliste"/>
-        <w:numPr>
-          <w:ilvl w:val="5"/>
-          <w:numId w:val="1"/>
-        </w:numPr>
-        <w:rPr>
-          <w:rFonts w:ascii="Arial" w:eastAsiaTheme="majorEastAsia" w:hAnsi="Arial" w:cs="Arial"/>
-          <w:color w:val="70AD47" w:themeColor="accent6"/>
-          <w:sz w:val="22"/>
-          <w:szCs w:val="22"/>
-          <w:lang w:val="en-US"/>
-        </w:rPr>
-      </w:pPr>
-      <w:r>
-        <w:rPr>
-          <w:rFonts w:ascii="Arial" w:eastAsiaTheme="majorEastAsia" w:hAnsi="Arial" w:cs="Arial"/>
-          <w:color w:val="70AD47" w:themeColor="accent6"/>
-          <w:sz w:val="22"/>
-          <w:szCs w:val="22"/>
-          <w:lang w:val="en-US"/>
-        </w:rPr>
-        <w:t>Python returns</w:t>
-      </w:r>
-    </w:p>
-    <w:p>
-      <w:pPr>
-        <w:pStyle w:val="Paragraphedeliste"/>
-        <w:numPr>
-          <w:ilvl w:val="5"/>
-          <w:numId w:val="1"/>
-        </w:numPr>
-        <w:rPr>
-          <w:rFonts w:ascii="Arial" w:eastAsiaTheme="majorEastAsia" w:hAnsi="Arial" w:cs="Arial"/>
-          <w:color w:val="70AD47" w:themeColor="accent6"/>
-          <w:sz w:val="22"/>
-          <w:szCs w:val="22"/>
-          <w:lang w:val="en-US"/>
-        </w:rPr>
-      </w:pPr>
-      <w:r>
-        <w:rPr>
-          <w:rFonts w:ascii="Arial" w:eastAsiaTheme="majorEastAsia" w:hAnsi="Arial" w:cs="Arial"/>
-          <w:color w:val="70AD47" w:themeColor="accent6"/>
-          <w:sz w:val="22"/>
-          <w:szCs w:val="22"/>
-          <w:lang w:val="en-US"/>
-        </w:rPr>
-        <w:t>Python correlations</w:t>
-      </w:r>
-    </w:p>
-    <w:p>
-      <w:pPr>
-        <w:pStyle w:val="Paragraphedeliste"/>
-        <w:numPr>
-          <w:ilvl w:val="5"/>
-          <w:numId w:val="1"/>
-        </w:numPr>
-        <w:rPr>
-          <w:rFonts w:ascii="Arial" w:eastAsiaTheme="majorEastAsia" w:hAnsi="Arial" w:cs="Arial"/>
-          <w:color w:val="70AD47" w:themeColor="accent6"/>
-          <w:sz w:val="22"/>
-          <w:szCs w:val="22"/>
-          <w:lang w:val="en-US"/>
-        </w:rPr>
-      </w:pPr>
-      <w:r>
-        <w:rPr>
-          <w:rFonts w:ascii="Arial" w:eastAsiaTheme="majorEastAsia" w:hAnsi="Arial" w:cs="Arial"/>
-          <w:color w:val="70AD47" w:themeColor="accent6"/>
-          <w:sz w:val="22"/>
-          <w:szCs w:val="22"/>
-          <w:lang w:val="en-US"/>
-        </w:rPr>
-        <w:t>Python SL/TP Histogram</w:t>
-      </w:r>
-    </w:p>
-    <w:p>
-      <w:pPr>
-        <w:pStyle w:val="Paragraphedeliste"/>
-        <w:numPr>
-          <w:ilvl w:val="5"/>
-          <w:numId w:val="1"/>
-        </w:numPr>
-        <w:rPr>
-          <w:rFonts w:ascii="Arial" w:eastAsiaTheme="majorEastAsia" w:hAnsi="Arial" w:cs="Arial"/>
-          <w:color w:val="70AD47" w:themeColor="accent6"/>
-          <w:sz w:val="22"/>
-          <w:szCs w:val="22"/>
-          <w:lang w:val="en-US"/>
-        </w:rPr>
-      </w:pPr>
-      <w:r>
-        <w:rPr>
-          <w:rFonts w:ascii="Arial" w:eastAsiaTheme="majorEastAsia" w:hAnsi="Arial" w:cs="Arial"/>
-          <w:color w:val="70AD47" w:themeColor="accent6"/>
-          <w:sz w:val="22"/>
-          <w:szCs w:val="22"/>
-          <w:lang w:val="en-US"/>
-        </w:rPr>
-        <w:t>Python trade duration</w:t>
-      </w:r>
-    </w:p>
-    <w:p/>
-    <w:p>
-      <w:pPr>
-        <w:rPr>
-          <w:lang w:val="en-US"/>
-        </w:rPr>
-      </w:pPr>
-    </w:p>
-    <w:p>
-      <w:pPr>
         <w:rPr>
           <w:lang w:val="en-US"/>
         </w:rPr>
@@ -5110,7 +5764,6 @@
         <w:rPr>
           <w:lang w:val="en-US"/>
         </w:rPr>
-        <w:lastRenderedPageBreak/>
         <w:t>EMA crossover no hysteresis with no stop loss, no take profits</w:t>
       </w:r>
     </w:p>
@@ -5754,6 +6407,7 @@
           <w:rFonts w:ascii="Arial" w:hAnsi="Arial" w:cs="Arial"/>
           <w:lang w:val="en-US"/>
         </w:rPr>
+        <w:lastRenderedPageBreak/>
         <w:t>Close</w:t>
       </w:r>
       <w:r>
@@ -6878,7 +7532,6 @@
         <w:rPr>
           <w:lang w:val="en-US"/>
         </w:rPr>
-        <w:lastRenderedPageBreak/>
         <w:t xml:space="preserve"> Misc</w:t>
       </w:r>
     </w:p>
@@ -7033,6 +7686,7 @@
           <w:noProof/>
           <w:lang w:val="en-US"/>
         </w:rPr>
+        <w:lastRenderedPageBreak/>
         <w:drawing>
           <wp:inline distT="0" distB="0" distL="0" distR="0" wp14:anchorId="497F1911" wp14:editId="49BC3845">
             <wp:extent cx="3493530" cy="2763981"/>
@@ -7269,7 +7923,6 @@
           <w:noProof/>
           <w:lang w:val="en-US"/>
         </w:rPr>
-        <w:lastRenderedPageBreak/>
         <w:drawing>
           <wp:inline distT="0" distB="0" distL="0" distR="0" wp14:anchorId="362495BB" wp14:editId="2A70901C">
             <wp:extent cx="3919910" cy="2251364"/>
@@ -7396,6 +8049,7 @@
           <w:noProof/>
           <w:lang w:val="en-US"/>
         </w:rPr>
+        <w:lastRenderedPageBreak/>
         <w:drawing>
           <wp:inline distT="0" distB="0" distL="0" distR="0" wp14:anchorId="76887AD0" wp14:editId="2733F0EE">
             <wp:extent cx="3710482" cy="2238375"/>
@@ -7636,83 +8290,83 @@
           <w:rFonts w:ascii="Arial" w:hAnsi="Arial" w:cs="Arial"/>
           <w:lang w:val="en-US"/>
         </w:rPr>
+        <w:t>Returns</w:t>
+      </w:r>
+    </w:p>
+    <w:p>
+      <w:pPr>
+        <w:pStyle w:val="Titre4"/>
+        <w:numPr>
+          <w:ilvl w:val="3"/>
+          <w:numId w:val="1"/>
+        </w:numPr>
+        <w:rPr>
+          <w:rFonts w:ascii="Arial" w:hAnsi="Arial" w:cs="Arial"/>
+          <w:lang w:val="en-US"/>
+        </w:rPr>
+      </w:pPr>
+      <w:r>
+        <w:rPr>
+          <w:rFonts w:ascii="Arial" w:hAnsi="Arial" w:cs="Arial"/>
+          <w:lang w:val="en-US"/>
+        </w:rPr>
+        <w:t>H1</w:t>
+      </w:r>
+    </w:p>
+    <w:p>
+      <w:pPr>
+        <w:pStyle w:val="Titre4"/>
+        <w:numPr>
+          <w:ilvl w:val="4"/>
+          <w:numId w:val="1"/>
+        </w:numPr>
+        <w:rPr>
+          <w:rFonts w:ascii="Arial" w:hAnsi="Arial" w:cs="Arial"/>
+          <w:lang w:val="en-US"/>
+        </w:rPr>
+      </w:pPr>
+      <w:r>
+        <w:rPr>
+          <w:rFonts w:ascii="Arial" w:hAnsi="Arial" w:cs="Arial"/>
+          <w:lang w:val="en-US"/>
+        </w:rPr>
+        <w:t>Mql5 returns</w:t>
+      </w:r>
+    </w:p>
+    <w:p>
+      <w:pPr>
+        <w:ind w:left="1440"/>
+        <w:rPr>
+          <w:rFonts w:ascii="Arial" w:hAnsi="Arial" w:cs="Arial"/>
+          <w:lang w:val="en-US"/>
+        </w:rPr>
+      </w:pPr>
+      <w:r>
+        <w:rPr>
+          <w:rFonts w:ascii="Arial" w:hAnsi="Arial" w:cs="Arial"/>
+          <w:lang w:val="en-US"/>
+        </w:rPr>
+        <w:t>Not available</w:t>
+      </w:r>
+    </w:p>
+    <w:p>
+      <w:pPr>
+        <w:pStyle w:val="Titre4"/>
+        <w:numPr>
+          <w:ilvl w:val="4"/>
+          <w:numId w:val="1"/>
+        </w:numPr>
+        <w:rPr>
+          <w:rFonts w:ascii="Arial" w:hAnsi="Arial" w:cs="Arial"/>
+          <w:lang w:val="en-US"/>
+        </w:rPr>
+      </w:pPr>
+      <w:r>
+        <w:rPr>
+          <w:rFonts w:ascii="Arial" w:hAnsi="Arial" w:cs="Arial"/>
+          <w:lang w:val="en-US"/>
+        </w:rPr>
         <w:lastRenderedPageBreak/>
-        <w:t>Returns</w:t>
-      </w:r>
-    </w:p>
-    <w:p>
-      <w:pPr>
-        <w:pStyle w:val="Titre4"/>
-        <w:numPr>
-          <w:ilvl w:val="3"/>
-          <w:numId w:val="1"/>
-        </w:numPr>
-        <w:rPr>
-          <w:rFonts w:ascii="Arial" w:hAnsi="Arial" w:cs="Arial"/>
-          <w:lang w:val="en-US"/>
-        </w:rPr>
-      </w:pPr>
-      <w:r>
-        <w:rPr>
-          <w:rFonts w:ascii="Arial" w:hAnsi="Arial" w:cs="Arial"/>
-          <w:lang w:val="en-US"/>
-        </w:rPr>
-        <w:t>H1</w:t>
-      </w:r>
-    </w:p>
-    <w:p>
-      <w:pPr>
-        <w:pStyle w:val="Titre4"/>
-        <w:numPr>
-          <w:ilvl w:val="4"/>
-          <w:numId w:val="1"/>
-        </w:numPr>
-        <w:rPr>
-          <w:rFonts w:ascii="Arial" w:hAnsi="Arial" w:cs="Arial"/>
-          <w:lang w:val="en-US"/>
-        </w:rPr>
-      </w:pPr>
-      <w:r>
-        <w:rPr>
-          <w:rFonts w:ascii="Arial" w:hAnsi="Arial" w:cs="Arial"/>
-          <w:lang w:val="en-US"/>
-        </w:rPr>
-        <w:t>Mql5 returns</w:t>
-      </w:r>
-    </w:p>
-    <w:p>
-      <w:pPr>
-        <w:ind w:left="1440"/>
-        <w:rPr>
-          <w:rFonts w:ascii="Arial" w:hAnsi="Arial" w:cs="Arial"/>
-          <w:lang w:val="en-US"/>
-        </w:rPr>
-      </w:pPr>
-      <w:r>
-        <w:rPr>
-          <w:rFonts w:ascii="Arial" w:hAnsi="Arial" w:cs="Arial"/>
-          <w:lang w:val="en-US"/>
-        </w:rPr>
-        <w:t>Not available</w:t>
-      </w:r>
-    </w:p>
-    <w:p>
-      <w:pPr>
-        <w:pStyle w:val="Titre4"/>
-        <w:numPr>
-          <w:ilvl w:val="4"/>
-          <w:numId w:val="1"/>
-        </w:numPr>
-        <w:rPr>
-          <w:rFonts w:ascii="Arial" w:hAnsi="Arial" w:cs="Arial"/>
-          <w:lang w:val="en-US"/>
-        </w:rPr>
-      </w:pPr>
-      <w:r>
-        <w:rPr>
-          <w:rFonts w:ascii="Arial" w:hAnsi="Arial" w:cs="Arial"/>
-          <w:lang w:val="en-US"/>
-        </w:rPr>
         <w:t>Python returns</w:t>
       </w:r>
     </w:p>
@@ -7884,7 +8538,6 @@
           <w:rFonts w:ascii="Arial" w:hAnsi="Arial" w:cs="Arial"/>
           <w:lang w:val="en-US"/>
         </w:rPr>
-        <w:lastRenderedPageBreak/>
         <w:t>Python correlations</w:t>
       </w:r>
     </w:p>
@@ -8034,6 +8687,7 @@
         <w:rPr>
           <w:lang w:val="en-US"/>
         </w:rPr>
+        <w:lastRenderedPageBreak/>
         <w:t>Python SL/TP Histogram</w:t>
       </w:r>
     </w:p>
@@ -8307,7 +8961,6 @@
           <w:rFonts w:ascii="Arial" w:hAnsi="Arial" w:cs="Arial"/>
           <w:lang w:val="en-US"/>
         </w:rPr>
-        <w:lastRenderedPageBreak/>
         <w:t>Hours/Period</w:t>
       </w:r>
     </w:p>
@@ -9684,7 +10337,6 @@
           <w:noProof/>
           <w:lang w:val="en-US"/>
         </w:rPr>
-        <w:lastRenderedPageBreak/>
         <w:drawing>
           <wp:inline distT="0" distB="0" distL="0" distR="0" wp14:anchorId="7E49818B" wp14:editId="2C49455D">
             <wp:extent cx="5731510" cy="1543050"/>
@@ -10031,6 +10683,7 @@
           <w:noProof/>
           <w:lang w:val="en-US"/>
         </w:rPr>
+        <w:lastRenderedPageBreak/>
         <w:drawing>
           <wp:inline distT="0" distB="0" distL="0" distR="0" wp14:anchorId="6779FA93" wp14:editId="545D2D9B">
             <wp:extent cx="4131310" cy="1921476"/>
@@ -21225,102 +21878,16 @@
     </w:lvl>
   </w:abstractNum>
   <w:abstractNum w:abstractNumId="7" w15:restartNumberingAfterBreak="0">
-    <w:nsid w:val="334D5A4E"/>
-    <w:multiLevelType w:val="multilevel"/>
-    <w:tmpl w:val="0409001F"/>
-    <w:lvl w:ilvl="0">
-      <w:start w:val="1"/>
-      <w:numFmt w:val="decimal"/>
-      <w:lvlText w:val="%1."/>
-      <w:lvlJc w:val="left"/>
-      <w:pPr>
-        <w:ind w:left="360" w:hanging="360"/>
-      </w:pPr>
-    </w:lvl>
-    <w:lvl w:ilvl="1">
-      <w:start w:val="1"/>
-      <w:numFmt w:val="decimal"/>
-      <w:lvlText w:val="%1.%2."/>
-      <w:lvlJc w:val="left"/>
-      <w:pPr>
-        <w:ind w:left="792" w:hanging="432"/>
-      </w:pPr>
-    </w:lvl>
-    <w:lvl w:ilvl="2">
-      <w:start w:val="1"/>
-      <w:numFmt w:val="decimal"/>
-      <w:lvlText w:val="%1.%2.%3."/>
-      <w:lvlJc w:val="left"/>
-      <w:pPr>
-        <w:ind w:left="504" w:hanging="504"/>
-      </w:pPr>
-    </w:lvl>
-    <w:lvl w:ilvl="3">
-      <w:start w:val="1"/>
-      <w:numFmt w:val="decimal"/>
-      <w:lvlText w:val="%1.%2.%3.%4."/>
-      <w:lvlJc w:val="left"/>
-      <w:pPr>
-        <w:ind w:left="1728" w:hanging="648"/>
-      </w:pPr>
-    </w:lvl>
-    <w:lvl w:ilvl="4">
-      <w:start w:val="1"/>
-      <w:numFmt w:val="decimal"/>
-      <w:lvlText w:val="%1.%2.%3.%4.%5."/>
-      <w:lvlJc w:val="left"/>
-      <w:pPr>
-        <w:ind w:left="2232" w:hanging="792"/>
-      </w:pPr>
-    </w:lvl>
-    <w:lvl w:ilvl="5">
-      <w:start w:val="1"/>
-      <w:numFmt w:val="decimal"/>
-      <w:lvlText w:val="%1.%2.%3.%4.%5.%6."/>
-      <w:lvlJc w:val="left"/>
-      <w:pPr>
-        <w:ind w:left="2736" w:hanging="936"/>
-      </w:pPr>
-    </w:lvl>
-    <w:lvl w:ilvl="6">
-      <w:start w:val="1"/>
-      <w:numFmt w:val="decimal"/>
-      <w:lvlText w:val="%1.%2.%3.%4.%5.%6.%7."/>
-      <w:lvlJc w:val="left"/>
-      <w:pPr>
-        <w:ind w:left="3240" w:hanging="1080"/>
-      </w:pPr>
-    </w:lvl>
-    <w:lvl w:ilvl="7">
-      <w:start w:val="1"/>
-      <w:numFmt w:val="decimal"/>
-      <w:lvlText w:val="%1.%2.%3.%4.%5.%6.%7.%8."/>
-      <w:lvlJc w:val="left"/>
-      <w:pPr>
-        <w:ind w:left="3744" w:hanging="1224"/>
-      </w:pPr>
-    </w:lvl>
-    <w:lvl w:ilvl="8">
-      <w:start w:val="1"/>
-      <w:numFmt w:val="decimal"/>
-      <w:lvlText w:val="%1.%2.%3.%4.%5.%6.%7.%8.%9."/>
-      <w:lvlJc w:val="left"/>
-      <w:pPr>
-        <w:ind w:left="4320" w:hanging="1440"/>
-      </w:pPr>
-    </w:lvl>
-  </w:abstractNum>
-  <w:abstractNum w:abstractNumId="8" w15:restartNumberingAfterBreak="0">
-    <w:nsid w:val="352A5B4E"/>
+    <w:nsid w:val="31AC5FAA"/>
     <w:multiLevelType w:val="hybridMultilevel"/>
-    <w:tmpl w:val="205E3692"/>
+    <w:tmpl w:val="74CE6612"/>
     <w:lvl w:ilvl="0" w:tplc="04090001">
       <w:start w:val="1"/>
       <w:numFmt w:val="bullet"/>
       <w:lvlText w:val=""/>
       <w:lvlJc w:val="left"/>
       <w:pPr>
-        <w:ind w:left="2160" w:hanging="360"/>
+        <w:ind w:left="720" w:hanging="360"/>
       </w:pPr>
       <w:rPr>
         <w:rFonts w:ascii="Symbol" w:hAnsi="Symbol" w:hint="default"/>
@@ -21332,7 +21899,7 @@
       <w:lvlText w:val="o"/>
       <w:lvlJc w:val="left"/>
       <w:pPr>
-        <w:ind w:left="2880" w:hanging="360"/>
+        <w:ind w:left="1440" w:hanging="360"/>
       </w:pPr>
       <w:rPr>
         <w:rFonts w:ascii="Courier New" w:hAnsi="Courier New" w:cs="Courier New" w:hint="default"/>
@@ -21344,7 +21911,7 @@
       <w:lvlText w:val=""/>
       <w:lvlJc w:val="left"/>
       <w:pPr>
-        <w:ind w:left="3600" w:hanging="360"/>
+        <w:ind w:left="2160" w:hanging="360"/>
       </w:pPr>
       <w:rPr>
         <w:rFonts w:ascii="Wingdings" w:hAnsi="Wingdings" w:hint="default"/>
@@ -21356,7 +21923,7 @@
       <w:lvlText w:val=""/>
       <w:lvlJc w:val="left"/>
       <w:pPr>
-        <w:ind w:left="4320" w:hanging="360"/>
+        <w:ind w:left="2880" w:hanging="360"/>
       </w:pPr>
       <w:rPr>
         <w:rFonts w:ascii="Symbol" w:hAnsi="Symbol" w:hint="default"/>
@@ -21368,7 +21935,7 @@
       <w:lvlText w:val="o"/>
       <w:lvlJc w:val="left"/>
       <w:pPr>
-        <w:ind w:left="5040" w:hanging="360"/>
+        <w:ind w:left="3600" w:hanging="360"/>
       </w:pPr>
       <w:rPr>
         <w:rFonts w:ascii="Courier New" w:hAnsi="Courier New" w:cs="Courier New" w:hint="default"/>
@@ -21380,7 +21947,7 @@
       <w:lvlText w:val=""/>
       <w:lvlJc w:val="left"/>
       <w:pPr>
-        <w:ind w:left="5760" w:hanging="360"/>
+        <w:ind w:left="4320" w:hanging="360"/>
       </w:pPr>
       <w:rPr>
         <w:rFonts w:ascii="Wingdings" w:hAnsi="Wingdings" w:hint="default"/>
@@ -21392,7 +21959,7 @@
       <w:lvlText w:val=""/>
       <w:lvlJc w:val="left"/>
       <w:pPr>
-        <w:ind w:left="6480" w:hanging="360"/>
+        <w:ind w:left="5040" w:hanging="360"/>
       </w:pPr>
       <w:rPr>
         <w:rFonts w:ascii="Symbol" w:hAnsi="Symbol" w:hint="default"/>
@@ -21404,7 +21971,7 @@
       <w:lvlText w:val="o"/>
       <w:lvlJc w:val="left"/>
       <w:pPr>
-        <w:ind w:left="7200" w:hanging="360"/>
+        <w:ind w:left="5760" w:hanging="360"/>
       </w:pPr>
       <w:rPr>
         <w:rFonts w:ascii="Courier New" w:hAnsi="Courier New" w:cs="Courier New" w:hint="default"/>
@@ -21416,14 +21983,213 @@
       <w:lvlText w:val=""/>
       <w:lvlJc w:val="left"/>
       <w:pPr>
-        <w:ind w:left="7920" w:hanging="360"/>
+        <w:ind w:left="6480" w:hanging="360"/>
       </w:pPr>
       <w:rPr>
         <w:rFonts w:ascii="Wingdings" w:hAnsi="Wingdings" w:hint="default"/>
       </w:rPr>
     </w:lvl>
   </w:abstractNum>
+  <w:abstractNum w:abstractNumId="8" w15:restartNumberingAfterBreak="0">
+    <w:nsid w:val="334D5A4E"/>
+    <w:multiLevelType w:val="multilevel"/>
+    <w:tmpl w:val="0409001F"/>
+    <w:lvl w:ilvl="0">
+      <w:start w:val="1"/>
+      <w:numFmt w:val="decimal"/>
+      <w:lvlText w:val="%1."/>
+      <w:lvlJc w:val="left"/>
+      <w:pPr>
+        <w:ind w:left="360" w:hanging="360"/>
+      </w:pPr>
+    </w:lvl>
+    <w:lvl w:ilvl="1">
+      <w:start w:val="1"/>
+      <w:numFmt w:val="decimal"/>
+      <w:lvlText w:val="%1.%2."/>
+      <w:lvlJc w:val="left"/>
+      <w:pPr>
+        <w:ind w:left="792" w:hanging="432"/>
+      </w:pPr>
+    </w:lvl>
+    <w:lvl w:ilvl="2">
+      <w:start w:val="1"/>
+      <w:numFmt w:val="decimal"/>
+      <w:lvlText w:val="%1.%2.%3."/>
+      <w:lvlJc w:val="left"/>
+      <w:pPr>
+        <w:ind w:left="504" w:hanging="504"/>
+      </w:pPr>
+    </w:lvl>
+    <w:lvl w:ilvl="3">
+      <w:start w:val="1"/>
+      <w:numFmt w:val="decimal"/>
+      <w:lvlText w:val="%1.%2.%3.%4."/>
+      <w:lvlJc w:val="left"/>
+      <w:pPr>
+        <w:ind w:left="1728" w:hanging="648"/>
+      </w:pPr>
+    </w:lvl>
+    <w:lvl w:ilvl="4">
+      <w:start w:val="1"/>
+      <w:numFmt w:val="decimal"/>
+      <w:lvlText w:val="%1.%2.%3.%4.%5."/>
+      <w:lvlJc w:val="left"/>
+      <w:pPr>
+        <w:ind w:left="2232" w:hanging="792"/>
+      </w:pPr>
+    </w:lvl>
+    <w:lvl w:ilvl="5">
+      <w:start w:val="1"/>
+      <w:numFmt w:val="decimal"/>
+      <w:lvlText w:val="%1.%2.%3.%4.%5.%6."/>
+      <w:lvlJc w:val="left"/>
+      <w:pPr>
+        <w:ind w:left="2736" w:hanging="936"/>
+      </w:pPr>
+    </w:lvl>
+    <w:lvl w:ilvl="6">
+      <w:start w:val="1"/>
+      <w:numFmt w:val="decimal"/>
+      <w:lvlText w:val="%1.%2.%3.%4.%5.%6.%7."/>
+      <w:lvlJc w:val="left"/>
+      <w:pPr>
+        <w:ind w:left="3240" w:hanging="1080"/>
+      </w:pPr>
+    </w:lvl>
+    <w:lvl w:ilvl="7">
+      <w:start w:val="1"/>
+      <w:numFmt w:val="decimal"/>
+      <w:lvlText w:val="%1.%2.%3.%4.%5.%6.%7.%8."/>
+      <w:lvlJc w:val="left"/>
+      <w:pPr>
+        <w:ind w:left="3744" w:hanging="1224"/>
+      </w:pPr>
+    </w:lvl>
+    <w:lvl w:ilvl="8">
+      <w:start w:val="1"/>
+      <w:numFmt w:val="decimal"/>
+      <w:lvlText w:val="%1.%2.%3.%4.%5.%6.%7.%8.%9."/>
+      <w:lvlJc w:val="left"/>
+      <w:pPr>
+        <w:ind w:left="4320" w:hanging="1440"/>
+      </w:pPr>
+    </w:lvl>
+  </w:abstractNum>
   <w:abstractNum w:abstractNumId="9" w15:restartNumberingAfterBreak="0">
+    <w:nsid w:val="352A5B4E"/>
+    <w:multiLevelType w:val="hybridMultilevel"/>
+    <w:tmpl w:val="205E3692"/>
+    <w:lvl w:ilvl="0" w:tplc="04090001">
+      <w:start w:val="1"/>
+      <w:numFmt w:val="bullet"/>
+      <w:lvlText w:val=""/>
+      <w:lvlJc w:val="left"/>
+      <w:pPr>
+        <w:ind w:left="2160" w:hanging="360"/>
+      </w:pPr>
+      <w:rPr>
+        <w:rFonts w:ascii="Symbol" w:hAnsi="Symbol" w:hint="default"/>
+      </w:rPr>
+    </w:lvl>
+    <w:lvl w:ilvl="1" w:tplc="04090003" w:tentative="1">
+      <w:start w:val="1"/>
+      <w:numFmt w:val="bullet"/>
+      <w:lvlText w:val="o"/>
+      <w:lvlJc w:val="left"/>
+      <w:pPr>
+        <w:ind w:left="2880" w:hanging="360"/>
+      </w:pPr>
+      <w:rPr>
+        <w:rFonts w:ascii="Courier New" w:hAnsi="Courier New" w:cs="Courier New" w:hint="default"/>
+      </w:rPr>
+    </w:lvl>
+    <w:lvl w:ilvl="2" w:tplc="04090005" w:tentative="1">
+      <w:start w:val="1"/>
+      <w:numFmt w:val="bullet"/>
+      <w:lvlText w:val=""/>
+      <w:lvlJc w:val="left"/>
+      <w:pPr>
+        <w:ind w:left="3600" w:hanging="360"/>
+      </w:pPr>
+      <w:rPr>
+        <w:rFonts w:ascii="Wingdings" w:hAnsi="Wingdings" w:hint="default"/>
+      </w:rPr>
+    </w:lvl>
+    <w:lvl w:ilvl="3" w:tplc="04090001" w:tentative="1">
+      <w:start w:val="1"/>
+      <w:numFmt w:val="bullet"/>
+      <w:lvlText w:val=""/>
+      <w:lvlJc w:val="left"/>
+      <w:pPr>
+        <w:ind w:left="4320" w:hanging="360"/>
+      </w:pPr>
+      <w:rPr>
+        <w:rFonts w:ascii="Symbol" w:hAnsi="Symbol" w:hint="default"/>
+      </w:rPr>
+    </w:lvl>
+    <w:lvl w:ilvl="4" w:tplc="04090003" w:tentative="1">
+      <w:start w:val="1"/>
+      <w:numFmt w:val="bullet"/>
+      <w:lvlText w:val="o"/>
+      <w:lvlJc w:val="left"/>
+      <w:pPr>
+        <w:ind w:left="5040" w:hanging="360"/>
+      </w:pPr>
+      <w:rPr>
+        <w:rFonts w:ascii="Courier New" w:hAnsi="Courier New" w:cs="Courier New" w:hint="default"/>
+      </w:rPr>
+    </w:lvl>
+    <w:lvl w:ilvl="5" w:tplc="04090005" w:tentative="1">
+      <w:start w:val="1"/>
+      <w:numFmt w:val="bullet"/>
+      <w:lvlText w:val=""/>
+      <w:lvlJc w:val="left"/>
+      <w:pPr>
+        <w:ind w:left="5760" w:hanging="360"/>
+      </w:pPr>
+      <w:rPr>
+        <w:rFonts w:ascii="Wingdings" w:hAnsi="Wingdings" w:hint="default"/>
+      </w:rPr>
+    </w:lvl>
+    <w:lvl w:ilvl="6" w:tplc="04090001" w:tentative="1">
+      <w:start w:val="1"/>
+      <w:numFmt w:val="bullet"/>
+      <w:lvlText w:val=""/>
+      <w:lvlJc w:val="left"/>
+      <w:pPr>
+        <w:ind w:left="6480" w:hanging="360"/>
+      </w:pPr>
+      <w:rPr>
+        <w:rFonts w:ascii="Symbol" w:hAnsi="Symbol" w:hint="default"/>
+      </w:rPr>
+    </w:lvl>
+    <w:lvl w:ilvl="7" w:tplc="04090003" w:tentative="1">
+      <w:start w:val="1"/>
+      <w:numFmt w:val="bullet"/>
+      <w:lvlText w:val="o"/>
+      <w:lvlJc w:val="left"/>
+      <w:pPr>
+        <w:ind w:left="7200" w:hanging="360"/>
+      </w:pPr>
+      <w:rPr>
+        <w:rFonts w:ascii="Courier New" w:hAnsi="Courier New" w:cs="Courier New" w:hint="default"/>
+      </w:rPr>
+    </w:lvl>
+    <w:lvl w:ilvl="8" w:tplc="04090005" w:tentative="1">
+      <w:start w:val="1"/>
+      <w:numFmt w:val="bullet"/>
+      <w:lvlText w:val=""/>
+      <w:lvlJc w:val="left"/>
+      <w:pPr>
+        <w:ind w:left="7920" w:hanging="360"/>
+      </w:pPr>
+      <w:rPr>
+        <w:rFonts w:ascii="Wingdings" w:hAnsi="Wingdings" w:hint="default"/>
+      </w:rPr>
+    </w:lvl>
+  </w:abstractNum>
+  <w:abstractNum w:abstractNumId="10" w15:restartNumberingAfterBreak="0">
     <w:nsid w:val="3B85171D"/>
     <w:multiLevelType w:val="multilevel"/>
     <w:tmpl w:val="76C277AA"/>
@@ -21512,7 +22278,7 @@
       </w:pPr>
     </w:lvl>
   </w:abstractNum>
-  <w:abstractNum w:abstractNumId="10" w15:restartNumberingAfterBreak="0">
+  <w:abstractNum w:abstractNumId="11" w15:restartNumberingAfterBreak="0">
     <w:nsid w:val="441C1B65"/>
     <w:multiLevelType w:val="multilevel"/>
     <w:tmpl w:val="0409001F"/>
@@ -21598,7 +22364,7 @@
       </w:pPr>
     </w:lvl>
   </w:abstractNum>
-  <w:abstractNum w:abstractNumId="11" w15:restartNumberingAfterBreak="0">
+  <w:abstractNum w:abstractNumId="12" w15:restartNumberingAfterBreak="0">
     <w:nsid w:val="5F145C64"/>
     <w:multiLevelType w:val="hybridMultilevel"/>
     <w:tmpl w:val="46A4604A"/>
@@ -21711,7 +22477,7 @@
       </w:rPr>
     </w:lvl>
   </w:abstractNum>
-  <w:abstractNum w:abstractNumId="12" w15:restartNumberingAfterBreak="0">
+  <w:abstractNum w:abstractNumId="13" w15:restartNumberingAfterBreak="0">
     <w:nsid w:val="6C973C59"/>
     <w:multiLevelType w:val="hybridMultilevel"/>
     <w:tmpl w:val="B05C5888"/>
@@ -21824,7 +22590,7 @@
       </w:rPr>
     </w:lvl>
   </w:abstractNum>
-  <w:abstractNum w:abstractNumId="13" w15:restartNumberingAfterBreak="0">
+  <w:abstractNum w:abstractNumId="14" w15:restartNumberingAfterBreak="0">
     <w:nsid w:val="73170FAB"/>
     <w:multiLevelType w:val="hybridMultilevel"/>
     <w:tmpl w:val="8C74E3EE"/>
@@ -21937,7 +22703,7 @@
       </w:rPr>
     </w:lvl>
   </w:abstractNum>
-  <w:abstractNum w:abstractNumId="14" w15:restartNumberingAfterBreak="0">
+  <w:abstractNum w:abstractNumId="15" w15:restartNumberingAfterBreak="0">
     <w:nsid w:val="75A76386"/>
     <w:multiLevelType w:val="hybridMultilevel"/>
     <w:tmpl w:val="B824E27C"/>
@@ -22050,7 +22816,7 @@
       </w:rPr>
     </w:lvl>
   </w:abstractNum>
-  <w:abstractNum w:abstractNumId="15" w15:restartNumberingAfterBreak="0">
+  <w:abstractNum w:abstractNumId="16" w15:restartNumberingAfterBreak="0">
     <w:nsid w:val="7A77077D"/>
     <w:multiLevelType w:val="hybridMultilevel"/>
     <w:tmpl w:val="04BA9700"/>
@@ -22164,22 +22930,22 @@
     </w:lvl>
   </w:abstractNum>
   <w:num w:numId="1">
-    <w:abstractNumId w:val="7"/>
+    <w:abstractNumId w:val="8"/>
   </w:num>
   <w:num w:numId="2">
     <w:abstractNumId w:val="3"/>
   </w:num>
   <w:num w:numId="3">
+    <w:abstractNumId w:val="10"/>
+  </w:num>
+  <w:num w:numId="4">
     <w:abstractNumId w:val="9"/>
   </w:num>
-  <w:num w:numId="4">
-    <w:abstractNumId w:val="8"/>
-  </w:num>
   <w:num w:numId="5">
-    <w:abstractNumId w:val="13"/>
+    <w:abstractNumId w:val="14"/>
   </w:num>
   <w:num w:numId="6">
-    <w:abstractNumId w:val="12"/>
+    <w:abstractNumId w:val="13"/>
   </w:num>
   <w:num w:numId="7">
     <w:abstractNumId w:val="5"/>
@@ -22188,19 +22954,19 @@
     <w:abstractNumId w:val="0"/>
   </w:num>
   <w:num w:numId="9">
-    <w:abstractNumId w:val="11"/>
+    <w:abstractNumId w:val="12"/>
   </w:num>
   <w:num w:numId="10">
-    <w:abstractNumId w:val="10"/>
+    <w:abstractNumId w:val="11"/>
   </w:num>
   <w:num w:numId="11">
     <w:abstractNumId w:val="1"/>
   </w:num>
   <w:num w:numId="12">
-    <w:abstractNumId w:val="14"/>
+    <w:abstractNumId w:val="15"/>
   </w:num>
   <w:num w:numId="13">
-    <w:abstractNumId w:val="15"/>
+    <w:abstractNumId w:val="16"/>
   </w:num>
   <w:num w:numId="14">
     <w:abstractNumId w:val="6"/>
@@ -22210,6 +22976,9 @@
   </w:num>
   <w:num w:numId="16">
     <w:abstractNumId w:val="2"/>
+  </w:num>
+  <w:num w:numId="17">
+    <w:abstractNumId w:val="7"/>
   </w:num>
   <w:numIdMacAtCleanup w:val="5"/>
 </w:numbering>
@@ -23746,7 +24515,7 @@
 </file>
 
 <file path=customXml/itemProps1.xml><?xml version="1.0" encoding="utf-8"?>
-<ds:datastoreItem xmlns:ds="http://schemas.openxmlformats.org/officeDocument/2006/customXml" ds:itemID="{CDF17206-4FD5-4B01-9C8B-E3AD37C0EE62}">
+<ds:datastoreItem xmlns:ds="http://schemas.openxmlformats.org/officeDocument/2006/customXml" ds:itemID="{CA8FB58A-BF60-4D4D-AF0E-D63C1E551611}">
   <ds:schemaRefs>
     <ds:schemaRef ds:uri="http://schemas.openxmlformats.org/officeDocument/2006/bibliography"/>
   </ds:schemaRefs>

</xml_diff>